<commit_message>
kijelentkezés gomb + egy kis dokumentáció módosítás
</commit_message>
<xml_diff>
--- a/doc/felhasznaloi_dokumentacio.docx
+++ b/doc/felhasznaloi_dokumentacio.docx
@@ -58,7 +58,440 @@
           <w:sz w:val="32"/>
           <w:szCs w:val="32"/>
         </w:rPr>
-        <w:t>C#</w:t>
+        <w:t>Asztali és mobil alkalmazás fejélesztése</w:t>
+      </w:r>
+    </w:p>
+    <w:p>
+      <w:pPr>
+        <w:rPr>
+          <w:rFonts w:ascii="Times New Roman" w:hAnsi="Times New Roman" w:cs="Times New Roman"/>
+          <w:b/>
+          <w:bCs/>
+          <w:sz w:val="32"/>
+          <w:szCs w:val="32"/>
+        </w:rPr>
+      </w:pPr>
+      <w:r>
+        <w:rPr>
+          <w:rFonts w:ascii="Times New Roman" w:hAnsi="Times New Roman" w:cs="Times New Roman"/>
+          <w:b/>
+          <w:bCs/>
+          <w:sz w:val="32"/>
+          <w:szCs w:val="32"/>
+        </w:rPr>
+        <w:t>Projekt telepítése és elindítása</w:t>
+      </w:r>
+    </w:p>
+    <w:p>
+      <w:pPr>
+        <w:rPr>
+          <w:rFonts w:ascii="Times New Roman" w:hAnsi="Times New Roman" w:cs="Times New Roman"/>
+          <w:i/>
+          <w:sz w:val="28"/>
+          <w:szCs w:val="28"/>
+        </w:rPr>
+      </w:pPr>
+      <w:r>
+        <w:rPr>
+          <w:rFonts w:ascii="Times New Roman" w:hAnsi="Times New Roman" w:cs="Times New Roman"/>
+          <w:i/>
+          <w:sz w:val="28"/>
+          <w:szCs w:val="28"/>
+        </w:rPr>
+        <w:t>Adatbázis:</w:t>
+      </w:r>
+    </w:p>
+    <w:p>
+      <w:pPr>
+        <w:rPr>
+          <w:rFonts w:ascii="Times New Roman" w:hAnsi="Times New Roman" w:cs="Times New Roman"/>
+          <w:sz w:val="28"/>
+          <w:szCs w:val="28"/>
+        </w:rPr>
+      </w:pPr>
+      <w:r>
+        <w:rPr>
+          <w:rFonts w:ascii="Times New Roman" w:hAnsi="Times New Roman" w:cs="Times New Roman"/>
+          <w:sz w:val="28"/>
+          <w:szCs w:val="28"/>
+        </w:rPr>
+        <w:tab/>
+        <w:t>Indítsa el a xampp programot, benne az apache és a MySQL szervert</w:t>
+      </w:r>
+    </w:p>
+    <w:p>
+      <w:pPr>
+        <w:rPr>
+          <w:rFonts w:ascii="Times New Roman" w:hAnsi="Times New Roman" w:cs="Times New Roman"/>
+          <w:sz w:val="28"/>
+          <w:szCs w:val="28"/>
+        </w:rPr>
+      </w:pPr>
+      <w:r>
+        <w:rPr>
+          <w:rFonts w:ascii="Times New Roman" w:hAnsi="Times New Roman" w:cs="Times New Roman"/>
+          <w:sz w:val="28"/>
+          <w:szCs w:val="28"/>
+        </w:rPr>
+        <w:tab/>
+      </w:r>
+      <w:r>
+        <w:rPr>
+          <w:rFonts w:ascii="Times New Roman" w:hAnsi="Times New Roman" w:cs="Times New Roman"/>
+          <w:sz w:val="28"/>
+          <w:szCs w:val="28"/>
+        </w:rPr>
+        <w:t>Adatbázis neve: cosmoscreen</w:t>
+      </w:r>
+      <w:r>
+        <w:rPr>
+          <w:rFonts w:ascii="Times New Roman" w:hAnsi="Times New Roman" w:cs="Times New Roman"/>
+          <w:sz w:val="28"/>
+          <w:szCs w:val="28"/>
+        </w:rPr>
+        <w:t>, kódolás: utf8_general_ci</w:t>
+      </w:r>
+    </w:p>
+    <w:p>
+      <w:pPr>
+        <w:rPr>
+          <w:rFonts w:ascii="Times New Roman" w:hAnsi="Times New Roman" w:cs="Times New Roman"/>
+          <w:sz w:val="28"/>
+          <w:szCs w:val="28"/>
+        </w:rPr>
+      </w:pPr>
+      <w:r>
+        <w:rPr>
+          <w:rFonts w:ascii="Times New Roman" w:hAnsi="Times New Roman" w:cs="Times New Roman"/>
+          <w:sz w:val="28"/>
+          <w:szCs w:val="28"/>
+        </w:rPr>
+        <w:tab/>
+        <w:t>Importálja a cosmoscreen.sql fájlt</w:t>
+      </w:r>
+    </w:p>
+    <w:p>
+      <w:pPr>
+        <w:rPr>
+          <w:rFonts w:ascii="Times New Roman" w:hAnsi="Times New Roman" w:cs="Times New Roman"/>
+          <w:i/>
+          <w:sz w:val="28"/>
+          <w:szCs w:val="28"/>
+        </w:rPr>
+      </w:pPr>
+      <w:r>
+        <w:rPr>
+          <w:rFonts w:ascii="Times New Roman" w:hAnsi="Times New Roman" w:cs="Times New Roman"/>
+          <w:i/>
+          <w:sz w:val="28"/>
+          <w:szCs w:val="28"/>
+        </w:rPr>
+        <w:t>Installer:</w:t>
+      </w:r>
+    </w:p>
+    <w:p>
+      <w:pPr>
+        <w:numPr>
+          <w:ilvl w:val="0"/>
+          <w:numId w:val="1"/>
+        </w:numPr>
+        <w:rPr>
+          <w:rFonts w:ascii="Times New Roman" w:hAnsi="Times New Roman" w:cs="Times New Roman"/>
+          <w:sz w:val="28"/>
+          <w:szCs w:val="28"/>
+        </w:rPr>
+      </w:pPr>
+      <w:r>
+        <w:rPr>
+          <w:rFonts w:ascii="Times New Roman" w:hAnsi="Times New Roman" w:cs="Times New Roman"/>
+          <w:sz w:val="28"/>
+          <w:szCs w:val="28"/>
+        </w:rPr>
+        <w:t>csomagolja ki a zip-et</w:t>
+      </w:r>
+    </w:p>
+    <w:p>
+      <w:pPr>
+        <w:numPr>
+          <w:ilvl w:val="0"/>
+          <w:numId w:val="1"/>
+        </w:numPr>
+        <w:rPr>
+          <w:rFonts w:ascii="Times New Roman" w:hAnsi="Times New Roman" w:cs="Times New Roman"/>
+          <w:sz w:val="28"/>
+          <w:szCs w:val="28"/>
+        </w:rPr>
+      </w:pPr>
+      <w:r>
+        <w:rPr>
+          <w:rFonts w:ascii="Times New Roman" w:hAnsi="Times New Roman" w:cs="Times New Roman"/>
+          <w:sz w:val="28"/>
+          <w:szCs w:val="28"/>
+        </w:rPr>
+        <w:t>nyissa meg a kicsomagolt mappát (cosmoscreen)</w:t>
+      </w:r>
+    </w:p>
+    <w:p>
+      <w:pPr>
+        <w:numPr>
+          <w:ilvl w:val="0"/>
+          <w:numId w:val="1"/>
+        </w:numPr>
+        <w:rPr>
+          <w:rFonts w:ascii="Times New Roman" w:hAnsi="Times New Roman" w:cs="Times New Roman"/>
+          <w:sz w:val="28"/>
+          <w:szCs w:val="28"/>
+        </w:rPr>
+      </w:pPr>
+      <w:r>
+        <w:rPr>
+          <w:rFonts w:ascii="Times New Roman" w:hAnsi="Times New Roman" w:cs="Times New Roman"/>
+          <w:sz w:val="28"/>
+          <w:szCs w:val="28"/>
+        </w:rPr>
+        <w:t>nyissa meg a C# mappát</w:t>
+      </w:r>
+    </w:p>
+    <w:p>
+      <w:pPr>
+        <w:numPr>
+          <w:ilvl w:val="0"/>
+          <w:numId w:val="1"/>
+        </w:numPr>
+        <w:rPr>
+          <w:rFonts w:ascii="Times New Roman" w:hAnsi="Times New Roman" w:cs="Times New Roman"/>
+          <w:sz w:val="28"/>
+          <w:szCs w:val="28"/>
+        </w:rPr>
+      </w:pPr>
+      <w:r>
+        <w:rPr>
+          <w:rFonts w:ascii="Times New Roman" w:hAnsi="Times New Roman" w:cs="Times New Roman"/>
+          <w:sz w:val="28"/>
+          <w:szCs w:val="28"/>
+        </w:rPr>
+        <w:t>nyissa meg a cosmoscreenSetup mappát</w:t>
+      </w:r>
+    </w:p>
+    <w:p>
+      <w:pPr>
+        <w:numPr>
+          <w:ilvl w:val="0"/>
+          <w:numId w:val="1"/>
+        </w:numPr>
+        <w:rPr>
+          <w:rFonts w:ascii="Times New Roman" w:hAnsi="Times New Roman" w:cs="Times New Roman"/>
+          <w:sz w:val="28"/>
+          <w:szCs w:val="28"/>
+        </w:rPr>
+      </w:pPr>
+      <w:r>
+        <w:rPr>
+          <w:rFonts w:ascii="Times New Roman" w:hAnsi="Times New Roman" w:cs="Times New Roman"/>
+          <w:sz w:val="28"/>
+          <w:szCs w:val="28"/>
+        </w:rPr>
+        <w:t>azon belül nyissa meg a debug mappát</w:t>
+      </w:r>
+    </w:p>
+    <w:p>
+      <w:pPr>
+        <w:numPr>
+          <w:ilvl w:val="0"/>
+          <w:numId w:val="1"/>
+        </w:numPr>
+        <w:rPr>
+          <w:rFonts w:ascii="Times New Roman" w:hAnsi="Times New Roman" w:cs="Times New Roman"/>
+          <w:sz w:val="28"/>
+          <w:szCs w:val="28"/>
+        </w:rPr>
+      </w:pPr>
+      <w:r>
+        <w:rPr>
+          <w:rFonts w:ascii="Times New Roman" w:hAnsi="Times New Roman" w:cs="Times New Roman"/>
+          <w:sz w:val="28"/>
+          <w:szCs w:val="28"/>
+        </w:rPr>
+        <w:t xml:space="preserve">ott </w:t>
+      </w:r>
+      <w:r>
+        <w:rPr>
+          <w:rFonts w:ascii="Times New Roman" w:hAnsi="Times New Roman" w:cs="Times New Roman"/>
+          <w:sz w:val="28"/>
+          <w:szCs w:val="28"/>
+        </w:rPr>
+        <w:t>futtassa</w:t>
+      </w:r>
+      <w:r>
+        <w:rPr>
+          <w:rFonts w:ascii="Times New Roman" w:hAnsi="Times New Roman" w:cs="Times New Roman"/>
+          <w:sz w:val="28"/>
+          <w:szCs w:val="28"/>
+        </w:rPr>
+        <w:t xml:space="preserve"> </w:t>
+      </w:r>
+      <w:r>
+        <w:rPr>
+          <w:rFonts w:ascii="Times New Roman" w:hAnsi="Times New Roman" w:cs="Times New Roman"/>
+          <w:sz w:val="28"/>
+          <w:szCs w:val="28"/>
+        </w:rPr>
+        <w:t xml:space="preserve">le a setup.exe </w:t>
+      </w:r>
+      <w:r>
+        <w:rPr>
+          <w:rFonts w:ascii="Times New Roman" w:hAnsi="Times New Roman" w:cs="Times New Roman"/>
+          <w:sz w:val="28"/>
+          <w:szCs w:val="28"/>
+        </w:rPr>
+        <w:t>fájlt</w:t>
+      </w:r>
+      <w:r>
+        <w:rPr>
+          <w:rFonts w:ascii="Times New Roman" w:hAnsi="Times New Roman" w:cs="Times New Roman"/>
+          <w:sz w:val="28"/>
+          <w:szCs w:val="28"/>
+        </w:rPr>
+        <w:t>.</w:t>
+      </w:r>
+      <w:bookmarkStart w:id="0" w:name="_GoBack"/>
+      <w:bookmarkEnd w:id="0"/>
+    </w:p>
+    <w:p>
+      <w:pPr>
+        <w:numPr>
+          <w:ilvl w:val="0"/>
+          <w:numId w:val="1"/>
+        </w:numPr>
+        <w:rPr>
+          <w:rFonts w:ascii="Times New Roman" w:hAnsi="Times New Roman" w:cs="Times New Roman"/>
+          <w:sz w:val="28"/>
+          <w:szCs w:val="28"/>
+        </w:rPr>
+      </w:pPr>
+      <w:r>
+        <w:rPr>
+          <w:rFonts w:ascii="Times New Roman" w:hAnsi="Times New Roman" w:cs="Times New Roman"/>
+          <w:sz w:val="28"/>
+          <w:szCs w:val="28"/>
+        </w:rPr>
+        <w:t>minden ablaknál nyomja meg a "next" gombot</w:t>
+      </w:r>
+    </w:p>
+    <w:p>
+      <w:pPr>
+        <w:numPr>
+          <w:ilvl w:val="0"/>
+          <w:numId w:val="1"/>
+        </w:numPr>
+        <w:rPr>
+          <w:rFonts w:ascii="Times New Roman" w:hAnsi="Times New Roman" w:cs="Times New Roman"/>
+          <w:sz w:val="28"/>
+          <w:szCs w:val="28"/>
+        </w:rPr>
+      </w:pPr>
+      <w:r>
+        <w:rPr>
+          <w:rFonts w:ascii="Times New Roman" w:hAnsi="Times New Roman" w:cs="Times New Roman"/>
+          <w:sz w:val="28"/>
+          <w:szCs w:val="28"/>
+        </w:rPr>
+        <w:t>A végső ablaknál meg a close gombot</w:t>
+      </w:r>
+    </w:p>
+    <w:p>
+      <w:pPr>
+        <w:rPr>
+          <w:rFonts w:ascii="Times New Roman" w:hAnsi="Times New Roman" w:cs="Times New Roman"/>
+          <w:i/>
+          <w:sz w:val="28"/>
+          <w:szCs w:val="28"/>
+        </w:rPr>
+      </w:pPr>
+      <w:r>
+        <w:rPr>
+          <w:rFonts w:ascii="Times New Roman" w:hAnsi="Times New Roman" w:cs="Times New Roman"/>
+          <w:i/>
+          <w:sz w:val="28"/>
+          <w:szCs w:val="28"/>
+        </w:rPr>
+        <w:t>Elindítása</w:t>
+      </w:r>
+      <w:r>
+        <w:rPr>
+          <w:rFonts w:ascii="Times New Roman" w:hAnsi="Times New Roman" w:cs="Times New Roman"/>
+          <w:i/>
+          <w:sz w:val="28"/>
+          <w:szCs w:val="28"/>
+        </w:rPr>
+        <w:t>:</w:t>
+      </w:r>
+    </w:p>
+    <w:p>
+      <w:pPr>
+        <w:numPr>
+          <w:ilvl w:val="0"/>
+          <w:numId w:val="2"/>
+        </w:numPr>
+        <w:rPr>
+          <w:rFonts w:ascii="Times New Roman" w:hAnsi="Times New Roman" w:cs="Times New Roman"/>
+          <w:sz w:val="28"/>
+          <w:szCs w:val="28"/>
+        </w:rPr>
+      </w:pPr>
+      <w:r>
+        <w:rPr>
+          <w:rFonts w:ascii="Times New Roman" w:hAnsi="Times New Roman" w:cs="Times New Roman"/>
+          <w:sz w:val="28"/>
+          <w:szCs w:val="28"/>
+        </w:rPr>
+        <w:t>Az asztalon keresse meg a cosmoscreen.exe file-t</w:t>
+      </w:r>
+    </w:p>
+    <w:p>
+      <w:pPr>
+        <w:numPr>
+          <w:ilvl w:val="0"/>
+          <w:numId w:val="2"/>
+        </w:numPr>
+        <w:rPr>
+          <w:rFonts w:ascii="Times New Roman" w:hAnsi="Times New Roman" w:cs="Times New Roman"/>
+          <w:sz w:val="28"/>
+          <w:szCs w:val="28"/>
+        </w:rPr>
+      </w:pPr>
+      <w:r>
+        <w:rPr>
+          <w:rFonts w:ascii="Times New Roman" w:hAnsi="Times New Roman" w:cs="Times New Roman"/>
+          <w:sz w:val="28"/>
+          <w:szCs w:val="28"/>
+        </w:rPr>
+        <w:t>D</w:t>
+      </w:r>
+      <w:r>
+        <w:rPr>
+          <w:rFonts w:ascii="Times New Roman" w:hAnsi="Times New Roman" w:cs="Times New Roman"/>
+          <w:sz w:val="28"/>
+          <w:szCs w:val="28"/>
+        </w:rPr>
+        <w:t>upla kattintással indítsa el!</w:t>
+      </w:r>
+    </w:p>
+    <w:p>
+      <w:pPr>
+        <w:rPr>
+          <w:rFonts w:ascii="Times New Roman" w:hAnsi="Times New Roman" w:cs="Times New Roman"/>
+          <w:sz w:val="32"/>
+          <w:szCs w:val="32"/>
+        </w:rPr>
+      </w:pPr>
+      <w:r>
+        <w:rPr>
+          <w:rFonts w:ascii="Times New Roman" w:hAnsi="Times New Roman" w:cs="Times New Roman"/>
+          <w:sz w:val="32"/>
+          <w:szCs w:val="32"/>
+        </w:rPr>
+        <w:br w:type="page"/>
       </w:r>
     </w:p>
     <w:p>
@@ -79,6 +512,7 @@
           <w:szCs w:val="40"/>
           <w:u w:val="single"/>
         </w:rPr>
+        <w:lastRenderedPageBreak/>
         <w:t>Bejelentkezés</w:t>
       </w:r>
     </w:p>
@@ -146,7 +580,7 @@
                     </pic:cNvPicPr>
                   </pic:nvPicPr>
                   <pic:blipFill>
-                    <a:blip r:embed="rId4">
+                    <a:blip r:embed="rId5">
                       <a:extLst>
                         <a:ext uri="{28A0092B-C50C-407E-A947-70E740481C1C}">
                           <a14:useLocalDpi xmlns:a14="http://schemas.microsoft.com/office/drawing/2010/main" val="0"/>
@@ -216,7 +650,7 @@
                     </pic:cNvPicPr>
                   </pic:nvPicPr>
                   <pic:blipFill>
-                    <a:blip r:embed="rId5">
+                    <a:blip r:embed="rId6">
                       <a:extLst>
                         <a:ext uri="{28A0092B-C50C-407E-A947-70E740481C1C}">
                           <a14:useLocalDpi xmlns:a14="http://schemas.microsoft.com/office/drawing/2010/main" val="0"/>
@@ -281,7 +715,6 @@
           <w:sz w:val="32"/>
           <w:szCs w:val="32"/>
         </w:rPr>
-        <w:lastRenderedPageBreak/>
         <w:drawing>
           <wp:anchor distT="0" distB="0" distL="114300" distR="114300" simplePos="0" relativeHeight="251660288" behindDoc="0" locked="0" layoutInCell="1" allowOverlap="1" wp14:anchorId="6E70B517" wp14:editId="04812A38">
             <wp:simplePos x="0" y="0"/>
@@ -306,7 +739,7 @@
                     <pic:cNvPicPr/>
                   </pic:nvPicPr>
                   <pic:blipFill>
-                    <a:blip r:embed="rId6">
+                    <a:blip r:embed="rId7">
                       <a:extLst>
                         <a:ext uri="{28A0092B-C50C-407E-A947-70E740481C1C}">
                           <a14:useLocalDpi xmlns:a14="http://schemas.microsoft.com/office/drawing/2010/main" val="0"/>
@@ -350,12 +783,9 @@
         </w:rPr>
         <w:t>.</w:t>
       </w:r>
-      <w:bookmarkStart w:id="0" w:name="_GoBack"/>
-      <w:bookmarkEnd w:id="0"/>
-    </w:p>
-    <w:p>
-      <w:pPr>
-        <w:jc w:val="center"/>
+    </w:p>
+    <w:p>
+      <w:pPr>
         <w:rPr>
           <w:rFonts w:ascii="Times New Roman" w:hAnsi="Times New Roman" w:cs="Times New Roman"/>
           <w:noProof/>
@@ -372,6 +802,29 @@
           <w:szCs w:val="40"/>
           <w:u w:val="single"/>
         </w:rPr>
+        <w:br w:type="page"/>
+      </w:r>
+    </w:p>
+    <w:p>
+      <w:pPr>
+        <w:jc w:val="center"/>
+        <w:rPr>
+          <w:rFonts w:ascii="Times New Roman" w:hAnsi="Times New Roman" w:cs="Times New Roman"/>
+          <w:noProof/>
+          <w:sz w:val="40"/>
+          <w:szCs w:val="40"/>
+          <w:u w:val="single"/>
+        </w:rPr>
+      </w:pPr>
+      <w:r>
+        <w:rPr>
+          <w:rFonts w:ascii="Times New Roman" w:hAnsi="Times New Roman" w:cs="Times New Roman"/>
+          <w:noProof/>
+          <w:sz w:val="40"/>
+          <w:szCs w:val="40"/>
+          <w:u w:val="single"/>
+        </w:rPr>
+        <w:lastRenderedPageBreak/>
         <w:t>Kezdőlap</w:t>
       </w:r>
     </w:p>
@@ -416,7 +869,7 @@
                     <pic:cNvPicPr/>
                   </pic:nvPicPr>
                   <pic:blipFill>
-                    <a:blip r:embed="rId7">
+                    <a:blip r:embed="rId8">
                       <a:extLst>
                         <a:ext uri="{28A0092B-C50C-407E-A947-70E740481C1C}">
                           <a14:useLocalDpi xmlns:a14="http://schemas.microsoft.com/office/drawing/2010/main" val="0"/>
@@ -574,7 +1027,7 @@
                     <pic:cNvPicPr/>
                   </pic:nvPicPr>
                   <pic:blipFill>
-                    <a:blip r:embed="rId8">
+                    <a:blip r:embed="rId9">
                       <a:extLst>
                         <a:ext uri="{28A0092B-C50C-407E-A947-70E740481C1C}">
                           <a14:useLocalDpi xmlns:a14="http://schemas.microsoft.com/office/drawing/2010/main" val="0"/>
@@ -678,7 +1131,7 @@
                     <pic:cNvPicPr/>
                   </pic:nvPicPr>
                   <pic:blipFill>
-                    <a:blip r:embed="rId9">
+                    <a:blip r:embed="rId10">
                       <a:extLst>
                         <a:ext uri="{28A0092B-C50C-407E-A947-70E740481C1C}">
                           <a14:useLocalDpi xmlns:a14="http://schemas.microsoft.com/office/drawing/2010/main" val="0"/>
@@ -796,7 +1249,7 @@
                     <pic:cNvPicPr/>
                   </pic:nvPicPr>
                   <pic:blipFill>
-                    <a:blip r:embed="rId10">
+                    <a:blip r:embed="rId11">
                       <a:extLst>
                         <a:ext uri="{28A0092B-C50C-407E-A947-70E740481C1C}">
                           <a14:useLocalDpi xmlns:a14="http://schemas.microsoft.com/office/drawing/2010/main" val="0"/>
@@ -860,7 +1313,7 @@
                     <pic:cNvPicPr/>
                   </pic:nvPicPr>
                   <pic:blipFill>
-                    <a:blip r:embed="rId11">
+                    <a:blip r:embed="rId12">
                       <a:extLst>
                         <a:ext uri="{28A0092B-C50C-407E-A947-70E740481C1C}">
                           <a14:useLocalDpi xmlns:a14="http://schemas.microsoft.com/office/drawing/2010/main" val="0"/>
@@ -971,7 +1424,7 @@
                     <pic:cNvPicPr/>
                   </pic:nvPicPr>
                   <pic:blipFill>
-                    <a:blip r:embed="rId12">
+                    <a:blip r:embed="rId13">
                       <a:extLst>
                         <a:ext uri="{28A0092B-C50C-407E-A947-70E740481C1C}">
                           <a14:useLocalDpi xmlns:a14="http://schemas.microsoft.com/office/drawing/2010/main" val="0"/>
@@ -1029,7 +1482,7 @@
                     <pic:cNvPicPr/>
                   </pic:nvPicPr>
                   <pic:blipFill>
-                    <a:blip r:embed="rId13">
+                    <a:blip r:embed="rId14">
                       <a:extLst>
                         <a:ext uri="{28A0092B-C50C-407E-A947-70E740481C1C}">
                           <a14:useLocalDpi xmlns:a14="http://schemas.microsoft.com/office/drawing/2010/main" val="0"/>
@@ -1134,7 +1587,7 @@
                     <pic:cNvPicPr/>
                   </pic:nvPicPr>
                   <pic:blipFill>
-                    <a:blip r:embed="rId14">
+                    <a:blip r:embed="rId15">
                       <a:extLst>
                         <a:ext uri="{28A0092B-C50C-407E-A947-70E740481C1C}">
                           <a14:useLocalDpi xmlns:a14="http://schemas.microsoft.com/office/drawing/2010/main" val="0"/>
@@ -1192,7 +1645,7 @@
                     <pic:cNvPicPr/>
                   </pic:nvPicPr>
                   <pic:blipFill>
-                    <a:blip r:embed="rId15">
+                    <a:blip r:embed="rId16">
                       <a:extLst>
                         <a:ext uri="{28A0092B-C50C-407E-A947-70E740481C1C}">
                           <a14:useLocalDpi xmlns:a14="http://schemas.microsoft.com/office/drawing/2010/main" val="0"/>
@@ -1237,6 +1690,16 @@
         <w:t>elhasználók</w:t>
       </w:r>
     </w:p>
+    <w:p>
+      <w:pPr>
+        <w:rPr>
+          <w:rFonts w:ascii="Times New Roman" w:hAnsi="Times New Roman" w:cs="Times New Roman"/>
+          <w:sz w:val="40"/>
+          <w:szCs w:val="40"/>
+          <w:u w:val="single"/>
+        </w:rPr>
+      </w:pPr>
+    </w:p>
     <w:sectPr>
       <w:pgSz w:w="11906" w:h="16838"/>
       <w:pgMar w:top="1417" w:right="1417" w:bottom="1417" w:left="1417" w:header="708" w:footer="708" w:gutter="0"/>
@@ -1245,6 +1708,243 @@
     </w:sectPr>
   </w:body>
 </w:document>
+</file>
+
+<file path=word/numbering.xml><?xml version="1.0" encoding="utf-8"?>
+<w:numbering xmlns:wpc="http://schemas.microsoft.com/office/word/2010/wordprocessingCanvas" xmlns:cx="http://schemas.microsoft.com/office/drawing/2014/chartex" xmlns:cx1="http://schemas.microsoft.com/office/drawing/2015/9/8/chartex" xmlns:cx2="http://schemas.microsoft.com/office/drawing/2015/10/21/chartex" xmlns:cx3="http://schemas.microsoft.com/office/drawing/2016/5/9/chartex" xmlns:cx4="http://schemas.microsoft.com/office/drawing/2016/5/10/chartex" xmlns:cx5="http://schemas.microsoft.com/office/drawing/2016/5/11/chartex" xmlns:cx6="http://schemas.microsoft.com/office/drawing/2016/5/12/chartex" xmlns:cx7="http://schemas.microsoft.com/office/drawing/2016/5/13/chartex" xmlns:cx8="http://schemas.microsoft.com/office/drawing/2016/5/14/chartex" xmlns:mc="http://schemas.openxmlformats.org/markup-compatibility/2006" xmlns:aink="http://schemas.microsoft.com/office/drawing/2016/ink" xmlns:am3d="http://schemas.microsoft.com/office/drawing/2017/model3d" xmlns:o="urn:schemas-microsoft-com:office:office" xmlns:r="http://schemas.openxmlformats.org/officeDocument/2006/relationships" xmlns:m="http://schemas.openxmlformats.org/officeDocument/2006/math" xmlns:v="urn:schemas-microsoft-com:vml" xmlns:wp14="http://schemas.microsoft.com/office/word/2010/wordprocessingDrawing" xmlns:wp="http://schemas.openxmlformats.org/drawingml/2006/wordprocessingDrawing" xmlns:w10="urn:schemas-microsoft-com:office:word" xmlns:w="http://schemas.openxmlformats.org/wordprocessingml/2006/main" xmlns:w14="http://schemas.microsoft.com/office/word/2010/wordml" xmlns:w15="http://schemas.microsoft.com/office/word/2012/wordml" xmlns:w16cid="http://schemas.microsoft.com/office/word/2016/wordml/cid" xmlns:w16se="http://schemas.microsoft.com/office/word/2015/wordml/symex" xmlns:wpg="http://schemas.microsoft.com/office/word/2010/wordprocessingGroup" xmlns:wpi="http://schemas.microsoft.com/office/word/2010/wordprocessingInk" xmlns:wne="http://schemas.microsoft.com/office/word/2006/wordml" xmlns:wps="http://schemas.microsoft.com/office/word/2010/wordprocessingShape" mc:Ignorable="w14 w15 w16se w16cid wp14">
+  <w:abstractNum w:abstractNumId="0" w15:restartNumberingAfterBreak="0">
+    <w:nsid w:val="45354DAA"/>
+    <w:multiLevelType w:val="multilevel"/>
+    <w:tmpl w:val="6CEAB9BA"/>
+    <w:lvl w:ilvl="0">
+      <w:start w:val="1"/>
+      <w:numFmt w:val="decimal"/>
+      <w:lvlText w:val="%1."/>
+      <w:lvlJc w:val="left"/>
+      <w:pPr>
+        <w:tabs>
+          <w:tab w:val="num" w:pos="720"/>
+        </w:tabs>
+        <w:ind w:left="720" w:hanging="360"/>
+      </w:pPr>
+    </w:lvl>
+    <w:lvl w:ilvl="1" w:tentative="1">
+      <w:start w:val="1"/>
+      <w:numFmt w:val="decimal"/>
+      <w:lvlText w:val="%2."/>
+      <w:lvlJc w:val="left"/>
+      <w:pPr>
+        <w:tabs>
+          <w:tab w:val="num" w:pos="1440"/>
+        </w:tabs>
+        <w:ind w:left="1440" w:hanging="360"/>
+      </w:pPr>
+    </w:lvl>
+    <w:lvl w:ilvl="2" w:tentative="1">
+      <w:start w:val="1"/>
+      <w:numFmt w:val="decimal"/>
+      <w:lvlText w:val="%3."/>
+      <w:lvlJc w:val="left"/>
+      <w:pPr>
+        <w:tabs>
+          <w:tab w:val="num" w:pos="2160"/>
+        </w:tabs>
+        <w:ind w:left="2160" w:hanging="360"/>
+      </w:pPr>
+    </w:lvl>
+    <w:lvl w:ilvl="3" w:tentative="1">
+      <w:start w:val="1"/>
+      <w:numFmt w:val="decimal"/>
+      <w:lvlText w:val="%4."/>
+      <w:lvlJc w:val="left"/>
+      <w:pPr>
+        <w:tabs>
+          <w:tab w:val="num" w:pos="2880"/>
+        </w:tabs>
+        <w:ind w:left="2880" w:hanging="360"/>
+      </w:pPr>
+    </w:lvl>
+    <w:lvl w:ilvl="4" w:tentative="1">
+      <w:start w:val="1"/>
+      <w:numFmt w:val="decimal"/>
+      <w:lvlText w:val="%5."/>
+      <w:lvlJc w:val="left"/>
+      <w:pPr>
+        <w:tabs>
+          <w:tab w:val="num" w:pos="3600"/>
+        </w:tabs>
+        <w:ind w:left="3600" w:hanging="360"/>
+      </w:pPr>
+    </w:lvl>
+    <w:lvl w:ilvl="5" w:tentative="1">
+      <w:start w:val="1"/>
+      <w:numFmt w:val="decimal"/>
+      <w:lvlText w:val="%6."/>
+      <w:lvlJc w:val="left"/>
+      <w:pPr>
+        <w:tabs>
+          <w:tab w:val="num" w:pos="4320"/>
+        </w:tabs>
+        <w:ind w:left="4320" w:hanging="360"/>
+      </w:pPr>
+    </w:lvl>
+    <w:lvl w:ilvl="6" w:tentative="1">
+      <w:start w:val="1"/>
+      <w:numFmt w:val="decimal"/>
+      <w:lvlText w:val="%7."/>
+      <w:lvlJc w:val="left"/>
+      <w:pPr>
+        <w:tabs>
+          <w:tab w:val="num" w:pos="5040"/>
+        </w:tabs>
+        <w:ind w:left="5040" w:hanging="360"/>
+      </w:pPr>
+    </w:lvl>
+    <w:lvl w:ilvl="7" w:tentative="1">
+      <w:start w:val="1"/>
+      <w:numFmt w:val="decimal"/>
+      <w:lvlText w:val="%8."/>
+      <w:lvlJc w:val="left"/>
+      <w:pPr>
+        <w:tabs>
+          <w:tab w:val="num" w:pos="5760"/>
+        </w:tabs>
+        <w:ind w:left="5760" w:hanging="360"/>
+      </w:pPr>
+    </w:lvl>
+    <w:lvl w:ilvl="8" w:tentative="1">
+      <w:start w:val="1"/>
+      <w:numFmt w:val="decimal"/>
+      <w:lvlText w:val="%9."/>
+      <w:lvlJc w:val="left"/>
+      <w:pPr>
+        <w:tabs>
+          <w:tab w:val="num" w:pos="6480"/>
+        </w:tabs>
+        <w:ind w:left="6480" w:hanging="360"/>
+      </w:pPr>
+    </w:lvl>
+  </w:abstractNum>
+  <w:abstractNum w:abstractNumId="1" w15:restartNumberingAfterBreak="0">
+    <w:nsid w:val="58502FCB"/>
+    <w:multiLevelType w:val="multilevel"/>
+    <w:tmpl w:val="901ADB88"/>
+    <w:lvl w:ilvl="0">
+      <w:start w:val="1"/>
+      <w:numFmt w:val="decimal"/>
+      <w:lvlText w:val="%1."/>
+      <w:lvlJc w:val="left"/>
+      <w:pPr>
+        <w:tabs>
+          <w:tab w:val="num" w:pos="720"/>
+        </w:tabs>
+        <w:ind w:left="720" w:hanging="360"/>
+      </w:pPr>
+    </w:lvl>
+    <w:lvl w:ilvl="1" w:tentative="1">
+      <w:start w:val="1"/>
+      <w:numFmt w:val="decimal"/>
+      <w:lvlText w:val="%2."/>
+      <w:lvlJc w:val="left"/>
+      <w:pPr>
+        <w:tabs>
+          <w:tab w:val="num" w:pos="1440"/>
+        </w:tabs>
+        <w:ind w:left="1440" w:hanging="360"/>
+      </w:pPr>
+    </w:lvl>
+    <w:lvl w:ilvl="2" w:tentative="1">
+      <w:start w:val="1"/>
+      <w:numFmt w:val="decimal"/>
+      <w:lvlText w:val="%3."/>
+      <w:lvlJc w:val="left"/>
+      <w:pPr>
+        <w:tabs>
+          <w:tab w:val="num" w:pos="2160"/>
+        </w:tabs>
+        <w:ind w:left="2160" w:hanging="360"/>
+      </w:pPr>
+    </w:lvl>
+    <w:lvl w:ilvl="3" w:tentative="1">
+      <w:start w:val="1"/>
+      <w:numFmt w:val="decimal"/>
+      <w:lvlText w:val="%4."/>
+      <w:lvlJc w:val="left"/>
+      <w:pPr>
+        <w:tabs>
+          <w:tab w:val="num" w:pos="2880"/>
+        </w:tabs>
+        <w:ind w:left="2880" w:hanging="360"/>
+      </w:pPr>
+    </w:lvl>
+    <w:lvl w:ilvl="4" w:tentative="1">
+      <w:start w:val="1"/>
+      <w:numFmt w:val="decimal"/>
+      <w:lvlText w:val="%5."/>
+      <w:lvlJc w:val="left"/>
+      <w:pPr>
+        <w:tabs>
+          <w:tab w:val="num" w:pos="3600"/>
+        </w:tabs>
+        <w:ind w:left="3600" w:hanging="360"/>
+      </w:pPr>
+    </w:lvl>
+    <w:lvl w:ilvl="5" w:tentative="1">
+      <w:start w:val="1"/>
+      <w:numFmt w:val="decimal"/>
+      <w:lvlText w:val="%6."/>
+      <w:lvlJc w:val="left"/>
+      <w:pPr>
+        <w:tabs>
+          <w:tab w:val="num" w:pos="4320"/>
+        </w:tabs>
+        <w:ind w:left="4320" w:hanging="360"/>
+      </w:pPr>
+    </w:lvl>
+    <w:lvl w:ilvl="6" w:tentative="1">
+      <w:start w:val="1"/>
+      <w:numFmt w:val="decimal"/>
+      <w:lvlText w:val="%7."/>
+      <w:lvlJc w:val="left"/>
+      <w:pPr>
+        <w:tabs>
+          <w:tab w:val="num" w:pos="5040"/>
+        </w:tabs>
+        <w:ind w:left="5040" w:hanging="360"/>
+      </w:pPr>
+    </w:lvl>
+    <w:lvl w:ilvl="7" w:tentative="1">
+      <w:start w:val="1"/>
+      <w:numFmt w:val="decimal"/>
+      <w:lvlText w:val="%8."/>
+      <w:lvlJc w:val="left"/>
+      <w:pPr>
+        <w:tabs>
+          <w:tab w:val="num" w:pos="5760"/>
+        </w:tabs>
+        <w:ind w:left="5760" w:hanging="360"/>
+      </w:pPr>
+    </w:lvl>
+    <w:lvl w:ilvl="8" w:tentative="1">
+      <w:start w:val="1"/>
+      <w:numFmt w:val="decimal"/>
+      <w:lvlText w:val="%9."/>
+      <w:lvlJc w:val="left"/>
+      <w:pPr>
+        <w:tabs>
+          <w:tab w:val="num" w:pos="6480"/>
+        </w:tabs>
+        <w:ind w:left="6480" w:hanging="360"/>
+      </w:pPr>
+    </w:lvl>
+  </w:abstractNum>
+  <w:num w:numId="1">
+    <w:abstractNumId w:val="1"/>
+  </w:num>
+  <w:num w:numId="2">
+    <w:abstractNumId w:val="0"/>
+  </w:num>
+</w:numbering>
 </file>
 
 <file path=word/styles.xml><?xml version="1.0" encoding="utf-8"?>

</xml_diff>

<commit_message>
képek frissítése és dokumentáció frissítése
</commit_message>
<xml_diff>
--- a/doc/felhasznaloi_dokumentacio.docx
+++ b/doc/felhasznaloi_dokumentacio.docx
@@ -354,8 +354,6 @@
         </w:rPr>
         <w:t>.</w:t>
       </w:r>
-      <w:bookmarkStart w:id="0" w:name="_GoBack"/>
-      <w:bookmarkEnd w:id="0"/>
     </w:p>
     <w:p>
       <w:pPr>
@@ -941,8 +939,19 @@
           <w:sz w:val="32"/>
           <w:szCs w:val="32"/>
         </w:rPr>
-        <w:t>a kezdőlapon felsorolt elemeket. A navigációs sávon zölddel jelöljük a jelenleg kiválasztott oldalt.(kijelentkezés coming soon)</w:t>
-      </w:r>
+        <w:t>a kezdőlapon felsorolt elemeket. A navigációs sávon zölddel jelöljük a jelenleg kiválasztott oldalt</w:t>
+      </w:r>
+      <w:r>
+        <w:rPr>
+          <w:rFonts w:ascii="Times New Roman" w:hAnsi="Times New Roman" w:cs="Times New Roman"/>
+          <w:noProof/>
+          <w:sz w:val="32"/>
+          <w:szCs w:val="32"/>
+        </w:rPr>
+        <w:t>.</w:t>
+      </w:r>
+      <w:bookmarkStart w:id="0" w:name="_GoBack"/>
+      <w:bookmarkEnd w:id="0"/>
     </w:p>
     <w:p>
       <w:pPr>
@@ -1004,18 +1013,18 @@
           <w:szCs w:val="32"/>
         </w:rPr>
         <w:drawing>
-          <wp:anchor distT="0" distB="0" distL="114300" distR="114300" simplePos="0" relativeHeight="251662336" behindDoc="0" locked="0" layoutInCell="1" allowOverlap="1" wp14:anchorId="191C1205" wp14:editId="3BF644B3">
+          <wp:anchor distT="0" distB="0" distL="114300" distR="114300" simplePos="0" relativeHeight="251670528" behindDoc="0" locked="0" layoutInCell="1" allowOverlap="1" wp14:anchorId="4B99A849" wp14:editId="7E55C8F4">
             <wp:simplePos x="0" y="0"/>
             <wp:positionH relativeFrom="margin">
               <wp:align>center</wp:align>
             </wp:positionH>
             <wp:positionV relativeFrom="paragraph">
-              <wp:posOffset>744449</wp:posOffset>
+              <wp:posOffset>669290</wp:posOffset>
             </wp:positionV>
-            <wp:extent cx="5354320" cy="4828540"/>
-            <wp:effectExtent l="0" t="0" r="0" b="0"/>
+            <wp:extent cx="5934710" cy="5334000"/>
+            <wp:effectExtent l="0" t="0" r="8890" b="0"/>
             <wp:wrapTopAndBottom/>
-            <wp:docPr id="5" name="Kép 5"/>
+            <wp:docPr id="13" name="Kép 13"/>
             <wp:cNvGraphicFramePr>
               <a:graphicFrameLocks xmlns:a="http://schemas.openxmlformats.org/drawingml/2006/main" noChangeAspect="1"/>
             </wp:cNvGraphicFramePr>
@@ -1023,7 +1032,7 @@
               <a:graphicData uri="http://schemas.openxmlformats.org/drawingml/2006/picture">
                 <pic:pic xmlns:pic="http://schemas.openxmlformats.org/drawingml/2006/picture">
                   <pic:nvPicPr>
-                    <pic:cNvPr id="5" name="filmek.PNG"/>
+                    <pic:cNvPr id="13" name="filmek.PNG"/>
                     <pic:cNvPicPr/>
                   </pic:nvPicPr>
                   <pic:blipFill>
@@ -1041,7 +1050,7 @@
                   <pic:spPr>
                     <a:xfrm>
                       <a:off x="0" y="0"/>
-                      <a:ext cx="5354320" cy="4828540"/>
+                      <a:ext cx="5934710" cy="5334000"/>
                     </a:xfrm>
                     <a:prstGeom prst="rect">
                       <a:avLst/>
@@ -1107,19 +1116,46 @@
           <w:szCs w:val="32"/>
         </w:rPr>
         <w:lastRenderedPageBreak/>
+        <w:t>Ha kiválasztunik egy adatsort akkor annak a sornak az adatai megjelennek a táblázat mellett megtalálható beviteli mezőkben. Az oldal alján található három gomb amelyekkel különböző műveleteket lehet végrehajtani.</w:t>
+      </w:r>
+      <w:r>
+        <w:rPr>
+          <w:rFonts w:ascii="Times New Roman" w:hAnsi="Times New Roman" w:cs="Times New Roman"/>
+          <w:noProof/>
+          <w:sz w:val="32"/>
+          <w:szCs w:val="32"/>
+        </w:rPr>
+        <w:t xml:space="preserve">Az adatbeviteli mezőket tudjuk sajátkezűleg és adatsor kiválasztásával feltölteni. A felvétel gomb megnyomásakor a beviteli mezőkben lévő adatot új elemként felvesszük az adatbázisba és azon nyomban megjelenítjük a táblázatban.A módosítás gomb csak akkor válik elérhetővé </w:t>
+      </w:r>
+      <w:r>
+        <w:rPr>
+          <w:rFonts w:ascii="Times New Roman" w:hAnsi="Times New Roman" w:cs="Times New Roman"/>
+          <w:noProof/>
+          <w:sz w:val="32"/>
+          <w:szCs w:val="32"/>
+        </w:rPr>
+        <w:t>ha kiválasztottunk egy adatsort és megnyomásával módosítjuk a kiválasztott elem adatát az adatbázisban. A törlés gomb csak akkor válik elérhetővé ha kiválasztottunk egy adatsort és megnyomásával töröljük a kiválasztott elemet az adatbázisból.</w:t>
+      </w:r>
+      <w:r>
+        <w:rPr>
+          <w:rFonts w:ascii="Times New Roman" w:hAnsi="Times New Roman" w:cs="Times New Roman"/>
+          <w:noProof/>
+          <w:sz w:val="32"/>
+          <w:szCs w:val="32"/>
+        </w:rPr>
         <w:drawing>
-          <wp:anchor distT="0" distB="0" distL="114300" distR="114300" simplePos="0" relativeHeight="251663360" behindDoc="0" locked="0" layoutInCell="1" allowOverlap="1" wp14:anchorId="406DAB50" wp14:editId="41E7FF67">
+          <wp:anchor distT="0" distB="0" distL="114300" distR="114300" simplePos="0" relativeHeight="251671552" behindDoc="0" locked="0" layoutInCell="1" allowOverlap="1" wp14:anchorId="7E11C3F1" wp14:editId="6E2F77C5">
             <wp:simplePos x="0" y="0"/>
-            <wp:positionH relativeFrom="margin">
-              <wp:align>right</wp:align>
+            <wp:positionH relativeFrom="column">
+              <wp:posOffset>-4445</wp:posOffset>
             </wp:positionH>
             <wp:positionV relativeFrom="paragraph">
-              <wp:posOffset>3108198</wp:posOffset>
+              <wp:posOffset>3024505</wp:posOffset>
             </wp:positionV>
-            <wp:extent cx="5760720" cy="5196205"/>
-            <wp:effectExtent l="0" t="0" r="0" b="4445"/>
+            <wp:extent cx="5760720" cy="5165090"/>
+            <wp:effectExtent l="0" t="0" r="0" b="0"/>
             <wp:wrapTopAndBottom/>
-            <wp:docPr id="6" name="Kép 6"/>
+            <wp:docPr id="14" name="Kép 14"/>
             <wp:cNvGraphicFramePr>
               <a:graphicFrameLocks xmlns:a="http://schemas.openxmlformats.org/drawingml/2006/main" noChangeAspect="1"/>
             </wp:cNvGraphicFramePr>
@@ -1127,7 +1163,7 @@
               <a:graphicData uri="http://schemas.openxmlformats.org/drawingml/2006/picture">
                 <pic:pic xmlns:pic="http://schemas.openxmlformats.org/drawingml/2006/picture">
                   <pic:nvPicPr>
-                    <pic:cNvPr id="6" name="filmek2.PNG"/>
+                    <pic:cNvPr id="14" name="filmek2.PNG"/>
                     <pic:cNvPicPr/>
                   </pic:nvPicPr>
                   <pic:blipFill>
@@ -1145,7 +1181,7 @@
                   <pic:spPr>
                     <a:xfrm>
                       <a:off x="0" y="0"/>
-                      <a:ext cx="5760720" cy="5196205"/>
+                      <a:ext cx="5760720" cy="5165090"/>
                     </a:xfrm>
                     <a:prstGeom prst="rect">
                       <a:avLst/>
@@ -1157,33 +1193,6 @@
           </wp:anchor>
         </w:drawing>
       </w:r>
-      <w:r>
-        <w:rPr>
-          <w:rFonts w:ascii="Times New Roman" w:hAnsi="Times New Roman" w:cs="Times New Roman"/>
-          <w:noProof/>
-          <w:sz w:val="32"/>
-          <w:szCs w:val="32"/>
-        </w:rPr>
-        <w:t>Ha kiválasztunik egy adatsort akkor annak a sornak az adatai megjelennek a táblázat mellett megtalálható beviteli mezőkben. Az oldal alján található három gomb amelyekkel különböző műveleteket lehet végrehajtani.</w:t>
-      </w:r>
-      <w:r>
-        <w:rPr>
-          <w:rFonts w:ascii="Times New Roman" w:hAnsi="Times New Roman" w:cs="Times New Roman"/>
-          <w:noProof/>
-          <w:sz w:val="32"/>
-          <w:szCs w:val="32"/>
-        </w:rPr>
-        <w:t xml:space="preserve">Az adatbeviteli mezőket tudjuk sajátkezűleg és adatsor kiválasztásával feltölteni. A felvétel gomb megnyomásakor a beviteli mezőkben lévő adatot új elemként felvesszük az adatbázisba és azon nyomban megjelenítjük a táblázatban.A módosítás gomb csak akkor válik elérhetővé </w:t>
-      </w:r>
-      <w:r>
-        <w:rPr>
-          <w:rFonts w:ascii="Times New Roman" w:hAnsi="Times New Roman" w:cs="Times New Roman"/>
-          <w:noProof/>
-          <w:sz w:val="32"/>
-          <w:szCs w:val="32"/>
-        </w:rPr>
-        <w:t>ha kiválasztottunk egy adatsort és megnyomásával módosítjuk a kiválasztott elem adatát az adatbázisban. A törlés gomb csak akkor válik elérhetővé ha kiválasztottunk egy adatsort és megnyomásával töröljük a kiválasztott elemet az adatbázisból.</w:t>
-      </w:r>
     </w:p>
     <w:p>
       <w:pPr>
@@ -1222,22 +1231,21 @@
           <w:noProof/>
           <w:sz w:val="40"/>
           <w:szCs w:val="40"/>
-          <w:u w:val="single"/>
         </w:rPr>
         <w:lastRenderedPageBreak/>
         <w:drawing>
-          <wp:anchor distT="0" distB="0" distL="114300" distR="114300" simplePos="0" relativeHeight="251665408" behindDoc="0" locked="0" layoutInCell="1" allowOverlap="1" wp14:anchorId="48CEC3FE" wp14:editId="5BFF9A4D">
+          <wp:anchor distT="0" distB="0" distL="114300" distR="114300" simplePos="0" relativeHeight="251672576" behindDoc="0" locked="0" layoutInCell="1" allowOverlap="1" wp14:anchorId="64F75278" wp14:editId="43A4F347">
             <wp:simplePos x="0" y="0"/>
             <wp:positionH relativeFrom="margin">
-              <wp:posOffset>514274</wp:posOffset>
+              <wp:posOffset>157480</wp:posOffset>
             </wp:positionH>
             <wp:positionV relativeFrom="paragraph">
-              <wp:posOffset>4534078</wp:posOffset>
+              <wp:posOffset>347980</wp:posOffset>
             </wp:positionV>
-            <wp:extent cx="5004000" cy="3835681"/>
-            <wp:effectExtent l="0" t="0" r="6350" b="0"/>
+            <wp:extent cx="5400675" cy="4147185"/>
+            <wp:effectExtent l="0" t="0" r="9525" b="5715"/>
             <wp:wrapTopAndBottom/>
-            <wp:docPr id="8" name="Kép 8"/>
+            <wp:docPr id="15" name="Kép 15"/>
             <wp:cNvGraphicFramePr>
               <a:graphicFrameLocks xmlns:a="http://schemas.openxmlformats.org/drawingml/2006/main" noChangeAspect="1"/>
             </wp:cNvGraphicFramePr>
@@ -1245,7 +1253,7 @@
               <a:graphicData uri="http://schemas.openxmlformats.org/drawingml/2006/picture">
                 <pic:pic xmlns:pic="http://schemas.openxmlformats.org/drawingml/2006/picture">
                   <pic:nvPicPr>
-                    <pic:cNvPr id="8" name="bufe2.PNG"/>
+                    <pic:cNvPr id="15" name="bufe.PNG"/>
                     <pic:cNvPicPr/>
                   </pic:nvPicPr>
                   <pic:blipFill>
@@ -1263,7 +1271,7 @@
                   <pic:spPr>
                     <a:xfrm>
                       <a:off x="0" y="0"/>
-                      <a:ext cx="5004000" cy="3835681"/>
+                      <a:ext cx="5400675" cy="4147185"/>
                     </a:xfrm>
                     <a:prstGeom prst="rect">
                       <a:avLst/>
@@ -1287,21 +1295,20 @@
           <w:noProof/>
           <w:sz w:val="40"/>
           <w:szCs w:val="40"/>
-          <w:u w:val="single"/>
         </w:rPr>
         <w:drawing>
-          <wp:anchor distT="0" distB="0" distL="114300" distR="114300" simplePos="0" relativeHeight="251664384" behindDoc="0" locked="0" layoutInCell="1" allowOverlap="1" wp14:anchorId="120FF5A1" wp14:editId="3641BEEB">
+          <wp:anchor distT="0" distB="0" distL="114300" distR="114300" simplePos="0" relativeHeight="251673600" behindDoc="0" locked="0" layoutInCell="1" allowOverlap="1" wp14:anchorId="75CDA637" wp14:editId="2E00A376">
             <wp:simplePos x="0" y="0"/>
             <wp:positionH relativeFrom="margin">
-              <wp:posOffset>501853</wp:posOffset>
+              <wp:align>center</wp:align>
             </wp:positionH>
             <wp:positionV relativeFrom="paragraph">
-              <wp:posOffset>503885</wp:posOffset>
+              <wp:posOffset>4748530</wp:posOffset>
             </wp:positionV>
-            <wp:extent cx="4981575" cy="3837940"/>
-            <wp:effectExtent l="0" t="0" r="9525" b="0"/>
+            <wp:extent cx="5353050" cy="4123055"/>
+            <wp:effectExtent l="0" t="0" r="0" b="0"/>
             <wp:wrapTopAndBottom/>
-            <wp:docPr id="7" name="Kép 7"/>
+            <wp:docPr id="16" name="Kép 16"/>
             <wp:cNvGraphicFramePr>
               <a:graphicFrameLocks xmlns:a="http://schemas.openxmlformats.org/drawingml/2006/main" noChangeAspect="1"/>
             </wp:cNvGraphicFramePr>
@@ -1309,7 +1316,7 @@
               <a:graphicData uri="http://schemas.openxmlformats.org/drawingml/2006/picture">
                 <pic:pic xmlns:pic="http://schemas.openxmlformats.org/drawingml/2006/picture">
                   <pic:nvPicPr>
-                    <pic:cNvPr id="7" name="bufe.PNG"/>
+                    <pic:cNvPr id="16" name="bufe2.PNG"/>
                     <pic:cNvPicPr/>
                   </pic:nvPicPr>
                   <pic:blipFill>
@@ -1327,7 +1334,7 @@
                   <pic:spPr>
                     <a:xfrm>
                       <a:off x="0" y="0"/>
-                      <a:ext cx="4981575" cy="3837940"/>
+                      <a:ext cx="5353050" cy="4123055"/>
                     </a:xfrm>
                     <a:prstGeom prst="rect">
                       <a:avLst/>
@@ -1366,23 +1373,6 @@
     </w:p>
     <w:p>
       <w:pPr>
-        <w:rPr>
-          <w:rFonts w:ascii="Times New Roman" w:hAnsi="Times New Roman" w:cs="Times New Roman"/>
-          <w:sz w:val="40"/>
-          <w:szCs w:val="40"/>
-        </w:rPr>
-      </w:pPr>
-      <w:r>
-        <w:rPr>
-          <w:rFonts w:ascii="Times New Roman" w:hAnsi="Times New Roman" w:cs="Times New Roman"/>
-          <w:sz w:val="40"/>
-          <w:szCs w:val="40"/>
-        </w:rPr>
-        <w:br w:type="page"/>
-      </w:r>
-    </w:p>
-    <w:p>
-      <w:pPr>
         <w:jc w:val="center"/>
         <w:rPr>
           <w:rFonts w:ascii="Times New Roman" w:hAnsi="Times New Roman" w:cs="Times New Roman"/>
@@ -1394,25 +1384,54 @@
       <w:r>
         <w:rPr>
           <w:rFonts w:ascii="Times New Roman" w:hAnsi="Times New Roman" w:cs="Times New Roman"/>
-          <w:noProof/>
           <w:sz w:val="40"/>
           <w:szCs w:val="40"/>
           <w:u w:val="single"/>
         </w:rPr>
         <w:lastRenderedPageBreak/>
+        <w:t>S</w:t>
+      </w:r>
+      <w:r>
+        <w:rPr>
+          <w:rFonts w:ascii="Times New Roman" w:hAnsi="Times New Roman" w:cs="Times New Roman"/>
+          <w:sz w:val="40"/>
+          <w:szCs w:val="40"/>
+          <w:u w:val="single"/>
+        </w:rPr>
+        <w:t>zínészek</w:t>
+      </w:r>
+    </w:p>
+    <w:p>
+      <w:pPr>
+        <w:jc w:val="center"/>
+        <w:rPr>
+          <w:rFonts w:ascii="Times New Roman" w:hAnsi="Times New Roman" w:cs="Times New Roman"/>
+          <w:sz w:val="40"/>
+          <w:szCs w:val="40"/>
+          <w:u w:val="single"/>
+        </w:rPr>
+      </w:pPr>
+      <w:r>
+        <w:rPr>
+          <w:rFonts w:ascii="Times New Roman" w:hAnsi="Times New Roman" w:cs="Times New Roman"/>
+          <w:noProof/>
+          <w:sz w:val="40"/>
+          <w:szCs w:val="40"/>
+          <w:u w:val="single"/>
+        </w:rPr>
         <w:drawing>
-          <wp:anchor distT="0" distB="0" distL="114300" distR="114300" simplePos="0" relativeHeight="251667456" behindDoc="0" locked="0" layoutInCell="1" allowOverlap="1" wp14:anchorId="0844B1BF" wp14:editId="201F9946">
+          <wp:anchor distT="0" distB="0" distL="114300" distR="114300" simplePos="0" relativeHeight="251677696" behindDoc="0" locked="0" layoutInCell="1" allowOverlap="1" wp14:anchorId="12B7675E" wp14:editId="332684AB">
             <wp:simplePos x="0" y="0"/>
             <wp:positionH relativeFrom="margin">
-              <wp:align>right</wp:align>
+              <wp:align>left</wp:align>
             </wp:positionH>
             <wp:positionV relativeFrom="paragraph">
-              <wp:posOffset>4658995</wp:posOffset>
+              <wp:posOffset>4179570</wp:posOffset>
             </wp:positionV>
-            <wp:extent cx="5760720" cy="3826510"/>
-            <wp:effectExtent l="0" t="0" r="0" b="2540"/>
+            <wp:extent cx="5801995" cy="3876675"/>
+            <wp:effectExtent l="0" t="0" r="8255" b="9525"/>
             <wp:wrapTopAndBottom/>
-            <wp:docPr id="10" name="Kép 10"/>
+            <wp:docPr id="18" name="Kép 18"/>
             <wp:cNvGraphicFramePr>
               <a:graphicFrameLocks xmlns:a="http://schemas.openxmlformats.org/drawingml/2006/main" noChangeAspect="1"/>
             </wp:cNvGraphicFramePr>
@@ -1420,7 +1439,7 @@
               <a:graphicData uri="http://schemas.openxmlformats.org/drawingml/2006/picture">
                 <pic:pic xmlns:pic="http://schemas.openxmlformats.org/drawingml/2006/picture">
                   <pic:nvPicPr>
-                    <pic:cNvPr id="10" name="szineszek2.PNG"/>
+                    <pic:cNvPr id="18" name="szineszek2.PNG"/>
                     <pic:cNvPicPr/>
                   </pic:nvPicPr>
                   <pic:blipFill>
@@ -1438,7 +1457,7 @@
                   <pic:spPr>
                     <a:xfrm>
                       <a:off x="0" y="0"/>
-                      <a:ext cx="5760720" cy="3826510"/>
+                      <a:ext cx="5801995" cy="3876675"/>
                     </a:xfrm>
                     <a:prstGeom prst="rect">
                       <a:avLst/>
@@ -1447,6 +1466,12 @@
                 </pic:pic>
               </a:graphicData>
             </a:graphic>
+            <wp14:sizeRelH relativeFrom="margin">
+              <wp14:pctWidth>0</wp14:pctWidth>
+            </wp14:sizeRelH>
+            <wp14:sizeRelV relativeFrom="margin">
+              <wp14:pctHeight>0</wp14:pctHeight>
+            </wp14:sizeRelV>
           </wp:anchor>
         </w:drawing>
       </w:r>
@@ -1459,18 +1484,18 @@
           <w:u w:val="single"/>
         </w:rPr>
         <w:drawing>
-          <wp:anchor distT="0" distB="0" distL="114300" distR="114300" simplePos="0" relativeHeight="251666432" behindDoc="0" locked="0" layoutInCell="1" allowOverlap="1" wp14:anchorId="31A82D52" wp14:editId="10A44DE8">
+          <wp:anchor distT="0" distB="0" distL="114300" distR="114300" simplePos="0" relativeHeight="251676672" behindDoc="0" locked="0" layoutInCell="1" allowOverlap="1" wp14:anchorId="2A0A74AF" wp14:editId="41BEA26C">
             <wp:simplePos x="0" y="0"/>
-            <wp:positionH relativeFrom="margin">
-              <wp:align>right</wp:align>
+            <wp:positionH relativeFrom="column">
+              <wp:posOffset>-4445</wp:posOffset>
             </wp:positionH>
             <wp:positionV relativeFrom="paragraph">
-              <wp:posOffset>511759</wp:posOffset>
+              <wp:posOffset>-1905</wp:posOffset>
             </wp:positionV>
-            <wp:extent cx="5760720" cy="3862705"/>
-            <wp:effectExtent l="0" t="0" r="0" b="4445"/>
+            <wp:extent cx="5760720" cy="3842385"/>
+            <wp:effectExtent l="0" t="0" r="0" b="5715"/>
             <wp:wrapTopAndBottom/>
-            <wp:docPr id="9" name="Kép 9"/>
+            <wp:docPr id="17" name="Kép 17"/>
             <wp:cNvGraphicFramePr>
               <a:graphicFrameLocks xmlns:a="http://schemas.openxmlformats.org/drawingml/2006/main" noChangeAspect="1"/>
             </wp:cNvGraphicFramePr>
@@ -1478,7 +1503,7 @@
               <a:graphicData uri="http://schemas.openxmlformats.org/drawingml/2006/picture">
                 <pic:pic xmlns:pic="http://schemas.openxmlformats.org/drawingml/2006/picture">
                   <pic:nvPicPr>
-                    <pic:cNvPr id="9" name="szineszek.PNG"/>
+                    <pic:cNvPr id="17" name="szineszek.PNG"/>
                     <pic:cNvPicPr/>
                   </pic:nvPicPr>
                   <pic:blipFill>
@@ -1496,7 +1521,7 @@
                   <pic:spPr>
                     <a:xfrm>
                       <a:off x="0" y="0"/>
-                      <a:ext cx="5760720" cy="3862705"/>
+                      <a:ext cx="5760720" cy="3842385"/>
                     </a:xfrm>
                     <a:prstGeom prst="rect">
                       <a:avLst/>
@@ -1508,74 +1533,56 @@
           </wp:anchor>
         </w:drawing>
       </w:r>
-      <w:r>
+    </w:p>
+    <w:p>
+      <w:pPr>
+        <w:rPr>
+          <w:rFonts w:ascii="Times New Roman" w:hAnsi="Times New Roman" w:cs="Times New Roman"/>
+          <w:sz w:val="40"/>
+          <w:szCs w:val="40"/>
+        </w:rPr>
+      </w:pPr>
+      <w:r>
+        <w:rPr>
+          <w:rFonts w:ascii="Times New Roman" w:hAnsi="Times New Roman" w:cs="Times New Roman"/>
+          <w:sz w:val="40"/>
+          <w:szCs w:val="40"/>
+        </w:rPr>
+        <w:br w:type="page"/>
+      </w:r>
+    </w:p>
+    <w:p>
+      <w:pPr>
+        <w:jc w:val="center"/>
         <w:rPr>
           <w:rFonts w:ascii="Times New Roman" w:hAnsi="Times New Roman" w:cs="Times New Roman"/>
           <w:sz w:val="40"/>
           <w:szCs w:val="40"/>
           <w:u w:val="single"/>
         </w:rPr>
-        <w:t>S</w:t>
-      </w:r>
-      <w:r>
-        <w:rPr>
-          <w:rFonts w:ascii="Times New Roman" w:hAnsi="Times New Roman" w:cs="Times New Roman"/>
+      </w:pPr>
+      <w:r>
+        <w:rPr>
+          <w:rFonts w:ascii="Times New Roman" w:hAnsi="Times New Roman" w:cs="Times New Roman"/>
+          <w:noProof/>
           <w:sz w:val="40"/>
           <w:szCs w:val="40"/>
           <w:u w:val="single"/>
         </w:rPr>
-        <w:t>zínészek</w:t>
-      </w:r>
-    </w:p>
-    <w:p>
-      <w:pPr>
-        <w:rPr>
-          <w:rFonts w:ascii="Times New Roman" w:hAnsi="Times New Roman" w:cs="Times New Roman"/>
-          <w:sz w:val="40"/>
-          <w:szCs w:val="40"/>
-        </w:rPr>
-      </w:pPr>
-      <w:r>
-        <w:rPr>
-          <w:rFonts w:ascii="Times New Roman" w:hAnsi="Times New Roman" w:cs="Times New Roman"/>
-          <w:sz w:val="40"/>
-          <w:szCs w:val="40"/>
-        </w:rPr>
-        <w:br w:type="page"/>
-      </w:r>
-    </w:p>
-    <w:p>
-      <w:pPr>
-        <w:jc w:val="center"/>
-        <w:rPr>
-          <w:rFonts w:ascii="Times New Roman" w:hAnsi="Times New Roman" w:cs="Times New Roman"/>
-          <w:sz w:val="40"/>
-          <w:szCs w:val="40"/>
-          <w:u w:val="single"/>
-        </w:rPr>
-      </w:pPr>
-      <w:r>
-        <w:rPr>
-          <w:rFonts w:ascii="Times New Roman" w:hAnsi="Times New Roman" w:cs="Times New Roman"/>
-          <w:noProof/>
-          <w:sz w:val="40"/>
-          <w:szCs w:val="40"/>
-          <w:u w:val="single"/>
-        </w:rPr>
         <w:lastRenderedPageBreak/>
         <w:drawing>
-          <wp:anchor distT="0" distB="0" distL="114300" distR="114300" simplePos="0" relativeHeight="251669504" behindDoc="0" locked="0" layoutInCell="1" allowOverlap="1" wp14:anchorId="2C47F634" wp14:editId="208A308E">
+          <wp:anchor distT="0" distB="0" distL="114300" distR="114300" simplePos="0" relativeHeight="251675648" behindDoc="0" locked="0" layoutInCell="1" allowOverlap="1" wp14:anchorId="309580AB" wp14:editId="581B114D">
             <wp:simplePos x="0" y="0"/>
             <wp:positionH relativeFrom="margin">
-              <wp:align>right</wp:align>
+              <wp:align>left</wp:align>
             </wp:positionH>
             <wp:positionV relativeFrom="paragraph">
-              <wp:posOffset>4643603</wp:posOffset>
+              <wp:posOffset>414020</wp:posOffset>
             </wp:positionV>
-            <wp:extent cx="5760720" cy="3814445"/>
-            <wp:effectExtent l="0" t="0" r="0" b="0"/>
+            <wp:extent cx="5996305" cy="3990975"/>
+            <wp:effectExtent l="0" t="0" r="4445" b="9525"/>
             <wp:wrapTopAndBottom/>
-            <wp:docPr id="12" name="Kép 12"/>
+            <wp:docPr id="19" name="Kép 19"/>
             <wp:cNvGraphicFramePr>
               <a:graphicFrameLocks xmlns:a="http://schemas.openxmlformats.org/drawingml/2006/main" noChangeAspect="1"/>
             </wp:cNvGraphicFramePr>
@@ -1583,7 +1590,7 @@
               <a:graphicData uri="http://schemas.openxmlformats.org/drawingml/2006/picture">
                 <pic:pic xmlns:pic="http://schemas.openxmlformats.org/drawingml/2006/picture">
                   <pic:nvPicPr>
-                    <pic:cNvPr id="12" name="felhasznalok2.PNG"/>
+                    <pic:cNvPr id="19" name="felhasznalok.PNG"/>
                     <pic:cNvPicPr/>
                   </pic:nvPicPr>
                   <pic:blipFill>
@@ -1601,7 +1608,7 @@
                   <pic:spPr>
                     <a:xfrm>
                       <a:off x="0" y="0"/>
-                      <a:ext cx="5760720" cy="3814445"/>
+                      <a:ext cx="5996305" cy="3990975"/>
                     </a:xfrm>
                     <a:prstGeom prst="rect">
                       <a:avLst/>
@@ -1610,30 +1617,64 @@
                 </pic:pic>
               </a:graphicData>
             </a:graphic>
+            <wp14:sizeRelH relativeFrom="margin">
+              <wp14:pctWidth>0</wp14:pctWidth>
+            </wp14:sizeRelH>
+            <wp14:sizeRelV relativeFrom="margin">
+              <wp14:pctHeight>0</wp14:pctHeight>
+            </wp14:sizeRelV>
           </wp:anchor>
         </w:drawing>
       </w:r>
       <w:r>
         <w:rPr>
           <w:rFonts w:ascii="Times New Roman" w:hAnsi="Times New Roman" w:cs="Times New Roman"/>
-          <w:noProof/>
           <w:sz w:val="40"/>
           <w:szCs w:val="40"/>
           <w:u w:val="single"/>
         </w:rPr>
+        <w:t>F</w:t>
+      </w:r>
+      <w:r>
+        <w:rPr>
+          <w:rFonts w:ascii="Times New Roman" w:hAnsi="Times New Roman" w:cs="Times New Roman"/>
+          <w:sz w:val="40"/>
+          <w:szCs w:val="40"/>
+          <w:u w:val="single"/>
+        </w:rPr>
+        <w:t>elhasználók</w:t>
+      </w:r>
+    </w:p>
+    <w:p>
+      <w:pPr>
+        <w:rPr>
+          <w:rFonts w:ascii="Times New Roman" w:hAnsi="Times New Roman" w:cs="Times New Roman"/>
+          <w:sz w:val="40"/>
+          <w:szCs w:val="40"/>
+          <w:u w:val="single"/>
+        </w:rPr>
+      </w:pPr>
+      <w:r>
+        <w:rPr>
+          <w:rFonts w:ascii="Times New Roman" w:hAnsi="Times New Roman" w:cs="Times New Roman"/>
+          <w:noProof/>
+          <w:sz w:val="40"/>
+          <w:szCs w:val="40"/>
+          <w:u w:val="single"/>
+        </w:rPr>
         <w:drawing>
-          <wp:anchor distT="0" distB="0" distL="114300" distR="114300" simplePos="0" relativeHeight="251668480" behindDoc="0" locked="0" layoutInCell="1" allowOverlap="1" wp14:anchorId="16F41AA1" wp14:editId="32CE3935">
+          <wp:anchor distT="0" distB="0" distL="114300" distR="114300" simplePos="0" relativeHeight="251674624" behindDoc="0" locked="0" layoutInCell="1" allowOverlap="1" wp14:anchorId="4DEF688B" wp14:editId="7EDA493B">
             <wp:simplePos x="0" y="0"/>
             <wp:positionH relativeFrom="margin">
-              <wp:align>right</wp:align>
+              <wp:align>left</wp:align>
             </wp:positionH>
             <wp:positionV relativeFrom="paragraph">
-              <wp:posOffset>445567</wp:posOffset>
+              <wp:posOffset>4331335</wp:posOffset>
             </wp:positionV>
-            <wp:extent cx="5760720" cy="3843020"/>
-            <wp:effectExtent l="0" t="0" r="0" b="5080"/>
+            <wp:extent cx="6024880" cy="4010025"/>
+            <wp:effectExtent l="0" t="0" r="0" b="9525"/>
             <wp:wrapTopAndBottom/>
-            <wp:docPr id="11" name="Kép 11"/>
+            <wp:docPr id="20" name="Kép 20"/>
             <wp:cNvGraphicFramePr>
               <a:graphicFrameLocks xmlns:a="http://schemas.openxmlformats.org/drawingml/2006/main" noChangeAspect="1"/>
             </wp:cNvGraphicFramePr>
@@ -1641,7 +1682,7 @@
               <a:graphicData uri="http://schemas.openxmlformats.org/drawingml/2006/picture">
                 <pic:pic xmlns:pic="http://schemas.openxmlformats.org/drawingml/2006/picture">
                   <pic:nvPicPr>
-                    <pic:cNvPr id="11" name="felhasznalok.PNG"/>
+                    <pic:cNvPr id="20" name="felhasznalok2.PNG"/>
                     <pic:cNvPicPr/>
                   </pic:nvPicPr>
                   <pic:blipFill>
@@ -1659,7 +1700,7 @@
                   <pic:spPr>
                     <a:xfrm>
                       <a:off x="0" y="0"/>
-                      <a:ext cx="5760720" cy="3843020"/>
+                      <a:ext cx="6024880" cy="4010025"/>
                     </a:xfrm>
                     <a:prstGeom prst="rect">
                       <a:avLst/>
@@ -1668,37 +1709,15 @@
                 </pic:pic>
               </a:graphicData>
             </a:graphic>
+            <wp14:sizeRelH relativeFrom="margin">
+              <wp14:pctWidth>0</wp14:pctWidth>
+            </wp14:sizeRelH>
+            <wp14:sizeRelV relativeFrom="margin">
+              <wp14:pctHeight>0</wp14:pctHeight>
+            </wp14:sizeRelV>
           </wp:anchor>
         </w:drawing>
       </w:r>
-      <w:r>
-        <w:rPr>
-          <w:rFonts w:ascii="Times New Roman" w:hAnsi="Times New Roman" w:cs="Times New Roman"/>
-          <w:sz w:val="40"/>
-          <w:szCs w:val="40"/>
-          <w:u w:val="single"/>
-        </w:rPr>
-        <w:t>F</w:t>
-      </w:r>
-      <w:r>
-        <w:rPr>
-          <w:rFonts w:ascii="Times New Roman" w:hAnsi="Times New Roman" w:cs="Times New Roman"/>
-          <w:sz w:val="40"/>
-          <w:szCs w:val="40"/>
-          <w:u w:val="single"/>
-        </w:rPr>
-        <w:t>elhasználók</w:t>
-      </w:r>
-    </w:p>
-    <w:p>
-      <w:pPr>
-        <w:rPr>
-          <w:rFonts w:ascii="Times New Roman" w:hAnsi="Times New Roman" w:cs="Times New Roman"/>
-          <w:sz w:val="40"/>
-          <w:szCs w:val="40"/>
-          <w:u w:val="single"/>
-        </w:rPr>
-      </w:pPr>
     </w:p>
     <w:sectPr>
       <w:pgSz w:w="11906" w:h="16838"/>

</xml_diff>

<commit_message>
felhasználói és szakmai dokumentáció frissítése
</commit_message>
<xml_diff>
--- a/doc/felhasznaloi_dokumentacio.docx
+++ b/doc/felhasznaloi_dokumentacio.docx
@@ -1,6 +1,6 @@
 
 <file path=word/document.xml><?xml version="1.0" encoding="utf-8"?>
-<w:document xmlns:wpc="http://schemas.microsoft.com/office/word/2010/wordprocessingCanvas" xmlns:cx="http://schemas.microsoft.com/office/drawing/2014/chartex" xmlns:cx1="http://schemas.microsoft.com/office/drawing/2015/9/8/chartex" xmlns:cx2="http://schemas.microsoft.com/office/drawing/2015/10/21/chartex" xmlns:cx3="http://schemas.microsoft.com/office/drawing/2016/5/9/chartex" xmlns:cx4="http://schemas.microsoft.com/office/drawing/2016/5/10/chartex" xmlns:cx5="http://schemas.microsoft.com/office/drawing/2016/5/11/chartex" xmlns:cx6="http://schemas.microsoft.com/office/drawing/2016/5/12/chartex" xmlns:cx7="http://schemas.microsoft.com/office/drawing/2016/5/13/chartex" xmlns:cx8="http://schemas.microsoft.com/office/drawing/2016/5/14/chartex" xmlns:mc="http://schemas.openxmlformats.org/markup-compatibility/2006" xmlns:aink="http://schemas.microsoft.com/office/drawing/2016/ink" xmlns:am3d="http://schemas.microsoft.com/office/drawing/2017/model3d" xmlns:o="urn:schemas-microsoft-com:office:office" xmlns:r="http://schemas.openxmlformats.org/officeDocument/2006/relationships" xmlns:m="http://schemas.openxmlformats.org/officeDocument/2006/math" xmlns:v="urn:schemas-microsoft-com:vml" xmlns:wp14="http://schemas.microsoft.com/office/word/2010/wordprocessingDrawing" xmlns:wp="http://schemas.openxmlformats.org/drawingml/2006/wordprocessingDrawing" xmlns:w10="urn:schemas-microsoft-com:office:word" xmlns:w="http://schemas.openxmlformats.org/wordprocessingml/2006/main" xmlns:w14="http://schemas.microsoft.com/office/word/2010/wordml" xmlns:w15="http://schemas.microsoft.com/office/word/2012/wordml" xmlns:w16cid="http://schemas.microsoft.com/office/word/2016/wordml/cid" xmlns:w16se="http://schemas.microsoft.com/office/word/2015/wordml/symex" xmlns:wpg="http://schemas.microsoft.com/office/word/2010/wordprocessingGroup" xmlns:wpi="http://schemas.microsoft.com/office/word/2010/wordprocessingInk" xmlns:wne="http://schemas.microsoft.com/office/word/2006/wordml" xmlns:wps="http://schemas.microsoft.com/office/word/2010/wordprocessingShape" mc:Ignorable="w14 w15 w16se w16cid wp14">
+<w:document xmlns:wpc="http://schemas.microsoft.com/office/word/2010/wordprocessingCanvas" xmlns:cx="http://schemas.microsoft.com/office/drawing/2014/chartex" xmlns:cx1="http://schemas.microsoft.com/office/drawing/2015/9/8/chartex" xmlns:cx2="http://schemas.microsoft.com/office/drawing/2015/10/21/chartex" xmlns:cx3="http://schemas.microsoft.com/office/drawing/2016/5/9/chartex" xmlns:cx4="http://schemas.microsoft.com/office/drawing/2016/5/10/chartex" xmlns:cx5="http://schemas.microsoft.com/office/drawing/2016/5/11/chartex" xmlns:cx6="http://schemas.microsoft.com/office/drawing/2016/5/12/chartex" xmlns:cx7="http://schemas.microsoft.com/office/drawing/2016/5/13/chartex" xmlns:cx8="http://schemas.microsoft.com/office/drawing/2016/5/14/chartex" xmlns:mc="http://schemas.openxmlformats.org/markup-compatibility/2006" xmlns:aink="http://schemas.microsoft.com/office/drawing/2016/ink" xmlns:am3d="http://schemas.microsoft.com/office/drawing/2017/model3d" xmlns:o="urn:schemas-microsoft-com:office:office" xmlns:oel="http://schemas.microsoft.com/office/2019/extlst" xmlns:r="http://schemas.openxmlformats.org/officeDocument/2006/relationships" xmlns:m="http://schemas.openxmlformats.org/officeDocument/2006/math" xmlns:v="urn:schemas-microsoft-com:vml" xmlns:wp14="http://schemas.microsoft.com/office/word/2010/wordprocessingDrawing" xmlns:wp="http://schemas.openxmlformats.org/drawingml/2006/wordprocessingDrawing" xmlns:w10="urn:schemas-microsoft-com:office:word" xmlns:w="http://schemas.openxmlformats.org/wordprocessingml/2006/main" xmlns:w14="http://schemas.microsoft.com/office/word/2010/wordml" xmlns:w15="http://schemas.microsoft.com/office/word/2012/wordml" xmlns:w16cex="http://schemas.microsoft.com/office/word/2018/wordml/cex" xmlns:w16cid="http://schemas.microsoft.com/office/word/2016/wordml/cid" xmlns:w16="http://schemas.microsoft.com/office/word/2018/wordml" xmlns:w16du="http://schemas.microsoft.com/office/word/2023/wordml/word16du" xmlns:w16sdtdh="http://schemas.microsoft.com/office/word/2020/wordml/sdtdatahash" xmlns:w16sdtfl="http://schemas.microsoft.com/office/word/2024/wordml/sdtformatlock" xmlns:w16se="http://schemas.microsoft.com/office/word/2015/wordml/symex" xmlns:wpg="http://schemas.microsoft.com/office/word/2010/wordprocessingGroup" xmlns:wpi="http://schemas.microsoft.com/office/word/2010/wordprocessingInk" xmlns:wne="http://schemas.microsoft.com/office/word/2006/wordml" xmlns:wps="http://schemas.microsoft.com/office/word/2010/wordprocessingShape" mc:Ignorable="w14 w15 w16se w16cid w16 w16cex w16sdtdh w16sdtfl w16du wp14">
   <w:body>
     <w:p>
       <w:pPr>
@@ -58,7 +58,23 @@
           <w:sz w:val="32"/>
           <w:szCs w:val="32"/>
         </w:rPr>
-        <w:t>Asztali és mobil alkalmazás fejélesztése</w:t>
+        <w:t>Asztali és mobil alkalmazás</w:t>
+      </w:r>
+      <w:r>
+        <w:rPr>
+          <w:rFonts w:ascii="Times New Roman" w:hAnsi="Times New Roman" w:cs="Times New Roman"/>
+          <w:sz w:val="32"/>
+          <w:szCs w:val="32"/>
+        </w:rPr>
+        <w:t>ok</w:t>
+      </w:r>
+      <w:r>
+        <w:rPr>
+          <w:rFonts w:ascii="Times New Roman" w:hAnsi="Times New Roman" w:cs="Times New Roman"/>
+          <w:sz w:val="32"/>
+          <w:szCs w:val="32"/>
+        </w:rPr>
+        <w:t xml:space="preserve"> fejélesztése</w:t>
       </w:r>
     </w:p>
     <w:p>
@@ -86,6 +102,8 @@
       <w:pPr>
         <w:rPr>
           <w:rFonts w:ascii="Times New Roman" w:hAnsi="Times New Roman" w:cs="Times New Roman"/>
+          <w:b/>
+          <w:bCs/>
           <w:i/>
           <w:sz w:val="28"/>
           <w:szCs w:val="28"/>
@@ -94,99 +112,345 @@
       <w:r>
         <w:rPr>
           <w:rFonts w:ascii="Times New Roman" w:hAnsi="Times New Roman" w:cs="Times New Roman"/>
+          <w:b/>
+          <w:bCs/>
           <w:i/>
           <w:sz w:val="28"/>
           <w:szCs w:val="28"/>
         </w:rPr>
-        <w:t>Adatbázis:</w:t>
-      </w:r>
-    </w:p>
-    <w:p>
-      <w:pPr>
-        <w:rPr>
-          <w:rFonts w:ascii="Times New Roman" w:hAnsi="Times New Roman" w:cs="Times New Roman"/>
-          <w:sz w:val="28"/>
-          <w:szCs w:val="28"/>
-        </w:rPr>
-      </w:pPr>
-      <w:r>
-        <w:rPr>
-          <w:rFonts w:ascii="Times New Roman" w:hAnsi="Times New Roman" w:cs="Times New Roman"/>
-          <w:sz w:val="28"/>
-          <w:szCs w:val="28"/>
-        </w:rPr>
-        <w:tab/>
-        <w:t>Indítsa el a xampp programot, benne az apache és a MySQL szervert</w:t>
-      </w:r>
-    </w:p>
-    <w:p>
-      <w:pPr>
-        <w:rPr>
-          <w:rFonts w:ascii="Times New Roman" w:hAnsi="Times New Roman" w:cs="Times New Roman"/>
-          <w:sz w:val="28"/>
-          <w:szCs w:val="28"/>
-        </w:rPr>
-      </w:pPr>
-      <w:r>
-        <w:rPr>
-          <w:rFonts w:ascii="Times New Roman" w:hAnsi="Times New Roman" w:cs="Times New Roman"/>
-          <w:sz w:val="28"/>
-          <w:szCs w:val="28"/>
-        </w:rPr>
-        <w:tab/>
-      </w:r>
-      <w:r>
-        <w:rPr>
-          <w:rFonts w:ascii="Times New Roman" w:hAnsi="Times New Roman" w:cs="Times New Roman"/>
-          <w:sz w:val="28"/>
-          <w:szCs w:val="28"/>
-        </w:rPr>
-        <w:t>Adatbázis neve: cosmoscreen</w:t>
-      </w:r>
-      <w:r>
-        <w:rPr>
-          <w:rFonts w:ascii="Times New Roman" w:hAnsi="Times New Roman" w:cs="Times New Roman"/>
-          <w:sz w:val="28"/>
-          <w:szCs w:val="28"/>
-        </w:rPr>
-        <w:t>, kódolás: utf8_general_ci</w:t>
-      </w:r>
-    </w:p>
-    <w:p>
-      <w:pPr>
-        <w:rPr>
-          <w:rFonts w:ascii="Times New Roman" w:hAnsi="Times New Roman" w:cs="Times New Roman"/>
-          <w:sz w:val="28"/>
-          <w:szCs w:val="28"/>
-        </w:rPr>
-      </w:pPr>
-      <w:r>
-        <w:rPr>
-          <w:rFonts w:ascii="Times New Roman" w:hAnsi="Times New Roman" w:cs="Times New Roman"/>
-          <w:sz w:val="28"/>
-          <w:szCs w:val="28"/>
-        </w:rPr>
-        <w:tab/>
-        <w:t>Importálja a cosmoscreen.sql fájlt</w:t>
-      </w:r>
-    </w:p>
-    <w:p>
-      <w:pPr>
-        <w:rPr>
-          <w:rFonts w:ascii="Times New Roman" w:hAnsi="Times New Roman" w:cs="Times New Roman"/>
+        <w:t>Adatbázis</w:t>
+      </w:r>
+      <w:r>
+        <w:rPr>
+          <w:rFonts w:ascii="Times New Roman" w:hAnsi="Times New Roman" w:cs="Times New Roman"/>
+          <w:b/>
+          <w:bCs/>
           <w:i/>
           <w:sz w:val="28"/>
           <w:szCs w:val="28"/>
         </w:rPr>
-      </w:pPr>
-      <w:r>
-        <w:rPr>
-          <w:rFonts w:ascii="Times New Roman" w:hAnsi="Times New Roman" w:cs="Times New Roman"/>
+        <w:t xml:space="preserve"> beállítása</w:t>
+      </w:r>
+      <w:r>
+        <w:rPr>
+          <w:rFonts w:ascii="Times New Roman" w:hAnsi="Times New Roman" w:cs="Times New Roman"/>
+          <w:b/>
+          <w:bCs/>
           <w:i/>
           <w:sz w:val="28"/>
           <w:szCs w:val="28"/>
         </w:rPr>
-        <w:t>Installer:</w:t>
+        <w:t>:</w:t>
+      </w:r>
+    </w:p>
+    <w:p>
+      <w:pPr>
+        <w:pStyle w:val="ListParagraph"/>
+        <w:numPr>
+          <w:ilvl w:val="0"/>
+          <w:numId w:val="5"/>
+        </w:numPr>
+        <w:rPr>
+          <w:rFonts w:ascii="Times New Roman" w:hAnsi="Times New Roman" w:cs="Times New Roman"/>
+          <w:sz w:val="28"/>
+          <w:szCs w:val="28"/>
+        </w:rPr>
+      </w:pPr>
+      <w:r>
+        <w:rPr>
+          <w:rFonts w:ascii="Times New Roman" w:hAnsi="Times New Roman" w:cs="Times New Roman"/>
+          <w:sz w:val="28"/>
+          <w:szCs w:val="28"/>
+        </w:rPr>
+        <w:t xml:space="preserve">Indítsa el a </w:t>
+      </w:r>
+      <w:r>
+        <w:rPr>
+          <w:rFonts w:ascii="Times New Roman" w:hAnsi="Times New Roman" w:cs="Times New Roman"/>
+          <w:b/>
+          <w:bCs/>
+          <w:sz w:val="28"/>
+          <w:szCs w:val="28"/>
+        </w:rPr>
+        <w:t>XAMPP</w:t>
+      </w:r>
+      <w:r>
+        <w:rPr>
+          <w:rFonts w:ascii="Times New Roman" w:hAnsi="Times New Roman" w:cs="Times New Roman"/>
+          <w:sz w:val="28"/>
+          <w:szCs w:val="28"/>
+        </w:rPr>
+        <w:t xml:space="preserve"> alkalmazást.</w:t>
+      </w:r>
+    </w:p>
+    <w:p>
+      <w:pPr>
+        <w:pStyle w:val="ListParagraph"/>
+        <w:numPr>
+          <w:ilvl w:val="0"/>
+          <w:numId w:val="5"/>
+        </w:numPr>
+        <w:rPr>
+          <w:rFonts w:ascii="Times New Roman" w:hAnsi="Times New Roman" w:cs="Times New Roman"/>
+          <w:sz w:val="28"/>
+          <w:szCs w:val="28"/>
+        </w:rPr>
+      </w:pPr>
+      <w:r>
+        <w:rPr>
+          <w:rFonts w:ascii="Times New Roman" w:hAnsi="Times New Roman" w:cs="Times New Roman"/>
+          <w:sz w:val="28"/>
+          <w:szCs w:val="28"/>
+        </w:rPr>
+        <w:t>A vezérlőpulton indítsa el az alábbi szolgáltatásokat:</w:t>
+      </w:r>
+    </w:p>
+    <w:p>
+      <w:pPr>
+        <w:pStyle w:val="ListParagraph"/>
+        <w:numPr>
+          <w:ilvl w:val="1"/>
+          <w:numId w:val="5"/>
+        </w:numPr>
+        <w:rPr>
+          <w:rFonts w:ascii="Times New Roman" w:hAnsi="Times New Roman" w:cs="Times New Roman"/>
+          <w:sz w:val="28"/>
+          <w:szCs w:val="28"/>
+        </w:rPr>
+      </w:pPr>
+      <w:r>
+        <w:rPr>
+          <w:rFonts w:ascii="Times New Roman" w:hAnsi="Times New Roman" w:cs="Times New Roman"/>
+          <w:b/>
+          <w:bCs/>
+          <w:sz w:val="28"/>
+          <w:szCs w:val="28"/>
+        </w:rPr>
+        <w:t>Apache</w:t>
+      </w:r>
+    </w:p>
+    <w:p>
+      <w:pPr>
+        <w:pStyle w:val="ListParagraph"/>
+        <w:numPr>
+          <w:ilvl w:val="1"/>
+          <w:numId w:val="5"/>
+        </w:numPr>
+        <w:rPr>
+          <w:rFonts w:ascii="Times New Roman" w:hAnsi="Times New Roman" w:cs="Times New Roman"/>
+          <w:sz w:val="28"/>
+          <w:szCs w:val="28"/>
+        </w:rPr>
+      </w:pPr>
+      <w:r>
+        <w:rPr>
+          <w:rFonts w:ascii="Times New Roman" w:hAnsi="Times New Roman" w:cs="Times New Roman"/>
+          <w:b/>
+          <w:bCs/>
+          <w:sz w:val="28"/>
+          <w:szCs w:val="28"/>
+        </w:rPr>
+        <w:t>MySQL</w:t>
+      </w:r>
+    </w:p>
+    <w:p>
+      <w:pPr>
+        <w:pStyle w:val="ListParagraph"/>
+        <w:numPr>
+          <w:ilvl w:val="0"/>
+          <w:numId w:val="5"/>
+        </w:numPr>
+        <w:rPr>
+          <w:rFonts w:ascii="Times New Roman" w:hAnsi="Times New Roman" w:cs="Times New Roman"/>
+          <w:sz w:val="28"/>
+          <w:szCs w:val="28"/>
+        </w:rPr>
+      </w:pPr>
+      <w:r>
+        <w:rPr>
+          <w:rFonts w:ascii="Times New Roman" w:hAnsi="Times New Roman" w:cs="Times New Roman"/>
+          <w:sz w:val="28"/>
+          <w:szCs w:val="28"/>
+        </w:rPr>
+        <w:t xml:space="preserve">Nyissa meg a </w:t>
+      </w:r>
+      <w:r>
+        <w:rPr>
+          <w:rFonts w:ascii="Times New Roman" w:hAnsi="Times New Roman" w:cs="Times New Roman"/>
+          <w:b/>
+          <w:bCs/>
+          <w:sz w:val="28"/>
+          <w:szCs w:val="28"/>
+        </w:rPr>
+        <w:t>phpMyAdmin</w:t>
+      </w:r>
+      <w:r>
+        <w:rPr>
+          <w:rFonts w:ascii="Times New Roman" w:hAnsi="Times New Roman" w:cs="Times New Roman"/>
+          <w:sz w:val="28"/>
+          <w:szCs w:val="28"/>
+        </w:rPr>
+        <w:t xml:space="preserve"> felületet.</w:t>
+      </w:r>
+    </w:p>
+    <w:p>
+      <w:pPr>
+        <w:pStyle w:val="ListParagraph"/>
+        <w:numPr>
+          <w:ilvl w:val="0"/>
+          <w:numId w:val="5"/>
+        </w:numPr>
+        <w:rPr>
+          <w:rFonts w:ascii="Times New Roman" w:hAnsi="Times New Roman" w:cs="Times New Roman"/>
+          <w:sz w:val="28"/>
+          <w:szCs w:val="28"/>
+        </w:rPr>
+      </w:pPr>
+      <w:r>
+        <w:rPr>
+          <w:rFonts w:ascii="Times New Roman" w:hAnsi="Times New Roman" w:cs="Times New Roman"/>
+          <w:sz w:val="28"/>
+          <w:szCs w:val="28"/>
+        </w:rPr>
+        <w:t>Hozzon létre egy új adatbázist az alábbi adatokkal:</w:t>
+      </w:r>
+    </w:p>
+    <w:p>
+      <w:pPr>
+        <w:pStyle w:val="ListParagraph"/>
+        <w:numPr>
+          <w:ilvl w:val="1"/>
+          <w:numId w:val="5"/>
+        </w:numPr>
+        <w:rPr>
+          <w:rFonts w:ascii="Times New Roman" w:hAnsi="Times New Roman" w:cs="Times New Roman"/>
+          <w:sz w:val="28"/>
+          <w:szCs w:val="28"/>
+        </w:rPr>
+      </w:pPr>
+      <w:r>
+        <w:rPr>
+          <w:rFonts w:ascii="Times New Roman" w:hAnsi="Times New Roman" w:cs="Times New Roman"/>
+          <w:b/>
+          <w:bCs/>
+          <w:sz w:val="28"/>
+          <w:szCs w:val="28"/>
+        </w:rPr>
+        <w:t>Adatbázis neve:</w:t>
+      </w:r>
+      <w:r>
+        <w:rPr>
+          <w:rFonts w:ascii="Times New Roman" w:hAnsi="Times New Roman" w:cs="Times New Roman"/>
+          <w:sz w:val="28"/>
+          <w:szCs w:val="28"/>
+        </w:rPr>
+        <w:t xml:space="preserve"> cosmoscreen</w:t>
+      </w:r>
+    </w:p>
+    <w:p>
+      <w:pPr>
+        <w:pStyle w:val="ListParagraph"/>
+        <w:numPr>
+          <w:ilvl w:val="1"/>
+          <w:numId w:val="5"/>
+        </w:numPr>
+        <w:rPr>
+          <w:rFonts w:ascii="Times New Roman" w:hAnsi="Times New Roman" w:cs="Times New Roman"/>
+          <w:sz w:val="28"/>
+          <w:szCs w:val="28"/>
+        </w:rPr>
+      </w:pPr>
+      <w:r>
+        <w:rPr>
+          <w:rFonts w:ascii="Times New Roman" w:hAnsi="Times New Roman" w:cs="Times New Roman"/>
+          <w:b/>
+          <w:bCs/>
+          <w:sz w:val="28"/>
+          <w:szCs w:val="28"/>
+        </w:rPr>
+        <w:t>Kódolás:</w:t>
+      </w:r>
+      <w:r>
+        <w:rPr>
+          <w:rFonts w:ascii="Times New Roman" w:hAnsi="Times New Roman" w:cs="Times New Roman"/>
+          <w:sz w:val="28"/>
+          <w:szCs w:val="28"/>
+        </w:rPr>
+        <w:t xml:space="preserve"> utf8_general_ci</w:t>
+      </w:r>
+    </w:p>
+    <w:p>
+      <w:pPr>
+        <w:pStyle w:val="ListParagraph"/>
+        <w:numPr>
+          <w:ilvl w:val="0"/>
+          <w:numId w:val="5"/>
+        </w:numPr>
+        <w:rPr>
+          <w:rFonts w:ascii="Times New Roman" w:hAnsi="Times New Roman" w:cs="Times New Roman"/>
+          <w:sz w:val="28"/>
+          <w:szCs w:val="28"/>
+        </w:rPr>
+      </w:pPr>
+      <w:r>
+        <w:rPr>
+          <w:rFonts w:ascii="Times New Roman" w:hAnsi="Times New Roman" w:cs="Times New Roman"/>
+          <w:sz w:val="28"/>
+          <w:szCs w:val="28"/>
+        </w:rPr>
+        <w:t xml:space="preserve">Az adatbázis létrehozása után importálja a mellékelt </w:t>
+      </w:r>
+      <w:r>
+        <w:rPr>
+          <w:rFonts w:ascii="Times New Roman" w:hAnsi="Times New Roman" w:cs="Times New Roman"/>
+          <w:b/>
+          <w:bCs/>
+          <w:sz w:val="28"/>
+          <w:szCs w:val="28"/>
+        </w:rPr>
+        <w:t>cosmoscreen.sql</w:t>
+      </w:r>
+      <w:r>
+        <w:rPr>
+          <w:rFonts w:ascii="Times New Roman" w:hAnsi="Times New Roman" w:cs="Times New Roman"/>
+          <w:sz w:val="28"/>
+          <w:szCs w:val="28"/>
+        </w:rPr>
+        <w:t xml:space="preserve"> fájlt.</w:t>
+      </w:r>
+    </w:p>
+    <w:p>
+      <w:pPr>
+        <w:rPr>
+          <w:rFonts w:ascii="Times New Roman" w:hAnsi="Times New Roman" w:cs="Times New Roman"/>
+          <w:b/>
+          <w:bCs/>
+          <w:i/>
+          <w:sz w:val="28"/>
+          <w:szCs w:val="28"/>
+        </w:rPr>
+      </w:pPr>
+      <w:r>
+        <w:rPr>
+          <w:rFonts w:ascii="Times New Roman" w:hAnsi="Times New Roman" w:cs="Times New Roman"/>
+          <w:b/>
+          <w:bCs/>
+          <w:i/>
+          <w:sz w:val="28"/>
+          <w:szCs w:val="28"/>
+        </w:rPr>
+        <w:t>A program telepítése</w:t>
+      </w:r>
+      <w:r>
+        <w:rPr>
+          <w:rFonts w:ascii="Times New Roman" w:hAnsi="Times New Roman" w:cs="Times New Roman"/>
+          <w:b/>
+          <w:bCs/>
+          <w:i/>
+          <w:sz w:val="28"/>
+          <w:szCs w:val="28"/>
+        </w:rPr>
+        <w:t>:</w:t>
       </w:r>
     </w:p>
     <w:p>
@@ -207,7 +471,25 @@
           <w:sz w:val="28"/>
           <w:szCs w:val="28"/>
         </w:rPr>
-        <w:t>csomagolja ki a zip-et</w:t>
+        <w:t xml:space="preserve">Csomagolja ki a kapott </w:t>
+      </w:r>
+      <w:r>
+        <w:rPr>
+          <w:rFonts w:ascii="Times New Roman" w:hAnsi="Times New Roman" w:cs="Times New Roman"/>
+          <w:b/>
+          <w:bCs/>
+          <w:sz w:val="28"/>
+          <w:szCs w:val="28"/>
+        </w:rPr>
+        <w:t>ZIP fájlt</w:t>
+      </w:r>
+      <w:r>
+        <w:rPr>
+          <w:rFonts w:ascii="Times New Roman" w:hAnsi="Times New Roman" w:cs="Times New Roman"/>
+          <w:sz w:val="28"/>
+          <w:szCs w:val="28"/>
+        </w:rPr>
+        <w:t>.</w:t>
       </w:r>
     </w:p>
     <w:p>
@@ -228,7 +510,25 @@
           <w:sz w:val="28"/>
           <w:szCs w:val="28"/>
         </w:rPr>
-        <w:t>nyissa meg a kicsomagolt mappát (cosmoscreen)</w:t>
+        <w:t xml:space="preserve">Nyissa meg a kicsomagolt </w:t>
+      </w:r>
+      <w:r>
+        <w:rPr>
+          <w:rFonts w:ascii="Times New Roman" w:hAnsi="Times New Roman" w:cs="Times New Roman"/>
+          <w:b/>
+          <w:bCs/>
+          <w:sz w:val="28"/>
+          <w:szCs w:val="28"/>
+        </w:rPr>
+        <w:t>cosmoscreen</w:t>
+      </w:r>
+      <w:r>
+        <w:rPr>
+          <w:rFonts w:ascii="Times New Roman" w:hAnsi="Times New Roman" w:cs="Times New Roman"/>
+          <w:sz w:val="28"/>
+          <w:szCs w:val="28"/>
+        </w:rPr>
+        <w:t xml:space="preserve"> mappát.</w:t>
       </w:r>
     </w:p>
     <w:p>
@@ -249,7 +549,41 @@
           <w:sz w:val="28"/>
           <w:szCs w:val="28"/>
         </w:rPr>
-        <w:t>nyissa meg a C# mappát</w:t>
+        <w:t>N</w:t>
+      </w:r>
+      <w:r>
+        <w:rPr>
+          <w:rFonts w:ascii="Times New Roman" w:hAnsi="Times New Roman" w:cs="Times New Roman"/>
+          <w:sz w:val="28"/>
+          <w:szCs w:val="28"/>
+        </w:rPr>
+        <w:t xml:space="preserve">yissa meg a </w:t>
+      </w:r>
+      <w:r>
+        <w:rPr>
+          <w:rFonts w:ascii="Times New Roman" w:hAnsi="Times New Roman" w:cs="Times New Roman"/>
+          <w:b/>
+          <w:bCs/>
+          <w:sz w:val="28"/>
+          <w:szCs w:val="28"/>
+        </w:rPr>
+        <w:t>C#</w:t>
+      </w:r>
+      <w:r>
+        <w:rPr>
+          <w:rFonts w:ascii="Times New Roman" w:hAnsi="Times New Roman" w:cs="Times New Roman"/>
+          <w:sz w:val="28"/>
+          <w:szCs w:val="28"/>
+        </w:rPr>
+        <w:t xml:space="preserve"> mappát</w:t>
+      </w:r>
+      <w:r>
+        <w:rPr>
+          <w:rFonts w:ascii="Times New Roman" w:hAnsi="Times New Roman" w:cs="Times New Roman"/>
+          <w:sz w:val="28"/>
+          <w:szCs w:val="28"/>
+        </w:rPr>
+        <w:t>.</w:t>
       </w:r>
     </w:p>
     <w:p>
@@ -270,7 +604,41 @@
           <w:sz w:val="28"/>
           <w:szCs w:val="28"/>
         </w:rPr>
-        <w:t>nyissa meg a cosmoscreenSetup mappát</w:t>
+        <w:t>N</w:t>
+      </w:r>
+      <w:r>
+        <w:rPr>
+          <w:rFonts w:ascii="Times New Roman" w:hAnsi="Times New Roman" w:cs="Times New Roman"/>
+          <w:sz w:val="28"/>
+          <w:szCs w:val="28"/>
+        </w:rPr>
+        <w:t xml:space="preserve">yissa meg a </w:t>
+      </w:r>
+      <w:r>
+        <w:rPr>
+          <w:rFonts w:ascii="Times New Roman" w:hAnsi="Times New Roman" w:cs="Times New Roman"/>
+          <w:b/>
+          <w:bCs/>
+          <w:sz w:val="28"/>
+          <w:szCs w:val="28"/>
+        </w:rPr>
+        <w:t>cosmoscreenSetup</w:t>
+      </w:r>
+      <w:r>
+        <w:rPr>
+          <w:rFonts w:ascii="Times New Roman" w:hAnsi="Times New Roman" w:cs="Times New Roman"/>
+          <w:sz w:val="28"/>
+          <w:szCs w:val="28"/>
+        </w:rPr>
+        <w:t xml:space="preserve"> mappát</w:t>
+      </w:r>
+      <w:r>
+        <w:rPr>
+          <w:rFonts w:ascii="Times New Roman" w:hAnsi="Times New Roman" w:cs="Times New Roman"/>
+          <w:sz w:val="28"/>
+          <w:szCs w:val="28"/>
+        </w:rPr>
+        <w:t>.</w:t>
       </w:r>
     </w:p>
     <w:p>
@@ -291,7 +659,43 @@
           <w:sz w:val="28"/>
           <w:szCs w:val="28"/>
         </w:rPr>
-        <w:t>azon belül nyissa meg a debug mappát</w:t>
+        <w:t xml:space="preserve">A </w:t>
+      </w:r>
+      <w:r>
+        <w:rPr>
+          <w:rFonts w:ascii="Times New Roman" w:hAnsi="Times New Roman" w:cs="Times New Roman"/>
+          <w:b/>
+          <w:bCs/>
+          <w:sz w:val="28"/>
+          <w:szCs w:val="28"/>
+        </w:rPr>
+        <w:t>Debug</w:t>
+      </w:r>
+      <w:r>
+        <w:rPr>
+          <w:rFonts w:ascii="Times New Roman" w:hAnsi="Times New Roman" w:cs="Times New Roman"/>
+          <w:sz w:val="28"/>
+          <w:szCs w:val="28"/>
+        </w:rPr>
+        <w:t xml:space="preserve"> mappában indítsa el a </w:t>
+      </w:r>
+      <w:r>
+        <w:rPr>
+          <w:rFonts w:ascii="Times New Roman" w:hAnsi="Times New Roman" w:cs="Times New Roman"/>
+          <w:b/>
+          <w:bCs/>
+          <w:sz w:val="28"/>
+          <w:szCs w:val="28"/>
+        </w:rPr>
+        <w:t>setup.exe</w:t>
+      </w:r>
+      <w:r>
+        <w:rPr>
+          <w:rFonts w:ascii="Times New Roman" w:hAnsi="Times New Roman" w:cs="Times New Roman"/>
+          <w:sz w:val="28"/>
+          <w:szCs w:val="28"/>
+        </w:rPr>
+        <w:t xml:space="preserve"> fájlt.</w:t>
       </w:r>
     </w:p>
     <w:p>
@@ -312,47 +716,25 @@
           <w:sz w:val="28"/>
           <w:szCs w:val="28"/>
         </w:rPr>
-        <w:t xml:space="preserve">ott </w:t>
-      </w:r>
-      <w:r>
-        <w:rPr>
-          <w:rFonts w:ascii="Times New Roman" w:hAnsi="Times New Roman" w:cs="Times New Roman"/>
-          <w:sz w:val="28"/>
-          <w:szCs w:val="28"/>
-        </w:rPr>
-        <w:t>futtassa</w:t>
-      </w:r>
-      <w:r>
-        <w:rPr>
-          <w:rFonts w:ascii="Times New Roman" w:hAnsi="Times New Roman" w:cs="Times New Roman"/>
-          <w:sz w:val="28"/>
-          <w:szCs w:val="28"/>
-        </w:rPr>
-        <w:t xml:space="preserve"> </w:t>
-      </w:r>
-      <w:r>
-        <w:rPr>
-          <w:rFonts w:ascii="Times New Roman" w:hAnsi="Times New Roman" w:cs="Times New Roman"/>
-          <w:sz w:val="28"/>
-          <w:szCs w:val="28"/>
-        </w:rPr>
-        <w:t xml:space="preserve">le a setup.exe </w:t>
-      </w:r>
-      <w:r>
-        <w:rPr>
-          <w:rFonts w:ascii="Times New Roman" w:hAnsi="Times New Roman" w:cs="Times New Roman"/>
-          <w:sz w:val="28"/>
-          <w:szCs w:val="28"/>
-        </w:rPr>
-        <w:t>fájlt</w:t>
-      </w:r>
-      <w:r>
-        <w:rPr>
-          <w:rFonts w:ascii="Times New Roman" w:hAnsi="Times New Roman" w:cs="Times New Roman"/>
-          <w:sz w:val="28"/>
-          <w:szCs w:val="28"/>
-        </w:rPr>
-        <w:t>.</w:t>
+        <w:t xml:space="preserve">A telepítő ablakban minden lépésnél kattintson a </w:t>
+      </w:r>
+      <w:r>
+        <w:rPr>
+          <w:rFonts w:ascii="Times New Roman" w:hAnsi="Times New Roman" w:cs="Times New Roman"/>
+          <w:b/>
+          <w:bCs/>
+          <w:sz w:val="28"/>
+          <w:szCs w:val="28"/>
+        </w:rPr>
+        <w:t>Next</w:t>
+      </w:r>
+      <w:r>
+        <w:rPr>
+          <w:rFonts w:ascii="Times New Roman" w:hAnsi="Times New Roman" w:cs="Times New Roman"/>
+          <w:sz w:val="28"/>
+          <w:szCs w:val="28"/>
+        </w:rPr>
+        <w:t xml:space="preserve"> gombra.</w:t>
       </w:r>
     </w:p>
     <w:p>
@@ -373,34 +755,33 @@
           <w:sz w:val="28"/>
           <w:szCs w:val="28"/>
         </w:rPr>
-        <w:t>minden ablaknál nyomja meg a "next" gombot</w:t>
-      </w:r>
-    </w:p>
-    <w:p>
-      <w:pPr>
-        <w:numPr>
-          <w:ilvl w:val="0"/>
-          <w:numId w:val="1"/>
-        </w:numPr>
-        <w:rPr>
-          <w:rFonts w:ascii="Times New Roman" w:hAnsi="Times New Roman" w:cs="Times New Roman"/>
-          <w:sz w:val="28"/>
-          <w:szCs w:val="28"/>
-        </w:rPr>
-      </w:pPr>
-      <w:r>
-        <w:rPr>
-          <w:rFonts w:ascii="Times New Roman" w:hAnsi="Times New Roman" w:cs="Times New Roman"/>
-          <w:sz w:val="28"/>
-          <w:szCs w:val="28"/>
-        </w:rPr>
-        <w:t>A végső ablaknál meg a close gombot</w:t>
-      </w:r>
-    </w:p>
-    <w:p>
-      <w:pPr>
-        <w:rPr>
-          <w:rFonts w:ascii="Times New Roman" w:hAnsi="Times New Roman" w:cs="Times New Roman"/>
+        <w:t xml:space="preserve">A telepítés végén kattintson a </w:t>
+      </w:r>
+      <w:r>
+        <w:rPr>
+          <w:rFonts w:ascii="Times New Roman" w:hAnsi="Times New Roman" w:cs="Times New Roman"/>
+          <w:b/>
+          <w:bCs/>
+          <w:sz w:val="28"/>
+          <w:szCs w:val="28"/>
+        </w:rPr>
+        <w:t>Close</w:t>
+      </w:r>
+      <w:r>
+        <w:rPr>
+          <w:rFonts w:ascii="Times New Roman" w:hAnsi="Times New Roman" w:cs="Times New Roman"/>
+          <w:sz w:val="28"/>
+          <w:szCs w:val="28"/>
+        </w:rPr>
+        <w:t xml:space="preserve"> gombra.</w:t>
+      </w:r>
+    </w:p>
+    <w:p>
+      <w:pPr>
+        <w:rPr>
+          <w:rFonts w:ascii="Times New Roman" w:hAnsi="Times New Roman" w:cs="Times New Roman"/>
+          <w:b/>
+          <w:bCs/>
           <w:i/>
           <w:sz w:val="28"/>
           <w:szCs w:val="28"/>
@@ -409,15 +790,19 @@
       <w:r>
         <w:rPr>
           <w:rFonts w:ascii="Times New Roman" w:hAnsi="Times New Roman" w:cs="Times New Roman"/>
+          <w:b/>
+          <w:bCs/>
           <w:i/>
           <w:sz w:val="28"/>
           <w:szCs w:val="28"/>
         </w:rPr>
-        <w:t>Elindítása</w:t>
-      </w:r>
-      <w:r>
-        <w:rPr>
-          <w:rFonts w:ascii="Times New Roman" w:hAnsi="Times New Roman" w:cs="Times New Roman"/>
+        <w:t>A program indítása</w:t>
+      </w:r>
+      <w:r>
+        <w:rPr>
+          <w:rFonts w:ascii="Times New Roman" w:hAnsi="Times New Roman" w:cs="Times New Roman"/>
+          <w:b/>
+          <w:bCs/>
           <w:i/>
           <w:sz w:val="28"/>
           <w:szCs w:val="28"/>
@@ -443,7 +828,43 @@
           <w:sz w:val="28"/>
           <w:szCs w:val="28"/>
         </w:rPr>
-        <w:t>Az asztalon keresse meg a cosmoscreen.exe file-t</w:t>
+        <w:t xml:space="preserve">A telepítés után keresse meg az </w:t>
+      </w:r>
+      <w:r>
+        <w:rPr>
+          <w:rFonts w:ascii="Times New Roman" w:hAnsi="Times New Roman" w:cs="Times New Roman"/>
+          <w:b/>
+          <w:bCs/>
+          <w:sz w:val="28"/>
+          <w:szCs w:val="28"/>
+        </w:rPr>
+        <w:t>asztalon</w:t>
+      </w:r>
+      <w:r>
+        <w:rPr>
+          <w:rFonts w:ascii="Times New Roman" w:hAnsi="Times New Roman" w:cs="Times New Roman"/>
+          <w:sz w:val="28"/>
+          <w:szCs w:val="28"/>
+        </w:rPr>
+        <w:t xml:space="preserve"> a </w:t>
+      </w:r>
+      <w:r>
+        <w:rPr>
+          <w:rFonts w:ascii="Times New Roman" w:hAnsi="Times New Roman" w:cs="Times New Roman"/>
+          <w:b/>
+          <w:bCs/>
+          <w:sz w:val="28"/>
+          <w:szCs w:val="28"/>
+        </w:rPr>
+        <w:t>cosmoscreen.exe</w:t>
+      </w:r>
+      <w:r>
+        <w:rPr>
+          <w:rFonts w:ascii="Times New Roman" w:hAnsi="Times New Roman" w:cs="Times New Roman"/>
+          <w:sz w:val="28"/>
+          <w:szCs w:val="28"/>
+        </w:rPr>
+        <w:t xml:space="preserve"> fájlt.</w:t>
       </w:r>
     </w:p>
     <w:p>
@@ -464,15 +885,25 @@
           <w:sz w:val="28"/>
           <w:szCs w:val="28"/>
         </w:rPr>
-        <w:t>D</w:t>
-      </w:r>
-      <w:r>
-        <w:rPr>
-          <w:rFonts w:ascii="Times New Roman" w:hAnsi="Times New Roman" w:cs="Times New Roman"/>
-          <w:sz w:val="28"/>
-          <w:szCs w:val="28"/>
-        </w:rPr>
-        <w:t>upla kattintással indítsa el!</w:t>
+        <w:t xml:space="preserve">A program indításához kattintson rá </w:t>
+      </w:r>
+      <w:r>
+        <w:rPr>
+          <w:rFonts w:ascii="Times New Roman" w:hAnsi="Times New Roman" w:cs="Times New Roman"/>
+          <w:b/>
+          <w:bCs/>
+          <w:sz w:val="28"/>
+          <w:szCs w:val="28"/>
+        </w:rPr>
+        <w:t>dupla kattintással</w:t>
+      </w:r>
+      <w:r>
+        <w:rPr>
+          <w:rFonts w:ascii="Times New Roman" w:hAnsi="Times New Roman" w:cs="Times New Roman"/>
+          <w:sz w:val="28"/>
+          <w:szCs w:val="28"/>
+        </w:rPr>
+        <w:t>.</w:t>
       </w:r>
     </w:p>
     <w:p>
@@ -578,7 +1009,7 @@
                     </pic:cNvPicPr>
                   </pic:nvPicPr>
                   <pic:blipFill>
-                    <a:blip r:embed="rId5">
+                    <a:blip r:embed="rId8">
                       <a:extLst>
                         <a:ext uri="{28A0092B-C50C-407E-A947-70E740481C1C}">
                           <a14:useLocalDpi xmlns:a14="http://schemas.microsoft.com/office/drawing/2010/main" val="0"/>
@@ -648,7 +1079,7 @@
                     </pic:cNvPicPr>
                   </pic:nvPicPr>
                   <pic:blipFill>
-                    <a:blip r:embed="rId6">
+                    <a:blip r:embed="rId9">
                       <a:extLst>
                         <a:ext uri="{28A0092B-C50C-407E-A947-70E740481C1C}">
                           <a14:useLocalDpi xmlns:a14="http://schemas.microsoft.com/office/drawing/2010/main" val="0"/>
@@ -737,7 +1168,7 @@
                     <pic:cNvPicPr/>
                   </pic:nvPicPr>
                   <pic:blipFill>
-                    <a:blip r:embed="rId7">
+                    <a:blip r:embed="rId10">
                       <a:extLst>
                         <a:ext uri="{28A0092B-C50C-407E-A947-70E740481C1C}">
                           <a14:useLocalDpi xmlns:a14="http://schemas.microsoft.com/office/drawing/2010/main" val="0"/>
@@ -867,7 +1298,7 @@
                     <pic:cNvPicPr/>
                   </pic:nvPicPr>
                   <pic:blipFill>
-                    <a:blip r:embed="rId8">
+                    <a:blip r:embed="rId11">
                       <a:extLst>
                         <a:ext uri="{28A0092B-C50C-407E-A947-70E740481C1C}">
                           <a14:useLocalDpi xmlns:a14="http://schemas.microsoft.com/office/drawing/2010/main" val="0"/>
@@ -950,8 +1381,6 @@
         </w:rPr>
         <w:t>.</w:t>
       </w:r>
-      <w:bookmarkStart w:id="0" w:name="_GoBack"/>
-      <w:bookmarkEnd w:id="0"/>
     </w:p>
     <w:p>
       <w:pPr>
@@ -1036,7 +1465,7 @@
                     <pic:cNvPicPr/>
                   </pic:nvPicPr>
                   <pic:blipFill>
-                    <a:blip r:embed="rId9">
+                    <a:blip r:embed="rId12">
                       <a:extLst>
                         <a:ext uri="{28A0092B-C50C-407E-A947-70E740481C1C}">
                           <a14:useLocalDpi xmlns:a14="http://schemas.microsoft.com/office/drawing/2010/main" val="0"/>
@@ -1116,41 +1545,14 @@
           <w:szCs w:val="32"/>
         </w:rPr>
         <w:lastRenderedPageBreak/>
-        <w:t>Ha kiválasztunik egy adatsort akkor annak a sornak az adatai megjelennek a táblázat mellett megtalálható beviteli mezőkben. Az oldal alján található három gomb amelyekkel különböző műveleteket lehet végrehajtani.</w:t>
-      </w:r>
-      <w:r>
-        <w:rPr>
-          <w:rFonts w:ascii="Times New Roman" w:hAnsi="Times New Roman" w:cs="Times New Roman"/>
-          <w:noProof/>
-          <w:sz w:val="32"/>
-          <w:szCs w:val="32"/>
-        </w:rPr>
-        <w:t xml:space="preserve">Az adatbeviteli mezőket tudjuk sajátkezűleg és adatsor kiválasztásával feltölteni. A felvétel gomb megnyomásakor a beviteli mezőkben lévő adatot új elemként felvesszük az adatbázisba és azon nyomban megjelenítjük a táblázatban.A módosítás gomb csak akkor válik elérhetővé </w:t>
-      </w:r>
-      <w:r>
-        <w:rPr>
-          <w:rFonts w:ascii="Times New Roman" w:hAnsi="Times New Roman" w:cs="Times New Roman"/>
-          <w:noProof/>
-          <w:sz w:val="32"/>
-          <w:szCs w:val="32"/>
-        </w:rPr>
-        <w:t>ha kiválasztottunk egy adatsort és megnyomásával módosítjuk a kiválasztott elem adatát az adatbázisban. A törlés gomb csak akkor válik elérhetővé ha kiválasztottunk egy adatsort és megnyomásával töröljük a kiválasztott elemet az adatbázisból.</w:t>
-      </w:r>
-      <w:r>
-        <w:rPr>
-          <w:rFonts w:ascii="Times New Roman" w:hAnsi="Times New Roman" w:cs="Times New Roman"/>
-          <w:noProof/>
-          <w:sz w:val="32"/>
-          <w:szCs w:val="32"/>
-        </w:rPr>
         <w:drawing>
-          <wp:anchor distT="0" distB="0" distL="114300" distR="114300" simplePos="0" relativeHeight="251671552" behindDoc="0" locked="0" layoutInCell="1" allowOverlap="1" wp14:anchorId="7E11C3F1" wp14:editId="6E2F77C5">
+          <wp:anchor distT="0" distB="0" distL="114300" distR="114300" simplePos="0" relativeHeight="251671552" behindDoc="0" locked="0" layoutInCell="1" allowOverlap="1" wp14:anchorId="7E11C3F1" wp14:editId="587D9417">
             <wp:simplePos x="0" y="0"/>
             <wp:positionH relativeFrom="column">
               <wp:posOffset>-4445</wp:posOffset>
             </wp:positionH>
             <wp:positionV relativeFrom="paragraph">
-              <wp:posOffset>3024505</wp:posOffset>
+              <wp:posOffset>3159125</wp:posOffset>
             </wp:positionV>
             <wp:extent cx="5760720" cy="5165090"/>
             <wp:effectExtent l="0" t="0" r="0" b="0"/>
@@ -1167,7 +1569,7 @@
                     <pic:cNvPicPr/>
                   </pic:nvPicPr>
                   <pic:blipFill>
-                    <a:blip r:embed="rId10">
+                    <a:blip r:embed="rId13">
                       <a:extLst>
                         <a:ext uri="{28A0092B-C50C-407E-A947-70E740481C1C}">
                           <a14:useLocalDpi xmlns:a14="http://schemas.microsoft.com/office/drawing/2010/main" val="0"/>
@@ -1193,6 +1595,54 @@
           </wp:anchor>
         </w:drawing>
       </w:r>
+      <w:r>
+        <w:rPr>
+          <w:rFonts w:ascii="Times New Roman" w:hAnsi="Times New Roman" w:cs="Times New Roman"/>
+          <w:noProof/>
+          <w:sz w:val="32"/>
+          <w:szCs w:val="32"/>
+        </w:rPr>
+        <w:t>Ha kiválasztunik egy adatsort akkor annak a sornak az adatai megjelennek a táblázat mellett megtalálható beviteli mezőkben.</w:t>
+      </w:r>
+    </w:p>
+    <w:p>
+      <w:pPr>
+        <w:spacing w:after="0"/>
+        <w:jc w:val="both"/>
+        <w:rPr>
+          <w:rFonts w:ascii="Times New Roman" w:hAnsi="Times New Roman" w:cs="Times New Roman"/>
+          <w:noProof/>
+          <w:sz w:val="32"/>
+          <w:szCs w:val="32"/>
+        </w:rPr>
+      </w:pPr>
+      <w:r>
+        <w:rPr>
+          <w:rFonts w:ascii="Times New Roman" w:hAnsi="Times New Roman" w:cs="Times New Roman"/>
+          <w:noProof/>
+          <w:sz w:val="32"/>
+          <w:szCs w:val="32"/>
+        </w:rPr>
+        <w:t>Az oldal alján található három gomb amelyekkel különböző műveleteket lehet végrehajtani.</w:t>
+      </w:r>
+      <w:r>
+        <w:rPr>
+          <w:rFonts w:ascii="Times New Roman" w:hAnsi="Times New Roman" w:cs="Times New Roman"/>
+          <w:noProof/>
+          <w:sz w:val="32"/>
+          <w:szCs w:val="32"/>
+        </w:rPr>
+        <w:t xml:space="preserve">Az adatbeviteli mezőket tudjuk sajátkezűleg és adatsor kiválasztásával feltölteni. A felvétel gomb megnyomásakor a beviteli mezőkben lévő adatot új elemként felvesszük az adatbázisba és azon nyomban megjelenítjük a táblázatban.A módosítás gomb csak akkor válik elérhetővé </w:t>
+      </w:r>
+      <w:r>
+        <w:rPr>
+          <w:rFonts w:ascii="Times New Roman" w:hAnsi="Times New Roman" w:cs="Times New Roman"/>
+          <w:noProof/>
+          <w:sz w:val="32"/>
+          <w:szCs w:val="32"/>
+        </w:rPr>
+        <w:t>ha kiválasztottunk egy adatsort és megnyomásával módosítjuk a kiválasztott elem adatát az adatbázisban. A törlés gomb csak akkor válik elérhetővé ha kiválasztottunk egy adatsort és megnyomásával töröljük a kiválasztott elemet az adatbázisból.</w:t>
+      </w:r>
     </w:p>
     <w:p>
       <w:pPr>
@@ -1228,19 +1678,49 @@
       <w:r>
         <w:rPr>
           <w:rFonts w:ascii="Times New Roman" w:hAnsi="Times New Roman" w:cs="Times New Roman"/>
-          <w:noProof/>
           <w:sz w:val="40"/>
           <w:szCs w:val="40"/>
+          <w:u w:val="single"/>
         </w:rPr>
         <w:lastRenderedPageBreak/>
+        <w:t>B</w:t>
+      </w:r>
+      <w:r>
+        <w:rPr>
+          <w:rFonts w:ascii="Times New Roman" w:hAnsi="Times New Roman" w:cs="Times New Roman"/>
+          <w:sz w:val="40"/>
+          <w:szCs w:val="40"/>
+          <w:u w:val="single"/>
+        </w:rPr>
+        <w:t>üfé</w:t>
+      </w:r>
+    </w:p>
+    <w:p>
+      <w:pPr>
+        <w:spacing w:before="120" w:after="0"/>
+        <w:jc w:val="both"/>
+        <w:rPr>
+          <w:rFonts w:ascii="Times New Roman" w:hAnsi="Times New Roman" w:cs="Times New Roman"/>
+          <w:noProof/>
+          <w:sz w:val="32"/>
+          <w:szCs w:val="32"/>
+        </w:rPr>
+      </w:pPr>
+      <w:r>
+        <w:rPr>
+          <w:rFonts w:ascii="Times New Roman" w:hAnsi="Times New Roman" w:cs="Times New Roman"/>
+          <w:noProof/>
+          <w:sz w:val="40"/>
+          <w:szCs w:val="40"/>
+        </w:rPr>
         <w:drawing>
-          <wp:anchor distT="0" distB="0" distL="114300" distR="114300" simplePos="0" relativeHeight="251672576" behindDoc="0" locked="0" layoutInCell="1" allowOverlap="1" wp14:anchorId="64F75278" wp14:editId="43A4F347">
+          <wp:anchor distT="0" distB="0" distL="114300" distR="114300" simplePos="0" relativeHeight="251672576" behindDoc="0" locked="0" layoutInCell="1" allowOverlap="1" wp14:anchorId="64F75278" wp14:editId="15D258EB">
             <wp:simplePos x="0" y="0"/>
             <wp:positionH relativeFrom="margin">
-              <wp:posOffset>157480</wp:posOffset>
+              <wp:posOffset>207645</wp:posOffset>
             </wp:positionH>
             <wp:positionV relativeFrom="paragraph">
-              <wp:posOffset>347980</wp:posOffset>
+              <wp:posOffset>968285</wp:posOffset>
             </wp:positionV>
             <wp:extent cx="5400675" cy="4147185"/>
             <wp:effectExtent l="0" t="0" r="9525" b="5715"/>
@@ -1257,7 +1737,7 @@
                     <pic:cNvPicPr/>
                   </pic:nvPicPr>
                   <pic:blipFill>
-                    <a:blip r:embed="rId11">
+                    <a:blip r:embed="rId14">
                       <a:extLst>
                         <a:ext uri="{28A0092B-C50C-407E-A947-70E740481C1C}">
                           <a14:useLocalDpi xmlns:a14="http://schemas.microsoft.com/office/drawing/2010/main" val="0"/>
@@ -1293,20 +1773,80 @@
         <w:rPr>
           <w:rFonts w:ascii="Times New Roman" w:hAnsi="Times New Roman" w:cs="Times New Roman"/>
           <w:noProof/>
+          <w:sz w:val="32"/>
+          <w:szCs w:val="32"/>
+        </w:rPr>
+        <w:t xml:space="preserve">Miután kiválasztottuk a </w:t>
+      </w:r>
+      <w:r>
+        <w:rPr>
+          <w:rFonts w:ascii="Times New Roman" w:hAnsi="Times New Roman" w:cs="Times New Roman"/>
+          <w:b/>
+          <w:bCs/>
+          <w:noProof/>
+          <w:sz w:val="32"/>
+          <w:szCs w:val="32"/>
+        </w:rPr>
+        <w:t>Büfé</w:t>
+      </w:r>
+      <w:r>
+        <w:rPr>
+          <w:rFonts w:ascii="Times New Roman" w:hAnsi="Times New Roman" w:cs="Times New Roman"/>
+          <w:noProof/>
+          <w:sz w:val="32"/>
+          <w:szCs w:val="32"/>
+        </w:rPr>
+        <w:t xml:space="preserve"> menüpontot, az oldalra fog minket az alkalmazás navigálni. Itt autómatikusan betültődnek az adatok egy táblázatba.</w:t>
+      </w:r>
+    </w:p>
+    <w:p>
+      <w:pPr>
+        <w:rPr>
+          <w:rFonts w:ascii="Times New Roman" w:hAnsi="Times New Roman" w:cs="Times New Roman"/>
           <w:sz w:val="40"/>
           <w:szCs w:val="40"/>
-        </w:rPr>
+          <w:u w:val="single"/>
+        </w:rPr>
+      </w:pPr>
+      <w:r>
+        <w:rPr>
+          <w:rFonts w:ascii="Times New Roman" w:hAnsi="Times New Roman" w:cs="Times New Roman"/>
+          <w:sz w:val="40"/>
+          <w:szCs w:val="40"/>
+          <w:u w:val="single"/>
+        </w:rPr>
+        <w:br w:type="page"/>
+      </w:r>
+    </w:p>
+    <w:p>
+      <w:pPr>
+        <w:spacing w:after="600"/>
+        <w:jc w:val="both"/>
+        <w:rPr>
+          <w:rFonts w:ascii="Times New Roman" w:hAnsi="Times New Roman" w:cs="Times New Roman"/>
+          <w:sz w:val="32"/>
+          <w:szCs w:val="32"/>
+        </w:rPr>
+      </w:pPr>
+      <w:r>
+        <w:rPr>
+          <w:rFonts w:ascii="Times New Roman" w:hAnsi="Times New Roman" w:cs="Times New Roman"/>
+          <w:noProof/>
+          <w:sz w:val="40"/>
+          <w:szCs w:val="40"/>
+        </w:rPr>
+        <w:lastRenderedPageBreak/>
         <w:drawing>
-          <wp:anchor distT="0" distB="0" distL="114300" distR="114300" simplePos="0" relativeHeight="251673600" behindDoc="0" locked="0" layoutInCell="1" allowOverlap="1" wp14:anchorId="75CDA637" wp14:editId="2E00A376">
+          <wp:anchor distT="0" distB="0" distL="114300" distR="114300" simplePos="0" relativeHeight="251679744" behindDoc="0" locked="0" layoutInCell="1" allowOverlap="1" wp14:anchorId="79CA152D" wp14:editId="3121760D">
             <wp:simplePos x="0" y="0"/>
             <wp:positionH relativeFrom="margin">
-              <wp:align>center</wp:align>
+              <wp:posOffset>-68580</wp:posOffset>
             </wp:positionH>
             <wp:positionV relativeFrom="paragraph">
-              <wp:posOffset>4748530</wp:posOffset>
+              <wp:posOffset>714227</wp:posOffset>
             </wp:positionV>
-            <wp:extent cx="5353050" cy="4123055"/>
-            <wp:effectExtent l="0" t="0" r="0" b="0"/>
+            <wp:extent cx="5788660" cy="4458970"/>
+            <wp:effectExtent l="0" t="0" r="2540" b="0"/>
             <wp:wrapTopAndBottom/>
             <wp:docPr id="16" name="Kép 16"/>
             <wp:cNvGraphicFramePr>
@@ -1317,280 +1857,6 @@
                 <pic:pic xmlns:pic="http://schemas.openxmlformats.org/drawingml/2006/picture">
                   <pic:nvPicPr>
                     <pic:cNvPr id="16" name="bufe2.PNG"/>
-                    <pic:cNvPicPr/>
-                  </pic:nvPicPr>
-                  <pic:blipFill>
-                    <a:blip r:embed="rId12">
-                      <a:extLst>
-                        <a:ext uri="{28A0092B-C50C-407E-A947-70E740481C1C}">
-                          <a14:useLocalDpi xmlns:a14="http://schemas.microsoft.com/office/drawing/2010/main" val="0"/>
-                        </a:ext>
-                      </a:extLst>
-                    </a:blip>
-                    <a:stretch>
-                      <a:fillRect/>
-                    </a:stretch>
-                  </pic:blipFill>
-                  <pic:spPr>
-                    <a:xfrm>
-                      <a:off x="0" y="0"/>
-                      <a:ext cx="5353050" cy="4123055"/>
-                    </a:xfrm>
-                    <a:prstGeom prst="rect">
-                      <a:avLst/>
-                    </a:prstGeom>
-                  </pic:spPr>
-                </pic:pic>
-              </a:graphicData>
-            </a:graphic>
-            <wp14:sizeRelH relativeFrom="margin">
-              <wp14:pctWidth>0</wp14:pctWidth>
-            </wp14:sizeRelH>
-            <wp14:sizeRelV relativeFrom="margin">
-              <wp14:pctHeight>0</wp14:pctHeight>
-            </wp14:sizeRelV>
-          </wp:anchor>
-        </w:drawing>
-      </w:r>
-      <w:r>
-        <w:rPr>
-          <w:rFonts w:ascii="Times New Roman" w:hAnsi="Times New Roman" w:cs="Times New Roman"/>
-          <w:sz w:val="40"/>
-          <w:szCs w:val="40"/>
-          <w:u w:val="single"/>
-        </w:rPr>
-        <w:t>B</w:t>
-      </w:r>
-      <w:r>
-        <w:rPr>
-          <w:rFonts w:ascii="Times New Roman" w:hAnsi="Times New Roman" w:cs="Times New Roman"/>
-          <w:sz w:val="40"/>
-          <w:szCs w:val="40"/>
-          <w:u w:val="single"/>
-        </w:rPr>
-        <w:t>üfé</w:t>
-      </w:r>
-    </w:p>
-    <w:p>
-      <w:pPr>
-        <w:jc w:val="center"/>
-        <w:rPr>
-          <w:rFonts w:ascii="Times New Roman" w:hAnsi="Times New Roman" w:cs="Times New Roman"/>
-          <w:sz w:val="40"/>
-          <w:szCs w:val="40"/>
-          <w:u w:val="single"/>
-        </w:rPr>
-      </w:pPr>
-      <w:r>
-        <w:rPr>
-          <w:rFonts w:ascii="Times New Roman" w:hAnsi="Times New Roman" w:cs="Times New Roman"/>
-          <w:sz w:val="40"/>
-          <w:szCs w:val="40"/>
-          <w:u w:val="single"/>
-        </w:rPr>
-        <w:lastRenderedPageBreak/>
-        <w:t>S</w:t>
-      </w:r>
-      <w:r>
-        <w:rPr>
-          <w:rFonts w:ascii="Times New Roman" w:hAnsi="Times New Roman" w:cs="Times New Roman"/>
-          <w:sz w:val="40"/>
-          <w:szCs w:val="40"/>
-          <w:u w:val="single"/>
-        </w:rPr>
-        <w:t>zínészek</w:t>
-      </w:r>
-    </w:p>
-    <w:p>
-      <w:pPr>
-        <w:jc w:val="center"/>
-        <w:rPr>
-          <w:rFonts w:ascii="Times New Roman" w:hAnsi="Times New Roman" w:cs="Times New Roman"/>
-          <w:sz w:val="40"/>
-          <w:szCs w:val="40"/>
-          <w:u w:val="single"/>
-        </w:rPr>
-      </w:pPr>
-      <w:r>
-        <w:rPr>
-          <w:rFonts w:ascii="Times New Roman" w:hAnsi="Times New Roman" w:cs="Times New Roman"/>
-          <w:noProof/>
-          <w:sz w:val="40"/>
-          <w:szCs w:val="40"/>
-          <w:u w:val="single"/>
-        </w:rPr>
-        <w:drawing>
-          <wp:anchor distT="0" distB="0" distL="114300" distR="114300" simplePos="0" relativeHeight="251677696" behindDoc="0" locked="0" layoutInCell="1" allowOverlap="1" wp14:anchorId="12B7675E" wp14:editId="332684AB">
-            <wp:simplePos x="0" y="0"/>
-            <wp:positionH relativeFrom="margin">
-              <wp:align>left</wp:align>
-            </wp:positionH>
-            <wp:positionV relativeFrom="paragraph">
-              <wp:posOffset>4179570</wp:posOffset>
-            </wp:positionV>
-            <wp:extent cx="5801995" cy="3876675"/>
-            <wp:effectExtent l="0" t="0" r="8255" b="9525"/>
-            <wp:wrapTopAndBottom/>
-            <wp:docPr id="18" name="Kép 18"/>
-            <wp:cNvGraphicFramePr>
-              <a:graphicFrameLocks xmlns:a="http://schemas.openxmlformats.org/drawingml/2006/main" noChangeAspect="1"/>
-            </wp:cNvGraphicFramePr>
-            <a:graphic xmlns:a="http://schemas.openxmlformats.org/drawingml/2006/main">
-              <a:graphicData uri="http://schemas.openxmlformats.org/drawingml/2006/picture">
-                <pic:pic xmlns:pic="http://schemas.openxmlformats.org/drawingml/2006/picture">
-                  <pic:nvPicPr>
-                    <pic:cNvPr id="18" name="szineszek2.PNG"/>
-                    <pic:cNvPicPr/>
-                  </pic:nvPicPr>
-                  <pic:blipFill>
-                    <a:blip r:embed="rId13">
-                      <a:extLst>
-                        <a:ext uri="{28A0092B-C50C-407E-A947-70E740481C1C}">
-                          <a14:useLocalDpi xmlns:a14="http://schemas.microsoft.com/office/drawing/2010/main" val="0"/>
-                        </a:ext>
-                      </a:extLst>
-                    </a:blip>
-                    <a:stretch>
-                      <a:fillRect/>
-                    </a:stretch>
-                  </pic:blipFill>
-                  <pic:spPr>
-                    <a:xfrm>
-                      <a:off x="0" y="0"/>
-                      <a:ext cx="5801995" cy="3876675"/>
-                    </a:xfrm>
-                    <a:prstGeom prst="rect">
-                      <a:avLst/>
-                    </a:prstGeom>
-                  </pic:spPr>
-                </pic:pic>
-              </a:graphicData>
-            </a:graphic>
-            <wp14:sizeRelH relativeFrom="margin">
-              <wp14:pctWidth>0</wp14:pctWidth>
-            </wp14:sizeRelH>
-            <wp14:sizeRelV relativeFrom="margin">
-              <wp14:pctHeight>0</wp14:pctHeight>
-            </wp14:sizeRelV>
-          </wp:anchor>
-        </w:drawing>
-      </w:r>
-      <w:r>
-        <w:rPr>
-          <w:rFonts w:ascii="Times New Roman" w:hAnsi="Times New Roman" w:cs="Times New Roman"/>
-          <w:noProof/>
-          <w:sz w:val="40"/>
-          <w:szCs w:val="40"/>
-          <w:u w:val="single"/>
-        </w:rPr>
-        <w:drawing>
-          <wp:anchor distT="0" distB="0" distL="114300" distR="114300" simplePos="0" relativeHeight="251676672" behindDoc="0" locked="0" layoutInCell="1" allowOverlap="1" wp14:anchorId="2A0A74AF" wp14:editId="41BEA26C">
-            <wp:simplePos x="0" y="0"/>
-            <wp:positionH relativeFrom="column">
-              <wp:posOffset>-4445</wp:posOffset>
-            </wp:positionH>
-            <wp:positionV relativeFrom="paragraph">
-              <wp:posOffset>-1905</wp:posOffset>
-            </wp:positionV>
-            <wp:extent cx="5760720" cy="3842385"/>
-            <wp:effectExtent l="0" t="0" r="0" b="5715"/>
-            <wp:wrapTopAndBottom/>
-            <wp:docPr id="17" name="Kép 17"/>
-            <wp:cNvGraphicFramePr>
-              <a:graphicFrameLocks xmlns:a="http://schemas.openxmlformats.org/drawingml/2006/main" noChangeAspect="1"/>
-            </wp:cNvGraphicFramePr>
-            <a:graphic xmlns:a="http://schemas.openxmlformats.org/drawingml/2006/main">
-              <a:graphicData uri="http://schemas.openxmlformats.org/drawingml/2006/picture">
-                <pic:pic xmlns:pic="http://schemas.openxmlformats.org/drawingml/2006/picture">
-                  <pic:nvPicPr>
-                    <pic:cNvPr id="17" name="szineszek.PNG"/>
-                    <pic:cNvPicPr/>
-                  </pic:nvPicPr>
-                  <pic:blipFill>
-                    <a:blip r:embed="rId14">
-                      <a:extLst>
-                        <a:ext uri="{28A0092B-C50C-407E-A947-70E740481C1C}">
-                          <a14:useLocalDpi xmlns:a14="http://schemas.microsoft.com/office/drawing/2010/main" val="0"/>
-                        </a:ext>
-                      </a:extLst>
-                    </a:blip>
-                    <a:stretch>
-                      <a:fillRect/>
-                    </a:stretch>
-                  </pic:blipFill>
-                  <pic:spPr>
-                    <a:xfrm>
-                      <a:off x="0" y="0"/>
-                      <a:ext cx="5760720" cy="3842385"/>
-                    </a:xfrm>
-                    <a:prstGeom prst="rect">
-                      <a:avLst/>
-                    </a:prstGeom>
-                  </pic:spPr>
-                </pic:pic>
-              </a:graphicData>
-            </a:graphic>
-          </wp:anchor>
-        </w:drawing>
-      </w:r>
-    </w:p>
-    <w:p>
-      <w:pPr>
-        <w:rPr>
-          <w:rFonts w:ascii="Times New Roman" w:hAnsi="Times New Roman" w:cs="Times New Roman"/>
-          <w:sz w:val="40"/>
-          <w:szCs w:val="40"/>
-        </w:rPr>
-      </w:pPr>
-      <w:r>
-        <w:rPr>
-          <w:rFonts w:ascii="Times New Roman" w:hAnsi="Times New Roman" w:cs="Times New Roman"/>
-          <w:sz w:val="40"/>
-          <w:szCs w:val="40"/>
-        </w:rPr>
-        <w:br w:type="page"/>
-      </w:r>
-    </w:p>
-    <w:p>
-      <w:pPr>
-        <w:jc w:val="center"/>
-        <w:rPr>
-          <w:rFonts w:ascii="Times New Roman" w:hAnsi="Times New Roman" w:cs="Times New Roman"/>
-          <w:sz w:val="40"/>
-          <w:szCs w:val="40"/>
-          <w:u w:val="single"/>
-        </w:rPr>
-      </w:pPr>
-      <w:r>
-        <w:rPr>
-          <w:rFonts w:ascii="Times New Roman" w:hAnsi="Times New Roman" w:cs="Times New Roman"/>
-          <w:noProof/>
-          <w:sz w:val="40"/>
-          <w:szCs w:val="40"/>
-          <w:u w:val="single"/>
-        </w:rPr>
-        <w:lastRenderedPageBreak/>
-        <w:drawing>
-          <wp:anchor distT="0" distB="0" distL="114300" distR="114300" simplePos="0" relativeHeight="251675648" behindDoc="0" locked="0" layoutInCell="1" allowOverlap="1" wp14:anchorId="309580AB" wp14:editId="581B114D">
-            <wp:simplePos x="0" y="0"/>
-            <wp:positionH relativeFrom="margin">
-              <wp:align>left</wp:align>
-            </wp:positionH>
-            <wp:positionV relativeFrom="paragraph">
-              <wp:posOffset>414020</wp:posOffset>
-            </wp:positionV>
-            <wp:extent cx="5996305" cy="3990975"/>
-            <wp:effectExtent l="0" t="0" r="4445" b="9525"/>
-            <wp:wrapTopAndBottom/>
-            <wp:docPr id="19" name="Kép 19"/>
-            <wp:cNvGraphicFramePr>
-              <a:graphicFrameLocks xmlns:a="http://schemas.openxmlformats.org/drawingml/2006/main" noChangeAspect="1"/>
-            </wp:cNvGraphicFramePr>
-            <a:graphic xmlns:a="http://schemas.openxmlformats.org/drawingml/2006/main">
-              <a:graphicData uri="http://schemas.openxmlformats.org/drawingml/2006/picture">
-                <pic:pic xmlns:pic="http://schemas.openxmlformats.org/drawingml/2006/picture">
-                  <pic:nvPicPr>
-                    <pic:cNvPr id="19" name="felhasznalok.PNG"/>
                     <pic:cNvPicPr/>
                   </pic:nvPicPr>
                   <pic:blipFill>
@@ -1608,7 +1874,7 @@
                   <pic:spPr>
                     <a:xfrm>
                       <a:off x="0" y="0"/>
-                      <a:ext cx="5996305" cy="3990975"/>
+                      <a:ext cx="5788660" cy="4458970"/>
                     </a:xfrm>
                     <a:prstGeom prst="rect">
                       <a:avLst/>
@@ -1629,12 +1895,58 @@
       <w:r>
         <w:rPr>
           <w:rFonts w:ascii="Times New Roman" w:hAnsi="Times New Roman" w:cs="Times New Roman"/>
+          <w:sz w:val="32"/>
+          <w:szCs w:val="32"/>
+        </w:rPr>
+        <w:t>Ha kiválasztunk egy adatsort akkor a hozzá tartozó adatok megjelennek az oldal bal részén látható beviteli mezőkbe.</w:t>
+      </w:r>
+    </w:p>
+    <w:p>
+      <w:pPr>
+        <w:spacing w:before="720"/>
+        <w:jc w:val="both"/>
+        <w:rPr>
+          <w:rFonts w:ascii="Times New Roman" w:hAnsi="Times New Roman" w:cs="Times New Roman"/>
+          <w:sz w:val="32"/>
+          <w:szCs w:val="32"/>
+        </w:rPr>
+      </w:pPr>
+      <w:r>
+        <w:rPr>
+          <w:rFonts w:ascii="Times New Roman" w:hAnsi="Times New Roman" w:cs="Times New Roman"/>
+          <w:sz w:val="32"/>
+          <w:szCs w:val="32"/>
+        </w:rPr>
+        <w:t>Az oldal alján láthatunk három gombot, ezeknek a gomboknak a funkcionalitása ugyan azon az elven működik, mint amit leírtunk a dokumentáció 5. oldalán.</w:t>
+      </w:r>
+    </w:p>
+    <w:p>
+      <w:pPr>
+        <w:rPr>
+          <w:rFonts w:ascii="Times New Roman" w:hAnsi="Times New Roman" w:cs="Times New Roman"/>
+          <w:sz w:val="32"/>
+          <w:szCs w:val="32"/>
+        </w:rPr>
+      </w:pPr>
+      <w:r>
+        <w:rPr>
+          <w:rFonts w:ascii="Times New Roman" w:hAnsi="Times New Roman" w:cs="Times New Roman"/>
+          <w:sz w:val="32"/>
+          <w:szCs w:val="32"/>
+        </w:rPr>
+        <w:br w:type="page"/>
+      </w:r>
+    </w:p>
+    <w:p>
+      <w:pPr>
+        <w:jc w:val="center"/>
+        <w:rPr>
+          <w:rFonts w:ascii="Times New Roman" w:hAnsi="Times New Roman" w:cs="Times New Roman"/>
           <w:sz w:val="40"/>
           <w:szCs w:val="40"/>
           <w:u w:val="single"/>
         </w:rPr>
-        <w:t>F</w:t>
-      </w:r>
+      </w:pPr>
       <w:r>
         <w:rPr>
           <w:rFonts w:ascii="Times New Roman" w:hAnsi="Times New Roman" w:cs="Times New Roman"/>
@@ -1642,17 +1954,27 @@
           <w:szCs w:val="40"/>
           <w:u w:val="single"/>
         </w:rPr>
-        <w:t>elhasználók</w:t>
-      </w:r>
-    </w:p>
-    <w:p>
-      <w:pPr>
+        <w:lastRenderedPageBreak/>
+        <w:t>S</w:t>
+      </w:r>
+      <w:r>
         <w:rPr>
           <w:rFonts w:ascii="Times New Roman" w:hAnsi="Times New Roman" w:cs="Times New Roman"/>
           <w:sz w:val="40"/>
           <w:szCs w:val="40"/>
           <w:u w:val="single"/>
         </w:rPr>
+        <w:t>zínészek</w:t>
+      </w:r>
+    </w:p>
+    <w:p>
+      <w:pPr>
+        <w:jc w:val="both"/>
+        <w:rPr>
+          <w:rFonts w:ascii="Times New Roman" w:hAnsi="Times New Roman" w:cs="Times New Roman"/>
+          <w:sz w:val="32"/>
+          <w:szCs w:val="32"/>
+        </w:rPr>
       </w:pPr>
       <w:r>
         <w:rPr>
@@ -1663,18 +1985,18 @@
           <w:u w:val="single"/>
         </w:rPr>
         <w:drawing>
-          <wp:anchor distT="0" distB="0" distL="114300" distR="114300" simplePos="0" relativeHeight="251674624" behindDoc="0" locked="0" layoutInCell="1" allowOverlap="1" wp14:anchorId="4DEF688B" wp14:editId="7EDA493B">
+          <wp:anchor distT="0" distB="0" distL="114300" distR="114300" simplePos="0" relativeHeight="251676672" behindDoc="0" locked="0" layoutInCell="1" allowOverlap="1" wp14:anchorId="2A0A74AF" wp14:editId="22B6CE2B">
             <wp:simplePos x="0" y="0"/>
-            <wp:positionH relativeFrom="margin">
-              <wp:align>left</wp:align>
+            <wp:positionH relativeFrom="column">
+              <wp:posOffset>-251578</wp:posOffset>
             </wp:positionH>
             <wp:positionV relativeFrom="paragraph">
-              <wp:posOffset>4331335</wp:posOffset>
+              <wp:posOffset>1203044</wp:posOffset>
             </wp:positionV>
-            <wp:extent cx="6024880" cy="4010025"/>
-            <wp:effectExtent l="0" t="0" r="0" b="9525"/>
+            <wp:extent cx="6424295" cy="4284345"/>
+            <wp:effectExtent l="0" t="0" r="0" b="1905"/>
             <wp:wrapTopAndBottom/>
-            <wp:docPr id="20" name="Kép 20"/>
+            <wp:docPr id="17" name="Kép 17"/>
             <wp:cNvGraphicFramePr>
               <a:graphicFrameLocks xmlns:a="http://schemas.openxmlformats.org/drawingml/2006/main" noChangeAspect="1"/>
             </wp:cNvGraphicFramePr>
@@ -1682,7 +2004,7 @@
               <a:graphicData uri="http://schemas.openxmlformats.org/drawingml/2006/picture">
                 <pic:pic xmlns:pic="http://schemas.openxmlformats.org/drawingml/2006/picture">
                   <pic:nvPicPr>
-                    <pic:cNvPr id="20" name="felhasznalok2.PNG"/>
+                    <pic:cNvPr id="17" name="szineszek.PNG"/>
                     <pic:cNvPicPr/>
                   </pic:nvPicPr>
                   <pic:blipFill>
@@ -1700,7 +2022,7 @@
                   <pic:spPr>
                     <a:xfrm>
                       <a:off x="0" y="0"/>
-                      <a:ext cx="6024880" cy="4010025"/>
+                      <a:ext cx="6424295" cy="4284345"/>
                     </a:xfrm>
                     <a:prstGeom prst="rect">
                       <a:avLst/>
@@ -1718,6 +2040,424 @@
           </wp:anchor>
         </w:drawing>
       </w:r>
+      <w:r>
+        <w:rPr>
+          <w:rFonts w:ascii="Times New Roman" w:hAnsi="Times New Roman" w:cs="Times New Roman"/>
+          <w:sz w:val="32"/>
+          <w:szCs w:val="32"/>
+        </w:rPr>
+        <w:t xml:space="preserve">Ha átnavigálunk a </w:t>
+      </w:r>
+      <w:r>
+        <w:rPr>
+          <w:rFonts w:ascii="Times New Roman" w:hAnsi="Times New Roman" w:cs="Times New Roman"/>
+          <w:b/>
+          <w:bCs/>
+          <w:sz w:val="32"/>
+          <w:szCs w:val="32"/>
+        </w:rPr>
+        <w:t>Színészek</w:t>
+      </w:r>
+      <w:r>
+        <w:rPr>
+          <w:rFonts w:ascii="Times New Roman" w:hAnsi="Times New Roman" w:cs="Times New Roman"/>
+          <w:sz w:val="32"/>
+          <w:szCs w:val="32"/>
+        </w:rPr>
+        <w:t xml:space="preserve"> oldalra, akkor látunk a képernyő jobb oldalán egy táblázatot, ahova automatikusan lekérjük az adatokat az adatbázisból. Az oldal bal oldalán beviteli mezőket láthatunk, </w:t>
+      </w:r>
+      <w:r>
+        <w:rPr>
+          <w:rFonts w:ascii="Times New Roman" w:hAnsi="Times New Roman" w:cs="Times New Roman"/>
+          <w:sz w:val="32"/>
+          <w:szCs w:val="32"/>
+        </w:rPr>
+        <w:t>ahova,</w:t>
+      </w:r>
+      <w:r>
+        <w:rPr>
+          <w:rFonts w:ascii="Times New Roman" w:hAnsi="Times New Roman" w:cs="Times New Roman"/>
+          <w:sz w:val="32"/>
+          <w:szCs w:val="32"/>
+        </w:rPr>
+        <w:t xml:space="preserve"> ha rákattintunk az egyik adatsorra akkor bele kerül a kiválasztott adat.</w:t>
+      </w:r>
+    </w:p>
+    <w:p>
+      <w:pPr>
+        <w:rPr>
+          <w:rFonts w:ascii="Times New Roman" w:hAnsi="Times New Roman" w:cs="Times New Roman"/>
+          <w:sz w:val="32"/>
+          <w:szCs w:val="32"/>
+        </w:rPr>
+      </w:pPr>
+      <w:r>
+        <w:rPr>
+          <w:rFonts w:ascii="Times New Roman" w:hAnsi="Times New Roman" w:cs="Times New Roman"/>
+          <w:sz w:val="32"/>
+          <w:szCs w:val="32"/>
+        </w:rPr>
+        <w:br w:type="page"/>
+      </w:r>
+    </w:p>
+    <w:p>
+      <w:pPr>
+        <w:jc w:val="both"/>
+        <w:rPr>
+          <w:rFonts w:ascii="Times New Roman" w:hAnsi="Times New Roman" w:cs="Times New Roman"/>
+          <w:sz w:val="32"/>
+          <w:szCs w:val="32"/>
+        </w:rPr>
+      </w:pPr>
+      <w:r>
+        <w:rPr>
+          <w:rFonts w:ascii="Times New Roman" w:hAnsi="Times New Roman" w:cs="Times New Roman"/>
+          <w:noProof/>
+          <w:sz w:val="40"/>
+          <w:szCs w:val="40"/>
+          <w:u w:val="single"/>
+        </w:rPr>
+        <w:lastRenderedPageBreak/>
+        <w:drawing>
+          <wp:anchor distT="0" distB="0" distL="114300" distR="114300" simplePos="0" relativeHeight="251677696" behindDoc="0" locked="0" layoutInCell="1" allowOverlap="1" wp14:anchorId="12B7675E" wp14:editId="5B462E3E">
+            <wp:simplePos x="0" y="0"/>
+            <wp:positionH relativeFrom="margin">
+              <wp:posOffset>-336786</wp:posOffset>
+            </wp:positionH>
+            <wp:positionV relativeFrom="paragraph">
+              <wp:posOffset>960755</wp:posOffset>
+            </wp:positionV>
+            <wp:extent cx="6506845" cy="4347210"/>
+            <wp:effectExtent l="0" t="0" r="8255" b="0"/>
+            <wp:wrapTopAndBottom/>
+            <wp:docPr id="18" name="Kép 18"/>
+            <wp:cNvGraphicFramePr>
+              <a:graphicFrameLocks xmlns:a="http://schemas.openxmlformats.org/drawingml/2006/main" noChangeAspect="1"/>
+            </wp:cNvGraphicFramePr>
+            <a:graphic xmlns:a="http://schemas.openxmlformats.org/drawingml/2006/main">
+              <a:graphicData uri="http://schemas.openxmlformats.org/drawingml/2006/picture">
+                <pic:pic xmlns:pic="http://schemas.openxmlformats.org/drawingml/2006/picture">
+                  <pic:nvPicPr>
+                    <pic:cNvPr id="18" name="szineszek2.PNG"/>
+                    <pic:cNvPicPr/>
+                  </pic:nvPicPr>
+                  <pic:blipFill>
+                    <a:blip r:embed="rId17">
+                      <a:extLst>
+                        <a:ext uri="{28A0092B-C50C-407E-A947-70E740481C1C}">
+                          <a14:useLocalDpi xmlns:a14="http://schemas.microsoft.com/office/drawing/2010/main" val="0"/>
+                        </a:ext>
+                      </a:extLst>
+                    </a:blip>
+                    <a:stretch>
+                      <a:fillRect/>
+                    </a:stretch>
+                  </pic:blipFill>
+                  <pic:spPr>
+                    <a:xfrm>
+                      <a:off x="0" y="0"/>
+                      <a:ext cx="6506845" cy="4347210"/>
+                    </a:xfrm>
+                    <a:prstGeom prst="rect">
+                      <a:avLst/>
+                    </a:prstGeom>
+                  </pic:spPr>
+                </pic:pic>
+              </a:graphicData>
+            </a:graphic>
+            <wp14:sizeRelH relativeFrom="margin">
+              <wp14:pctWidth>0</wp14:pctWidth>
+            </wp14:sizeRelH>
+            <wp14:sizeRelV relativeFrom="margin">
+              <wp14:pctHeight>0</wp14:pctHeight>
+            </wp14:sizeRelV>
+          </wp:anchor>
+        </w:drawing>
+      </w:r>
+      <w:r>
+        <w:rPr>
+          <w:rFonts w:ascii="Times New Roman" w:hAnsi="Times New Roman" w:cs="Times New Roman"/>
+          <w:sz w:val="32"/>
+          <w:szCs w:val="32"/>
+        </w:rPr>
+        <w:t>Az oldal alján láthatunk három gombot, ezeknek a gomboknak a funkcionalitása ugyan azon az elven működik, mint amit leírtunk a dokumentáció 5. oldalán.</w:t>
+      </w:r>
+    </w:p>
+    <w:p>
+      <w:pPr>
+        <w:rPr>
+          <w:rFonts w:ascii="Times New Roman" w:hAnsi="Times New Roman" w:cs="Times New Roman"/>
+          <w:sz w:val="32"/>
+          <w:szCs w:val="32"/>
+        </w:rPr>
+      </w:pPr>
+      <w:r>
+        <w:rPr>
+          <w:rFonts w:ascii="Times New Roman" w:hAnsi="Times New Roman" w:cs="Times New Roman"/>
+          <w:sz w:val="32"/>
+          <w:szCs w:val="32"/>
+        </w:rPr>
+        <w:br w:type="page"/>
+      </w:r>
+    </w:p>
+    <w:p>
+      <w:pPr>
+        <w:jc w:val="center"/>
+        <w:rPr>
+          <w:rFonts w:ascii="Times New Roman" w:hAnsi="Times New Roman" w:cs="Times New Roman"/>
+          <w:sz w:val="40"/>
+          <w:szCs w:val="40"/>
+          <w:u w:val="single"/>
+        </w:rPr>
+      </w:pPr>
+      <w:r>
+        <w:rPr>
+          <w:rFonts w:ascii="Times New Roman" w:hAnsi="Times New Roman" w:cs="Times New Roman"/>
+          <w:sz w:val="40"/>
+          <w:szCs w:val="40"/>
+          <w:u w:val="single"/>
+        </w:rPr>
+        <w:lastRenderedPageBreak/>
+        <w:t>F</w:t>
+      </w:r>
+      <w:r>
+        <w:rPr>
+          <w:rFonts w:ascii="Times New Roman" w:hAnsi="Times New Roman" w:cs="Times New Roman"/>
+          <w:sz w:val="40"/>
+          <w:szCs w:val="40"/>
+          <w:u w:val="single"/>
+        </w:rPr>
+        <w:t>elhasználók</w:t>
+      </w:r>
+    </w:p>
+    <w:p>
+      <w:pPr>
+        <w:jc w:val="both"/>
+        <w:rPr>
+          <w:rFonts w:ascii="Times New Roman" w:hAnsi="Times New Roman" w:cs="Times New Roman"/>
+          <w:sz w:val="32"/>
+          <w:szCs w:val="32"/>
+        </w:rPr>
+      </w:pPr>
+      <w:r>
+        <w:rPr>
+          <w:rFonts w:ascii="Times New Roman" w:hAnsi="Times New Roman" w:cs="Times New Roman"/>
+          <w:noProof/>
+          <w:sz w:val="40"/>
+          <w:szCs w:val="40"/>
+          <w:u w:val="single"/>
+        </w:rPr>
+        <w:drawing>
+          <wp:anchor distT="0" distB="0" distL="114300" distR="114300" simplePos="0" relativeHeight="251675648" behindDoc="0" locked="0" layoutInCell="1" allowOverlap="1" wp14:anchorId="309580AB" wp14:editId="28BAC727">
+            <wp:simplePos x="0" y="0"/>
+            <wp:positionH relativeFrom="margin">
+              <wp:posOffset>-377471</wp:posOffset>
+            </wp:positionH>
+            <wp:positionV relativeFrom="paragraph">
+              <wp:posOffset>1200694</wp:posOffset>
+            </wp:positionV>
+            <wp:extent cx="6601460" cy="4393565"/>
+            <wp:effectExtent l="0" t="0" r="8890" b="6985"/>
+            <wp:wrapTopAndBottom/>
+            <wp:docPr id="19" name="Kép 19"/>
+            <wp:cNvGraphicFramePr>
+              <a:graphicFrameLocks xmlns:a="http://schemas.openxmlformats.org/drawingml/2006/main" noChangeAspect="1"/>
+            </wp:cNvGraphicFramePr>
+            <a:graphic xmlns:a="http://schemas.openxmlformats.org/drawingml/2006/main">
+              <a:graphicData uri="http://schemas.openxmlformats.org/drawingml/2006/picture">
+                <pic:pic xmlns:pic="http://schemas.openxmlformats.org/drawingml/2006/picture">
+                  <pic:nvPicPr>
+                    <pic:cNvPr id="19" name="felhasznalok.PNG"/>
+                    <pic:cNvPicPr/>
+                  </pic:nvPicPr>
+                  <pic:blipFill>
+                    <a:blip r:embed="rId18">
+                      <a:extLst>
+                        <a:ext uri="{28A0092B-C50C-407E-A947-70E740481C1C}">
+                          <a14:useLocalDpi xmlns:a14="http://schemas.microsoft.com/office/drawing/2010/main" val="0"/>
+                        </a:ext>
+                      </a:extLst>
+                    </a:blip>
+                    <a:stretch>
+                      <a:fillRect/>
+                    </a:stretch>
+                  </pic:blipFill>
+                  <pic:spPr>
+                    <a:xfrm>
+                      <a:off x="0" y="0"/>
+                      <a:ext cx="6601460" cy="4393565"/>
+                    </a:xfrm>
+                    <a:prstGeom prst="rect">
+                      <a:avLst/>
+                    </a:prstGeom>
+                  </pic:spPr>
+                </pic:pic>
+              </a:graphicData>
+            </a:graphic>
+            <wp14:sizeRelH relativeFrom="margin">
+              <wp14:pctWidth>0</wp14:pctWidth>
+            </wp14:sizeRelH>
+            <wp14:sizeRelV relativeFrom="margin">
+              <wp14:pctHeight>0</wp14:pctHeight>
+            </wp14:sizeRelV>
+          </wp:anchor>
+        </w:drawing>
+      </w:r>
+      <w:r>
+        <w:rPr>
+          <w:rFonts w:ascii="Times New Roman" w:hAnsi="Times New Roman" w:cs="Times New Roman"/>
+          <w:sz w:val="32"/>
+          <w:szCs w:val="32"/>
+        </w:rPr>
+        <w:t xml:space="preserve">Ha átmegyünk a </w:t>
+      </w:r>
+      <w:r>
+        <w:rPr>
+          <w:rFonts w:ascii="Times New Roman" w:hAnsi="Times New Roman" w:cs="Times New Roman"/>
+          <w:b/>
+          <w:bCs/>
+          <w:sz w:val="32"/>
+          <w:szCs w:val="32"/>
+        </w:rPr>
+        <w:t>Felhasználók</w:t>
+      </w:r>
+      <w:r>
+        <w:rPr>
+          <w:rFonts w:ascii="Times New Roman" w:hAnsi="Times New Roman" w:cs="Times New Roman"/>
+          <w:sz w:val="32"/>
+          <w:szCs w:val="32"/>
+        </w:rPr>
+        <w:t xml:space="preserve"> oldalra, akkor a jobb oldalon megjelenítésre és módosításra szolgáló mezőket találunk. A bal oldalon pedig egy automatikusan az adatbázisból lekért adatokkal tele lévő táblázatot látunk. </w:t>
+      </w:r>
+    </w:p>
+    <w:p>
+      <w:pPr>
+        <w:rPr>
+          <w:rFonts w:ascii="Times New Roman" w:hAnsi="Times New Roman" w:cs="Times New Roman"/>
+          <w:sz w:val="40"/>
+          <w:szCs w:val="40"/>
+          <w:u w:val="single"/>
+        </w:rPr>
+      </w:pPr>
+      <w:r>
+        <w:rPr>
+          <w:rFonts w:ascii="Times New Roman" w:hAnsi="Times New Roman" w:cs="Times New Roman"/>
+          <w:sz w:val="40"/>
+          <w:szCs w:val="40"/>
+          <w:u w:val="single"/>
+        </w:rPr>
+        <w:br w:type="page"/>
+      </w:r>
+    </w:p>
+    <w:p>
+      <w:pPr>
+        <w:jc w:val="both"/>
+        <w:rPr>
+          <w:rFonts w:ascii="Times New Roman" w:hAnsi="Times New Roman" w:cs="Times New Roman"/>
+          <w:sz w:val="32"/>
+          <w:szCs w:val="32"/>
+        </w:rPr>
+      </w:pPr>
+      <w:r>
+        <w:rPr>
+          <w:rFonts w:ascii="Times New Roman" w:hAnsi="Times New Roman" w:cs="Times New Roman"/>
+          <w:noProof/>
+          <w:sz w:val="40"/>
+          <w:szCs w:val="40"/>
+          <w:u w:val="single"/>
+        </w:rPr>
+        <w:lastRenderedPageBreak/>
+        <w:drawing>
+          <wp:anchor distT="0" distB="0" distL="114300" distR="114300" simplePos="0" relativeHeight="251674624" behindDoc="0" locked="0" layoutInCell="1" allowOverlap="1" wp14:anchorId="4DEF688B" wp14:editId="44F01E5E">
+            <wp:simplePos x="0" y="0"/>
+            <wp:positionH relativeFrom="margin">
+              <wp:posOffset>-234315</wp:posOffset>
+            </wp:positionH>
+            <wp:positionV relativeFrom="paragraph">
+              <wp:posOffset>625558</wp:posOffset>
+            </wp:positionV>
+            <wp:extent cx="6520815" cy="4340225"/>
+            <wp:effectExtent l="0" t="0" r="0" b="3175"/>
+            <wp:wrapTopAndBottom/>
+            <wp:docPr id="20" name="Kép 20"/>
+            <wp:cNvGraphicFramePr>
+              <a:graphicFrameLocks xmlns:a="http://schemas.openxmlformats.org/drawingml/2006/main" noChangeAspect="1"/>
+            </wp:cNvGraphicFramePr>
+            <a:graphic xmlns:a="http://schemas.openxmlformats.org/drawingml/2006/main">
+              <a:graphicData uri="http://schemas.openxmlformats.org/drawingml/2006/picture">
+                <pic:pic xmlns:pic="http://schemas.openxmlformats.org/drawingml/2006/picture">
+                  <pic:nvPicPr>
+                    <pic:cNvPr id="20" name="felhasznalok2.PNG"/>
+                    <pic:cNvPicPr/>
+                  </pic:nvPicPr>
+                  <pic:blipFill>
+                    <a:blip r:embed="rId19">
+                      <a:extLst>
+                        <a:ext uri="{28A0092B-C50C-407E-A947-70E740481C1C}">
+                          <a14:useLocalDpi xmlns:a14="http://schemas.microsoft.com/office/drawing/2010/main" val="0"/>
+                        </a:ext>
+                      </a:extLst>
+                    </a:blip>
+                    <a:stretch>
+                      <a:fillRect/>
+                    </a:stretch>
+                  </pic:blipFill>
+                  <pic:spPr>
+                    <a:xfrm>
+                      <a:off x="0" y="0"/>
+                      <a:ext cx="6520815" cy="4340225"/>
+                    </a:xfrm>
+                    <a:prstGeom prst="rect">
+                      <a:avLst/>
+                    </a:prstGeom>
+                  </pic:spPr>
+                </pic:pic>
+              </a:graphicData>
+            </a:graphic>
+            <wp14:sizeRelH relativeFrom="margin">
+              <wp14:pctWidth>0</wp14:pctWidth>
+            </wp14:sizeRelH>
+            <wp14:sizeRelV relativeFrom="margin">
+              <wp14:pctHeight>0</wp14:pctHeight>
+            </wp14:sizeRelV>
+          </wp:anchor>
+        </w:drawing>
+      </w:r>
+      <w:r>
+        <w:rPr>
+          <w:rFonts w:ascii="Times New Roman" w:hAnsi="Times New Roman" w:cs="Times New Roman"/>
+          <w:sz w:val="32"/>
+          <w:szCs w:val="32"/>
+        </w:rPr>
+        <w:t xml:space="preserve">Ha kiválasztunk egy adatsort akkor az automatikusan megjelen a beviteli mezőkben is. </w:t>
+      </w:r>
+    </w:p>
+    <w:p>
+      <w:pPr>
+        <w:spacing w:before="360" w:after="120"/>
+        <w:jc w:val="both"/>
+        <w:rPr>
+          <w:rFonts w:ascii="Times New Roman" w:hAnsi="Times New Roman" w:cs="Times New Roman"/>
+          <w:sz w:val="32"/>
+          <w:szCs w:val="32"/>
+        </w:rPr>
+      </w:pPr>
+      <w:r>
+        <w:rPr>
+          <w:rFonts w:ascii="Times New Roman" w:hAnsi="Times New Roman" w:cs="Times New Roman"/>
+          <w:sz w:val="32"/>
+          <w:szCs w:val="32"/>
+        </w:rPr>
+        <w:t>Az oldal alján láthatunk három gombot, ezeknek a gomboknak a funkcionalitása ugyan azon az elven működik, mint amit leírtunk a dokumentáció 5. oldalán</w:t>
+      </w:r>
+      <w:r>
+        <w:rPr>
+          <w:rFonts w:ascii="Times New Roman" w:hAnsi="Times New Roman" w:cs="Times New Roman"/>
+          <w:sz w:val="32"/>
+          <w:szCs w:val="32"/>
+        </w:rPr>
+        <w:t>.</w:t>
+      </w:r>
     </w:p>
     <w:sectPr>
       <w:pgSz w:w="11906" w:h="16838"/>
@@ -1729,9 +2469,208 @@
 </w:document>
 </file>
 
+<file path=word/endnotes.xml><?xml version="1.0" encoding="utf-8"?>
+<w:endnotes xmlns:wpc="http://schemas.microsoft.com/office/word/2010/wordprocessingCanvas" xmlns:cx="http://schemas.microsoft.com/office/drawing/2014/chartex" xmlns:cx1="http://schemas.microsoft.com/office/drawing/2015/9/8/chartex" xmlns:cx2="http://schemas.microsoft.com/office/drawing/2015/10/21/chartex" xmlns:cx3="http://schemas.microsoft.com/office/drawing/2016/5/9/chartex" xmlns:cx4="http://schemas.microsoft.com/office/drawing/2016/5/10/chartex" xmlns:cx5="http://schemas.microsoft.com/office/drawing/2016/5/11/chartex" xmlns:cx6="http://schemas.microsoft.com/office/drawing/2016/5/12/chartex" xmlns:cx7="http://schemas.microsoft.com/office/drawing/2016/5/13/chartex" xmlns:cx8="http://schemas.microsoft.com/office/drawing/2016/5/14/chartex" xmlns:mc="http://schemas.openxmlformats.org/markup-compatibility/2006" xmlns:aink="http://schemas.microsoft.com/office/drawing/2016/ink" xmlns:am3d="http://schemas.microsoft.com/office/drawing/2017/model3d" xmlns:o="urn:schemas-microsoft-com:office:office" xmlns:oel="http://schemas.microsoft.com/office/2019/extlst" xmlns:r="http://schemas.openxmlformats.org/officeDocument/2006/relationships" xmlns:m="http://schemas.openxmlformats.org/officeDocument/2006/math" xmlns:v="urn:schemas-microsoft-com:vml" xmlns:wp14="http://schemas.microsoft.com/office/word/2010/wordprocessingDrawing" xmlns:wp="http://schemas.openxmlformats.org/drawingml/2006/wordprocessingDrawing" xmlns:w10="urn:schemas-microsoft-com:office:word" xmlns:w="http://schemas.openxmlformats.org/wordprocessingml/2006/main" xmlns:w14="http://schemas.microsoft.com/office/word/2010/wordml" xmlns:w15="http://schemas.microsoft.com/office/word/2012/wordml" xmlns:w16cex="http://schemas.microsoft.com/office/word/2018/wordml/cex" xmlns:w16cid="http://schemas.microsoft.com/office/word/2016/wordml/cid" xmlns:w16="http://schemas.microsoft.com/office/word/2018/wordml" xmlns:w16du="http://schemas.microsoft.com/office/word/2023/wordml/word16du" xmlns:w16sdtdh="http://schemas.microsoft.com/office/word/2020/wordml/sdtdatahash" xmlns:w16sdtfl="http://schemas.microsoft.com/office/word/2024/wordml/sdtformatlock" xmlns:w16se="http://schemas.microsoft.com/office/word/2015/wordml/symex" xmlns:wpg="http://schemas.microsoft.com/office/word/2010/wordprocessingGroup" xmlns:wpi="http://schemas.microsoft.com/office/word/2010/wordprocessingInk" xmlns:wne="http://schemas.microsoft.com/office/word/2006/wordml" xmlns:wps="http://schemas.microsoft.com/office/word/2010/wordprocessingShape" mc:Ignorable="w14 w15 w16se w16cid w16 w16cex w16sdtdh w16sdtfl w16du wp14">
+  <w:endnote w:type="separator" w:id="-1">
+    <w:p>
+      <w:pPr>
+        <w:spacing w:after="0" w:line="240" w:lineRule="auto"/>
+      </w:pPr>
+      <w:r>
+        <w:separator/>
+      </w:r>
+    </w:p>
+  </w:endnote>
+  <w:endnote w:type="continuationSeparator" w:id="0">
+    <w:p>
+      <w:pPr>
+        <w:spacing w:after="0" w:line="240" w:lineRule="auto"/>
+      </w:pPr>
+      <w:r>
+        <w:continuationSeparator/>
+      </w:r>
+    </w:p>
+  </w:endnote>
+</w:endnotes>
+</file>
+
+<file path=word/footnotes.xml><?xml version="1.0" encoding="utf-8"?>
+<w:footnotes xmlns:wpc="http://schemas.microsoft.com/office/word/2010/wordprocessingCanvas" xmlns:cx="http://schemas.microsoft.com/office/drawing/2014/chartex" xmlns:cx1="http://schemas.microsoft.com/office/drawing/2015/9/8/chartex" xmlns:cx2="http://schemas.microsoft.com/office/drawing/2015/10/21/chartex" xmlns:cx3="http://schemas.microsoft.com/office/drawing/2016/5/9/chartex" xmlns:cx4="http://schemas.microsoft.com/office/drawing/2016/5/10/chartex" xmlns:cx5="http://schemas.microsoft.com/office/drawing/2016/5/11/chartex" xmlns:cx6="http://schemas.microsoft.com/office/drawing/2016/5/12/chartex" xmlns:cx7="http://schemas.microsoft.com/office/drawing/2016/5/13/chartex" xmlns:cx8="http://schemas.microsoft.com/office/drawing/2016/5/14/chartex" xmlns:mc="http://schemas.openxmlformats.org/markup-compatibility/2006" xmlns:aink="http://schemas.microsoft.com/office/drawing/2016/ink" xmlns:am3d="http://schemas.microsoft.com/office/drawing/2017/model3d" xmlns:o="urn:schemas-microsoft-com:office:office" xmlns:oel="http://schemas.microsoft.com/office/2019/extlst" xmlns:r="http://schemas.openxmlformats.org/officeDocument/2006/relationships" xmlns:m="http://schemas.openxmlformats.org/officeDocument/2006/math" xmlns:v="urn:schemas-microsoft-com:vml" xmlns:wp14="http://schemas.microsoft.com/office/word/2010/wordprocessingDrawing" xmlns:wp="http://schemas.openxmlformats.org/drawingml/2006/wordprocessingDrawing" xmlns:w10="urn:schemas-microsoft-com:office:word" xmlns:w="http://schemas.openxmlformats.org/wordprocessingml/2006/main" xmlns:w14="http://schemas.microsoft.com/office/word/2010/wordml" xmlns:w15="http://schemas.microsoft.com/office/word/2012/wordml" xmlns:w16cex="http://schemas.microsoft.com/office/word/2018/wordml/cex" xmlns:w16cid="http://schemas.microsoft.com/office/word/2016/wordml/cid" xmlns:w16="http://schemas.microsoft.com/office/word/2018/wordml" xmlns:w16du="http://schemas.microsoft.com/office/word/2023/wordml/word16du" xmlns:w16sdtdh="http://schemas.microsoft.com/office/word/2020/wordml/sdtdatahash" xmlns:w16sdtfl="http://schemas.microsoft.com/office/word/2024/wordml/sdtformatlock" xmlns:w16se="http://schemas.microsoft.com/office/word/2015/wordml/symex" xmlns:wpg="http://schemas.microsoft.com/office/word/2010/wordprocessingGroup" xmlns:wpi="http://schemas.microsoft.com/office/word/2010/wordprocessingInk" xmlns:wne="http://schemas.microsoft.com/office/word/2006/wordml" xmlns:wps="http://schemas.microsoft.com/office/word/2010/wordprocessingShape" mc:Ignorable="w14 w15 w16se w16cid w16 w16cex w16sdtdh w16sdtfl w16du wp14">
+  <w:footnote w:type="separator" w:id="-1">
+    <w:p>
+      <w:pPr>
+        <w:spacing w:after="0" w:line="240" w:lineRule="auto"/>
+      </w:pPr>
+      <w:r>
+        <w:separator/>
+      </w:r>
+    </w:p>
+  </w:footnote>
+  <w:footnote w:type="continuationSeparator" w:id="0">
+    <w:p>
+      <w:pPr>
+        <w:spacing w:after="0" w:line="240" w:lineRule="auto"/>
+      </w:pPr>
+      <w:r>
+        <w:continuationSeparator/>
+      </w:r>
+    </w:p>
+  </w:footnote>
+</w:footnotes>
+</file>
+
 <file path=word/numbering.xml><?xml version="1.0" encoding="utf-8"?>
-<w:numbering xmlns:wpc="http://schemas.microsoft.com/office/word/2010/wordprocessingCanvas" xmlns:cx="http://schemas.microsoft.com/office/drawing/2014/chartex" xmlns:cx1="http://schemas.microsoft.com/office/drawing/2015/9/8/chartex" xmlns:cx2="http://schemas.microsoft.com/office/drawing/2015/10/21/chartex" xmlns:cx3="http://schemas.microsoft.com/office/drawing/2016/5/9/chartex" xmlns:cx4="http://schemas.microsoft.com/office/drawing/2016/5/10/chartex" xmlns:cx5="http://schemas.microsoft.com/office/drawing/2016/5/11/chartex" xmlns:cx6="http://schemas.microsoft.com/office/drawing/2016/5/12/chartex" xmlns:cx7="http://schemas.microsoft.com/office/drawing/2016/5/13/chartex" xmlns:cx8="http://schemas.microsoft.com/office/drawing/2016/5/14/chartex" xmlns:mc="http://schemas.openxmlformats.org/markup-compatibility/2006" xmlns:aink="http://schemas.microsoft.com/office/drawing/2016/ink" xmlns:am3d="http://schemas.microsoft.com/office/drawing/2017/model3d" xmlns:o="urn:schemas-microsoft-com:office:office" xmlns:r="http://schemas.openxmlformats.org/officeDocument/2006/relationships" xmlns:m="http://schemas.openxmlformats.org/officeDocument/2006/math" xmlns:v="urn:schemas-microsoft-com:vml" xmlns:wp14="http://schemas.microsoft.com/office/word/2010/wordprocessingDrawing" xmlns:wp="http://schemas.openxmlformats.org/drawingml/2006/wordprocessingDrawing" xmlns:w10="urn:schemas-microsoft-com:office:word" xmlns:w="http://schemas.openxmlformats.org/wordprocessingml/2006/main" xmlns:w14="http://schemas.microsoft.com/office/word/2010/wordml" xmlns:w15="http://schemas.microsoft.com/office/word/2012/wordml" xmlns:w16cid="http://schemas.microsoft.com/office/word/2016/wordml/cid" xmlns:w16se="http://schemas.microsoft.com/office/word/2015/wordml/symex" xmlns:wpg="http://schemas.microsoft.com/office/word/2010/wordprocessingGroup" xmlns:wpi="http://schemas.microsoft.com/office/word/2010/wordprocessingInk" xmlns:wne="http://schemas.microsoft.com/office/word/2006/wordml" xmlns:wps="http://schemas.microsoft.com/office/word/2010/wordprocessingShape" mc:Ignorable="w14 w15 w16se w16cid wp14">
+<w:numbering xmlns:wpc="http://schemas.microsoft.com/office/word/2010/wordprocessingCanvas" xmlns:cx="http://schemas.microsoft.com/office/drawing/2014/chartex" xmlns:cx1="http://schemas.microsoft.com/office/drawing/2015/9/8/chartex" xmlns:cx2="http://schemas.microsoft.com/office/drawing/2015/10/21/chartex" xmlns:cx3="http://schemas.microsoft.com/office/drawing/2016/5/9/chartex" xmlns:cx4="http://schemas.microsoft.com/office/drawing/2016/5/10/chartex" xmlns:cx5="http://schemas.microsoft.com/office/drawing/2016/5/11/chartex" xmlns:cx6="http://schemas.microsoft.com/office/drawing/2016/5/12/chartex" xmlns:cx7="http://schemas.microsoft.com/office/drawing/2016/5/13/chartex" xmlns:cx8="http://schemas.microsoft.com/office/drawing/2016/5/14/chartex" xmlns:mc="http://schemas.openxmlformats.org/markup-compatibility/2006" xmlns:aink="http://schemas.microsoft.com/office/drawing/2016/ink" xmlns:am3d="http://schemas.microsoft.com/office/drawing/2017/model3d" xmlns:o="urn:schemas-microsoft-com:office:office" xmlns:oel="http://schemas.microsoft.com/office/2019/extlst" xmlns:r="http://schemas.openxmlformats.org/officeDocument/2006/relationships" xmlns:m="http://schemas.openxmlformats.org/officeDocument/2006/math" xmlns:v="urn:schemas-microsoft-com:vml" xmlns:wp14="http://schemas.microsoft.com/office/word/2010/wordprocessingDrawing" xmlns:wp="http://schemas.openxmlformats.org/drawingml/2006/wordprocessingDrawing" xmlns:w10="urn:schemas-microsoft-com:office:word" xmlns:w="http://schemas.openxmlformats.org/wordprocessingml/2006/main" xmlns:w14="http://schemas.microsoft.com/office/word/2010/wordml" xmlns:w15="http://schemas.microsoft.com/office/word/2012/wordml" xmlns:w16cex="http://schemas.microsoft.com/office/word/2018/wordml/cex" xmlns:w16cid="http://schemas.microsoft.com/office/word/2016/wordml/cid" xmlns:w16="http://schemas.microsoft.com/office/word/2018/wordml" xmlns:w16du="http://schemas.microsoft.com/office/word/2023/wordml/word16du" xmlns:w16sdtdh="http://schemas.microsoft.com/office/word/2020/wordml/sdtdatahash" xmlns:w16sdtfl="http://schemas.microsoft.com/office/word/2024/wordml/sdtformatlock" xmlns:w16se="http://schemas.microsoft.com/office/word/2015/wordml/symex" xmlns:wpg="http://schemas.microsoft.com/office/word/2010/wordprocessingGroup" xmlns:wpi="http://schemas.microsoft.com/office/word/2010/wordprocessingInk" xmlns:wne="http://schemas.microsoft.com/office/word/2006/wordml" xmlns:wps="http://schemas.microsoft.com/office/word/2010/wordprocessingShape" mc:Ignorable="w14 w15 w16se w16cid w16 w16cex w16sdtdh w16sdtfl w16du wp14">
   <w:abstractNum w:abstractNumId="0" w15:restartNumberingAfterBreak="0">
+    <w:nsid w:val="3F2E1764"/>
+    <w:multiLevelType w:val="multilevel"/>
+    <w:tmpl w:val="18F27386"/>
+    <w:lvl w:ilvl="0">
+      <w:start w:val="1"/>
+      <w:numFmt w:val="bullet"/>
+      <w:lvlText w:val=""/>
+      <w:lvlJc w:val="left"/>
+      <w:pPr>
+        <w:tabs>
+          <w:tab w:val="num" w:pos="720"/>
+        </w:tabs>
+        <w:ind w:left="720" w:hanging="360"/>
+      </w:pPr>
+      <w:rPr>
+        <w:rFonts w:ascii="Symbol" w:hAnsi="Symbol" w:hint="default"/>
+        <w:sz w:val="20"/>
+      </w:rPr>
+    </w:lvl>
+    <w:lvl w:ilvl="1" w:tentative="1">
+      <w:start w:val="1"/>
+      <w:numFmt w:val="bullet"/>
+      <w:lvlText w:val="o"/>
+      <w:lvlJc w:val="left"/>
+      <w:pPr>
+        <w:tabs>
+          <w:tab w:val="num" w:pos="1440"/>
+        </w:tabs>
+        <w:ind w:left="1440" w:hanging="360"/>
+      </w:pPr>
+      <w:rPr>
+        <w:rFonts w:ascii="Courier New" w:hAnsi="Courier New" w:hint="default"/>
+        <w:sz w:val="20"/>
+      </w:rPr>
+    </w:lvl>
+    <w:lvl w:ilvl="2" w:tentative="1">
+      <w:start w:val="1"/>
+      <w:numFmt w:val="bullet"/>
+      <w:lvlText w:val=""/>
+      <w:lvlJc w:val="left"/>
+      <w:pPr>
+        <w:tabs>
+          <w:tab w:val="num" w:pos="2160"/>
+        </w:tabs>
+        <w:ind w:left="2160" w:hanging="360"/>
+      </w:pPr>
+      <w:rPr>
+        <w:rFonts w:ascii="Wingdings" w:hAnsi="Wingdings" w:hint="default"/>
+        <w:sz w:val="20"/>
+      </w:rPr>
+    </w:lvl>
+    <w:lvl w:ilvl="3" w:tentative="1">
+      <w:start w:val="1"/>
+      <w:numFmt w:val="bullet"/>
+      <w:lvlText w:val=""/>
+      <w:lvlJc w:val="left"/>
+      <w:pPr>
+        <w:tabs>
+          <w:tab w:val="num" w:pos="2880"/>
+        </w:tabs>
+        <w:ind w:left="2880" w:hanging="360"/>
+      </w:pPr>
+      <w:rPr>
+        <w:rFonts w:ascii="Wingdings" w:hAnsi="Wingdings" w:hint="default"/>
+        <w:sz w:val="20"/>
+      </w:rPr>
+    </w:lvl>
+    <w:lvl w:ilvl="4" w:tentative="1">
+      <w:start w:val="1"/>
+      <w:numFmt w:val="bullet"/>
+      <w:lvlText w:val=""/>
+      <w:lvlJc w:val="left"/>
+      <w:pPr>
+        <w:tabs>
+          <w:tab w:val="num" w:pos="3600"/>
+        </w:tabs>
+        <w:ind w:left="3600" w:hanging="360"/>
+      </w:pPr>
+      <w:rPr>
+        <w:rFonts w:ascii="Wingdings" w:hAnsi="Wingdings" w:hint="default"/>
+        <w:sz w:val="20"/>
+      </w:rPr>
+    </w:lvl>
+    <w:lvl w:ilvl="5" w:tentative="1">
+      <w:start w:val="1"/>
+      <w:numFmt w:val="bullet"/>
+      <w:lvlText w:val=""/>
+      <w:lvlJc w:val="left"/>
+      <w:pPr>
+        <w:tabs>
+          <w:tab w:val="num" w:pos="4320"/>
+        </w:tabs>
+        <w:ind w:left="4320" w:hanging="360"/>
+      </w:pPr>
+      <w:rPr>
+        <w:rFonts w:ascii="Wingdings" w:hAnsi="Wingdings" w:hint="default"/>
+        <w:sz w:val="20"/>
+      </w:rPr>
+    </w:lvl>
+    <w:lvl w:ilvl="6" w:tentative="1">
+      <w:start w:val="1"/>
+      <w:numFmt w:val="bullet"/>
+      <w:lvlText w:val=""/>
+      <w:lvlJc w:val="left"/>
+      <w:pPr>
+        <w:tabs>
+          <w:tab w:val="num" w:pos="5040"/>
+        </w:tabs>
+        <w:ind w:left="5040" w:hanging="360"/>
+      </w:pPr>
+      <w:rPr>
+        <w:rFonts w:ascii="Wingdings" w:hAnsi="Wingdings" w:hint="default"/>
+        <w:sz w:val="20"/>
+      </w:rPr>
+    </w:lvl>
+    <w:lvl w:ilvl="7" w:tentative="1">
+      <w:start w:val="1"/>
+      <w:numFmt w:val="bullet"/>
+      <w:lvlText w:val=""/>
+      <w:lvlJc w:val="left"/>
+      <w:pPr>
+        <w:tabs>
+          <w:tab w:val="num" w:pos="5760"/>
+        </w:tabs>
+        <w:ind w:left="5760" w:hanging="360"/>
+      </w:pPr>
+      <w:rPr>
+        <w:rFonts w:ascii="Wingdings" w:hAnsi="Wingdings" w:hint="default"/>
+        <w:sz w:val="20"/>
+      </w:rPr>
+    </w:lvl>
+    <w:lvl w:ilvl="8" w:tentative="1">
+      <w:start w:val="1"/>
+      <w:numFmt w:val="bullet"/>
+      <w:lvlText w:val=""/>
+      <w:lvlJc w:val="left"/>
+      <w:pPr>
+        <w:tabs>
+          <w:tab w:val="num" w:pos="6480"/>
+        </w:tabs>
+        <w:ind w:left="6480" w:hanging="360"/>
+      </w:pPr>
+      <w:rPr>
+        <w:rFonts w:ascii="Wingdings" w:hAnsi="Wingdings" w:hint="default"/>
+        <w:sz w:val="20"/>
+      </w:rPr>
+    </w:lvl>
+  </w:abstractNum>
+  <w:abstractNum w:abstractNumId="1" w15:restartNumberingAfterBreak="0">
     <w:nsid w:val="45354DAA"/>
     <w:multiLevelType w:val="multilevel"/>
     <w:tmpl w:val="6CEAB9BA"/>
@@ -1844,7 +2783,7 @@
       </w:pPr>
     </w:lvl>
   </w:abstractNum>
-  <w:abstractNum w:abstractNumId="1" w15:restartNumberingAfterBreak="0">
+  <w:abstractNum w:abstractNumId="2" w15:restartNumberingAfterBreak="0">
     <w:nsid w:val="58502FCB"/>
     <w:multiLevelType w:val="multilevel"/>
     <w:tmpl w:val="901ADB88"/>
@@ -1957,17 +2896,264 @@
       </w:pPr>
     </w:lvl>
   </w:abstractNum>
-  <w:num w:numId="1">
+  <w:abstractNum w:abstractNumId="3" w15:restartNumberingAfterBreak="0">
+    <w:nsid w:val="6AFC0474"/>
+    <w:multiLevelType w:val="multilevel"/>
+    <w:tmpl w:val="0386AB2A"/>
+    <w:lvl w:ilvl="0">
+      <w:start w:val="1"/>
+      <w:numFmt w:val="bullet"/>
+      <w:lvlText w:val=""/>
+      <w:lvlJc w:val="left"/>
+      <w:pPr>
+        <w:tabs>
+          <w:tab w:val="num" w:pos="1440"/>
+        </w:tabs>
+        <w:ind w:left="1440" w:hanging="360"/>
+      </w:pPr>
+      <w:rPr>
+        <w:rFonts w:ascii="Symbol" w:hAnsi="Symbol" w:hint="default"/>
+        <w:sz w:val="20"/>
+      </w:rPr>
+    </w:lvl>
+    <w:lvl w:ilvl="1" w:tentative="1">
+      <w:start w:val="1"/>
+      <w:numFmt w:val="bullet"/>
+      <w:lvlText w:val="o"/>
+      <w:lvlJc w:val="left"/>
+      <w:pPr>
+        <w:tabs>
+          <w:tab w:val="num" w:pos="2160"/>
+        </w:tabs>
+        <w:ind w:left="2160" w:hanging="360"/>
+      </w:pPr>
+      <w:rPr>
+        <w:rFonts w:ascii="Courier New" w:hAnsi="Courier New" w:hint="default"/>
+        <w:sz w:val="20"/>
+      </w:rPr>
+    </w:lvl>
+    <w:lvl w:ilvl="2" w:tentative="1">
+      <w:start w:val="1"/>
+      <w:numFmt w:val="bullet"/>
+      <w:lvlText w:val=""/>
+      <w:lvlJc w:val="left"/>
+      <w:pPr>
+        <w:tabs>
+          <w:tab w:val="num" w:pos="2880"/>
+        </w:tabs>
+        <w:ind w:left="2880" w:hanging="360"/>
+      </w:pPr>
+      <w:rPr>
+        <w:rFonts w:ascii="Wingdings" w:hAnsi="Wingdings" w:hint="default"/>
+        <w:sz w:val="20"/>
+      </w:rPr>
+    </w:lvl>
+    <w:lvl w:ilvl="3" w:tentative="1">
+      <w:start w:val="1"/>
+      <w:numFmt w:val="bullet"/>
+      <w:lvlText w:val=""/>
+      <w:lvlJc w:val="left"/>
+      <w:pPr>
+        <w:tabs>
+          <w:tab w:val="num" w:pos="3600"/>
+        </w:tabs>
+        <w:ind w:left="3600" w:hanging="360"/>
+      </w:pPr>
+      <w:rPr>
+        <w:rFonts w:ascii="Wingdings" w:hAnsi="Wingdings" w:hint="default"/>
+        <w:sz w:val="20"/>
+      </w:rPr>
+    </w:lvl>
+    <w:lvl w:ilvl="4" w:tentative="1">
+      <w:start w:val="1"/>
+      <w:numFmt w:val="bullet"/>
+      <w:lvlText w:val=""/>
+      <w:lvlJc w:val="left"/>
+      <w:pPr>
+        <w:tabs>
+          <w:tab w:val="num" w:pos="4320"/>
+        </w:tabs>
+        <w:ind w:left="4320" w:hanging="360"/>
+      </w:pPr>
+      <w:rPr>
+        <w:rFonts w:ascii="Wingdings" w:hAnsi="Wingdings" w:hint="default"/>
+        <w:sz w:val="20"/>
+      </w:rPr>
+    </w:lvl>
+    <w:lvl w:ilvl="5" w:tentative="1">
+      <w:start w:val="1"/>
+      <w:numFmt w:val="bullet"/>
+      <w:lvlText w:val=""/>
+      <w:lvlJc w:val="left"/>
+      <w:pPr>
+        <w:tabs>
+          <w:tab w:val="num" w:pos="5040"/>
+        </w:tabs>
+        <w:ind w:left="5040" w:hanging="360"/>
+      </w:pPr>
+      <w:rPr>
+        <w:rFonts w:ascii="Wingdings" w:hAnsi="Wingdings" w:hint="default"/>
+        <w:sz w:val="20"/>
+      </w:rPr>
+    </w:lvl>
+    <w:lvl w:ilvl="6" w:tentative="1">
+      <w:start w:val="1"/>
+      <w:numFmt w:val="bullet"/>
+      <w:lvlText w:val=""/>
+      <w:lvlJc w:val="left"/>
+      <w:pPr>
+        <w:tabs>
+          <w:tab w:val="num" w:pos="5760"/>
+        </w:tabs>
+        <w:ind w:left="5760" w:hanging="360"/>
+      </w:pPr>
+      <w:rPr>
+        <w:rFonts w:ascii="Wingdings" w:hAnsi="Wingdings" w:hint="default"/>
+        <w:sz w:val="20"/>
+      </w:rPr>
+    </w:lvl>
+    <w:lvl w:ilvl="7" w:tentative="1">
+      <w:start w:val="1"/>
+      <w:numFmt w:val="bullet"/>
+      <w:lvlText w:val=""/>
+      <w:lvlJc w:val="left"/>
+      <w:pPr>
+        <w:tabs>
+          <w:tab w:val="num" w:pos="6480"/>
+        </w:tabs>
+        <w:ind w:left="6480" w:hanging="360"/>
+      </w:pPr>
+      <w:rPr>
+        <w:rFonts w:ascii="Wingdings" w:hAnsi="Wingdings" w:hint="default"/>
+        <w:sz w:val="20"/>
+      </w:rPr>
+    </w:lvl>
+    <w:lvl w:ilvl="8" w:tentative="1">
+      <w:start w:val="1"/>
+      <w:numFmt w:val="bullet"/>
+      <w:lvlText w:val=""/>
+      <w:lvlJc w:val="left"/>
+      <w:pPr>
+        <w:tabs>
+          <w:tab w:val="num" w:pos="7200"/>
+        </w:tabs>
+        <w:ind w:left="7200" w:hanging="360"/>
+      </w:pPr>
+      <w:rPr>
+        <w:rFonts w:ascii="Wingdings" w:hAnsi="Wingdings" w:hint="default"/>
+        <w:sz w:val="20"/>
+      </w:rPr>
+    </w:lvl>
+  </w:abstractNum>
+  <w:abstractNum w:abstractNumId="4" w15:restartNumberingAfterBreak="0">
+    <w:nsid w:val="6F0200A6"/>
+    <w:multiLevelType w:val="hybridMultilevel"/>
+    <w:tmpl w:val="DA86CDA6"/>
+    <w:lvl w:ilvl="0" w:tplc="040E000F">
+      <w:start w:val="1"/>
+      <w:numFmt w:val="decimal"/>
+      <w:lvlText w:val="%1."/>
+      <w:lvlJc w:val="left"/>
+      <w:pPr>
+        <w:ind w:left="720" w:hanging="360"/>
+      </w:pPr>
+      <w:rPr>
+        <w:rFonts w:hint="default"/>
+      </w:rPr>
+    </w:lvl>
+    <w:lvl w:ilvl="1" w:tplc="040E0019">
+      <w:start w:val="1"/>
+      <w:numFmt w:val="lowerLetter"/>
+      <w:lvlText w:val="%2."/>
+      <w:lvlJc w:val="left"/>
+      <w:pPr>
+        <w:ind w:left="1440" w:hanging="360"/>
+      </w:pPr>
+    </w:lvl>
+    <w:lvl w:ilvl="2" w:tplc="040E001B" w:tentative="1">
+      <w:start w:val="1"/>
+      <w:numFmt w:val="lowerRoman"/>
+      <w:lvlText w:val="%3."/>
+      <w:lvlJc w:val="right"/>
+      <w:pPr>
+        <w:ind w:left="2160" w:hanging="180"/>
+      </w:pPr>
+    </w:lvl>
+    <w:lvl w:ilvl="3" w:tplc="040E000F" w:tentative="1">
+      <w:start w:val="1"/>
+      <w:numFmt w:val="decimal"/>
+      <w:lvlText w:val="%4."/>
+      <w:lvlJc w:val="left"/>
+      <w:pPr>
+        <w:ind w:left="2880" w:hanging="360"/>
+      </w:pPr>
+    </w:lvl>
+    <w:lvl w:ilvl="4" w:tplc="040E0019" w:tentative="1">
+      <w:start w:val="1"/>
+      <w:numFmt w:val="lowerLetter"/>
+      <w:lvlText w:val="%5."/>
+      <w:lvlJc w:val="left"/>
+      <w:pPr>
+        <w:ind w:left="3600" w:hanging="360"/>
+      </w:pPr>
+    </w:lvl>
+    <w:lvl w:ilvl="5" w:tplc="040E001B" w:tentative="1">
+      <w:start w:val="1"/>
+      <w:numFmt w:val="lowerRoman"/>
+      <w:lvlText w:val="%6."/>
+      <w:lvlJc w:val="right"/>
+      <w:pPr>
+        <w:ind w:left="4320" w:hanging="180"/>
+      </w:pPr>
+    </w:lvl>
+    <w:lvl w:ilvl="6" w:tplc="040E000F" w:tentative="1">
+      <w:start w:val="1"/>
+      <w:numFmt w:val="decimal"/>
+      <w:lvlText w:val="%7."/>
+      <w:lvlJc w:val="left"/>
+      <w:pPr>
+        <w:ind w:left="5040" w:hanging="360"/>
+      </w:pPr>
+    </w:lvl>
+    <w:lvl w:ilvl="7" w:tplc="040E0019" w:tentative="1">
+      <w:start w:val="1"/>
+      <w:numFmt w:val="lowerLetter"/>
+      <w:lvlText w:val="%8."/>
+      <w:lvlJc w:val="left"/>
+      <w:pPr>
+        <w:ind w:left="5760" w:hanging="360"/>
+      </w:pPr>
+    </w:lvl>
+    <w:lvl w:ilvl="8" w:tplc="040E001B" w:tentative="1">
+      <w:start w:val="1"/>
+      <w:numFmt w:val="lowerRoman"/>
+      <w:lvlText w:val="%9."/>
+      <w:lvlJc w:val="right"/>
+      <w:pPr>
+        <w:ind w:left="6480" w:hanging="180"/>
+      </w:pPr>
+    </w:lvl>
+  </w:abstractNum>
+  <w:num w:numId="1" w16cid:durableId="1173956243">
+    <w:abstractNumId w:val="2"/>
+  </w:num>
+  <w:num w:numId="2" w16cid:durableId="2060812037">
     <w:abstractNumId w:val="1"/>
   </w:num>
-  <w:num w:numId="2">
+  <w:num w:numId="3" w16cid:durableId="706106649">
     <w:abstractNumId w:val="0"/>
+  </w:num>
+  <w:num w:numId="4" w16cid:durableId="1853490072">
+    <w:abstractNumId w:val="3"/>
+  </w:num>
+  <w:num w:numId="5" w16cid:durableId="2141872046">
+    <w:abstractNumId w:val="4"/>
   </w:num>
 </w:numbering>
 </file>
 
 <file path=word/styles.xml><?xml version="1.0" encoding="utf-8"?>
-<w:styles xmlns:mc="http://schemas.openxmlformats.org/markup-compatibility/2006" xmlns:r="http://schemas.openxmlformats.org/officeDocument/2006/relationships" xmlns:w="http://schemas.openxmlformats.org/wordprocessingml/2006/main" xmlns:w14="http://schemas.microsoft.com/office/word/2010/wordml" xmlns:w15="http://schemas.microsoft.com/office/word/2012/wordml" xmlns:w16cid="http://schemas.microsoft.com/office/word/2016/wordml/cid" xmlns:w16se="http://schemas.microsoft.com/office/word/2015/wordml/symex" mc:Ignorable="w14 w15 w16se w16cid">
+<w:styles xmlns:mc="http://schemas.openxmlformats.org/markup-compatibility/2006" xmlns:r="http://schemas.openxmlformats.org/officeDocument/2006/relationships" xmlns:w="http://schemas.openxmlformats.org/wordprocessingml/2006/main" xmlns:w14="http://schemas.microsoft.com/office/word/2010/wordml" xmlns:w15="http://schemas.microsoft.com/office/word/2012/wordml" xmlns:w16cex="http://schemas.microsoft.com/office/word/2018/wordml/cex" xmlns:w16cid="http://schemas.microsoft.com/office/word/2016/wordml/cid" xmlns:w16="http://schemas.microsoft.com/office/word/2018/wordml" xmlns:w16du="http://schemas.microsoft.com/office/word/2023/wordml/word16du" xmlns:w16sdtdh="http://schemas.microsoft.com/office/word/2020/wordml/sdtdatahash" xmlns:w16sdtfl="http://schemas.microsoft.com/office/word/2024/wordml/sdtformatlock" xmlns:w16se="http://schemas.microsoft.com/office/word/2015/wordml/symex" mc:Ignorable="w14 w15 w16se w16cid w16 w16cex w16sdtdh w16sdtfl w16du">
   <w:docDefaults>
     <w:rPrDefault>
       <w:rPr>
@@ -1983,7 +3169,7 @@
       </w:pPr>
     </w:pPrDefault>
   </w:docDefaults>
-  <w:latentStyles w:defLockedState="0" w:defUIPriority="99" w:defSemiHidden="0" w:defUnhideWhenUsed="0" w:defQFormat="0" w:count="375">
+  <w:latentStyles w:defLockedState="0" w:defUIPriority="99" w:defSemiHidden="0" w:defUnhideWhenUsed="0" w:defQFormat="0" w:count="376">
     <w:lsdException w:name="Normal" w:uiPriority="0" w:qFormat="1"/>
     <w:lsdException w:name="heading 1" w:uiPriority="9" w:qFormat="1"/>
     <w:lsdException w:name="heading 2" w:semiHidden="1" w:uiPriority="9" w:unhideWhenUsed="1" w:qFormat="1"/>
@@ -2359,18 +3545,19 @@
     <w:lsdException w:name="Smart Hyperlink" w:semiHidden="1" w:unhideWhenUsed="1"/>
     <w:lsdException w:name="Hashtag" w:semiHidden="1" w:unhideWhenUsed="1"/>
     <w:lsdException w:name="Unresolved Mention" w:semiHidden="1" w:unhideWhenUsed="1"/>
+    <w:lsdException w:name="Smart Link" w:semiHidden="1" w:unhideWhenUsed="1"/>
   </w:latentStyles>
-  <w:style w:type="paragraph" w:default="1" w:styleId="Norml">
+  <w:style w:type="paragraph" w:default="1" w:styleId="Normal">
     <w:name w:val="Normal"/>
     <w:qFormat/>
+    <w:rsid w:val="00346153"/>
   </w:style>
-  <w:style w:type="character" w:default="1" w:styleId="Bekezdsalapbettpusa">
+  <w:style w:type="character" w:default="1" w:styleId="DefaultParagraphFont">
     <w:name w:val="Default Paragraph Font"/>
     <w:uiPriority w:val="1"/>
-    <w:semiHidden/>
     <w:unhideWhenUsed/>
   </w:style>
-  <w:style w:type="table" w:default="1" w:styleId="Normltblzat">
+  <w:style w:type="table" w:default="1" w:styleId="TableNormal">
     <w:name w:val="Normal Table"/>
     <w:uiPriority w:val="99"/>
     <w:semiHidden/>
@@ -2385,17 +3572,17 @@
       </w:tblCellMar>
     </w:tblPr>
   </w:style>
-  <w:style w:type="numbering" w:default="1" w:styleId="Nemlista">
+  <w:style w:type="numbering" w:default="1" w:styleId="NoList">
     <w:name w:val="No List"/>
     <w:uiPriority w:val="99"/>
     <w:semiHidden/>
     <w:unhideWhenUsed/>
   </w:style>
-  <w:style w:type="paragraph" w:styleId="Alcm">
+  <w:style w:type="paragraph" w:styleId="Subtitle">
     <w:name w:val="Subtitle"/>
-    <w:basedOn w:val="Norml"/>
-    <w:next w:val="Norml"/>
-    <w:link w:val="AlcmChar"/>
+    <w:basedOn w:val="Normal"/>
+    <w:next w:val="Normal"/>
+    <w:link w:val="SubtitleChar"/>
     <w:uiPriority w:val="11"/>
     <w:qFormat/>
     <w:rsid w:val="00396BA4"/>
@@ -2410,10 +3597,10 @@
       <w:spacing w:val="15"/>
     </w:rPr>
   </w:style>
-  <w:style w:type="character" w:customStyle="1" w:styleId="AlcmChar">
-    <w:name w:val="Alcím Char"/>
-    <w:basedOn w:val="Bekezdsalapbettpusa"/>
-    <w:link w:val="Alcm"/>
+  <w:style w:type="character" w:customStyle="1" w:styleId="SubtitleChar">
+    <w:name w:val="Subtitle Char"/>
+    <w:basedOn w:val="DefaultParagraphFont"/>
+    <w:link w:val="Subtitle"/>
     <w:uiPriority w:val="11"/>
     <w:rsid w:val="00396BA4"/>
     <w:rPr>
@@ -2421,6 +3608,61 @@
       <w:color w:val="5A5A5A" w:themeColor="text1" w:themeTint="A5"/>
       <w:spacing w:val="15"/>
     </w:rPr>
+  </w:style>
+  <w:style w:type="paragraph" w:styleId="ListParagraph">
+    <w:name w:val="List Paragraph"/>
+    <w:basedOn w:val="Normal"/>
+    <w:uiPriority w:val="34"/>
+    <w:qFormat/>
+    <w:rsid w:val="00EB2D7B"/>
+    <w:pPr>
+      <w:ind w:left="720"/>
+      <w:contextualSpacing/>
+    </w:pPr>
+  </w:style>
+  <w:style w:type="paragraph" w:styleId="Header">
+    <w:name w:val="header"/>
+    <w:basedOn w:val="Normal"/>
+    <w:link w:val="HeaderChar"/>
+    <w:uiPriority w:val="99"/>
+    <w:unhideWhenUsed/>
+    <w:rsid w:val="001842CA"/>
+    <w:pPr>
+      <w:tabs>
+        <w:tab w:val="center" w:pos="4536"/>
+        <w:tab w:val="right" w:pos="9072"/>
+      </w:tabs>
+      <w:spacing w:after="0" w:line="240" w:lineRule="auto"/>
+    </w:pPr>
+  </w:style>
+  <w:style w:type="character" w:customStyle="1" w:styleId="HeaderChar">
+    <w:name w:val="Header Char"/>
+    <w:basedOn w:val="DefaultParagraphFont"/>
+    <w:link w:val="Header"/>
+    <w:uiPriority w:val="99"/>
+    <w:rsid w:val="001842CA"/>
+  </w:style>
+  <w:style w:type="paragraph" w:styleId="Footer">
+    <w:name w:val="footer"/>
+    <w:basedOn w:val="Normal"/>
+    <w:link w:val="FooterChar"/>
+    <w:uiPriority w:val="99"/>
+    <w:unhideWhenUsed/>
+    <w:rsid w:val="001842CA"/>
+    <w:pPr>
+      <w:tabs>
+        <w:tab w:val="center" w:pos="4536"/>
+        <w:tab w:val="right" w:pos="9072"/>
+      </w:tabs>
+      <w:spacing w:after="0" w:line="240" w:lineRule="auto"/>
+    </w:pPr>
+  </w:style>
+  <w:style w:type="character" w:customStyle="1" w:styleId="FooterChar">
+    <w:name w:val="Footer Char"/>
+    <w:basedOn w:val="DefaultParagraphFont"/>
+    <w:link w:val="Footer"/>
+    <w:uiPriority w:val="99"/>
+    <w:rsid w:val="001842CA"/>
   </w:style>
 </w:styles>
 </file>
@@ -2718,4 +3960,16 @@
     </a:ext>
   </a:extLst>
 </a:theme>
+</file>
+
+<file path=customXml/item1.xml><?xml version="1.0" encoding="utf-8"?>
+<b:Sources xmlns:b="http://schemas.openxmlformats.org/officeDocument/2006/bibliography" xmlns="http://schemas.openxmlformats.org/officeDocument/2006/bibliography" SelectedStyle="\APASixthEditionOfficeOnline.xsl" StyleName="APA" Version="6"/>
+</file>
+
+<file path=customXml/itemProps1.xml><?xml version="1.0" encoding="utf-8"?>
+<ds:datastoreItem xmlns:ds="http://schemas.openxmlformats.org/officeDocument/2006/customXml" ds:itemID="{223D4920-324A-4B64-A777-8E4EBFFC446A}">
+  <ds:schemaRefs>
+    <ds:schemaRef ds:uri="http://schemas.openxmlformats.org/officeDocument/2006/bibliography"/>
+  </ds:schemaRefs>
+</ds:datastoreItem>
 </file>
</xml_diff>

<commit_message>
dokumentáció frissitése navigációs sáv résszel
</commit_message>
<xml_diff>
--- a/doc/felhasznaloi_dokumentacio.docx
+++ b/doc/felhasznaloi_dokumentacio.docx
@@ -1,6 +1,6 @@
 
 <file path=word/document.xml><?xml version="1.0" encoding="utf-8"?>
-<w:document xmlns:wpc="http://schemas.microsoft.com/office/word/2010/wordprocessingCanvas" xmlns:cx="http://schemas.microsoft.com/office/drawing/2014/chartex" xmlns:cx1="http://schemas.microsoft.com/office/drawing/2015/9/8/chartex" xmlns:cx2="http://schemas.microsoft.com/office/drawing/2015/10/21/chartex" xmlns:cx3="http://schemas.microsoft.com/office/drawing/2016/5/9/chartex" xmlns:cx4="http://schemas.microsoft.com/office/drawing/2016/5/10/chartex" xmlns:cx5="http://schemas.microsoft.com/office/drawing/2016/5/11/chartex" xmlns:cx6="http://schemas.microsoft.com/office/drawing/2016/5/12/chartex" xmlns:cx7="http://schemas.microsoft.com/office/drawing/2016/5/13/chartex" xmlns:cx8="http://schemas.microsoft.com/office/drawing/2016/5/14/chartex" xmlns:mc="http://schemas.openxmlformats.org/markup-compatibility/2006" xmlns:aink="http://schemas.microsoft.com/office/drawing/2016/ink" xmlns:am3d="http://schemas.microsoft.com/office/drawing/2017/model3d" xmlns:o="urn:schemas-microsoft-com:office:office" xmlns:oel="http://schemas.microsoft.com/office/2019/extlst" xmlns:r="http://schemas.openxmlformats.org/officeDocument/2006/relationships" xmlns:m="http://schemas.openxmlformats.org/officeDocument/2006/math" xmlns:v="urn:schemas-microsoft-com:vml" xmlns:wp14="http://schemas.microsoft.com/office/word/2010/wordprocessingDrawing" xmlns:wp="http://schemas.openxmlformats.org/drawingml/2006/wordprocessingDrawing" xmlns:w10="urn:schemas-microsoft-com:office:word" xmlns:w="http://schemas.openxmlformats.org/wordprocessingml/2006/main" xmlns:w14="http://schemas.microsoft.com/office/word/2010/wordml" xmlns:w15="http://schemas.microsoft.com/office/word/2012/wordml" xmlns:w16cex="http://schemas.microsoft.com/office/word/2018/wordml/cex" xmlns:w16cid="http://schemas.microsoft.com/office/word/2016/wordml/cid" xmlns:w16="http://schemas.microsoft.com/office/word/2018/wordml" xmlns:w16du="http://schemas.microsoft.com/office/word/2023/wordml/word16du" xmlns:w16sdtdh="http://schemas.microsoft.com/office/word/2020/wordml/sdtdatahash" xmlns:w16sdtfl="http://schemas.microsoft.com/office/word/2024/wordml/sdtformatlock" xmlns:w16se="http://schemas.microsoft.com/office/word/2015/wordml/symex" xmlns:wpg="http://schemas.microsoft.com/office/word/2010/wordprocessingGroup" xmlns:wpi="http://schemas.microsoft.com/office/word/2010/wordprocessingInk" xmlns:wne="http://schemas.microsoft.com/office/word/2006/wordml" xmlns:wps="http://schemas.microsoft.com/office/word/2010/wordprocessingShape" mc:Ignorable="w14 w15 w16se w16cid w16 w16cex w16sdtdh w16sdtfl w16du wp14">
+<w:document xmlns:wpc="http://schemas.microsoft.com/office/word/2010/wordprocessingCanvas" xmlns:cx="http://schemas.microsoft.com/office/drawing/2014/chartex" xmlns:cx1="http://schemas.microsoft.com/office/drawing/2015/9/8/chartex" xmlns:cx2="http://schemas.microsoft.com/office/drawing/2015/10/21/chartex" xmlns:cx3="http://schemas.microsoft.com/office/drawing/2016/5/9/chartex" xmlns:cx4="http://schemas.microsoft.com/office/drawing/2016/5/10/chartex" xmlns:cx5="http://schemas.microsoft.com/office/drawing/2016/5/11/chartex" xmlns:cx6="http://schemas.microsoft.com/office/drawing/2016/5/12/chartex" xmlns:cx7="http://schemas.microsoft.com/office/drawing/2016/5/13/chartex" xmlns:cx8="http://schemas.microsoft.com/office/drawing/2016/5/14/chartex" xmlns:mc="http://schemas.openxmlformats.org/markup-compatibility/2006" xmlns:aink="http://schemas.microsoft.com/office/drawing/2016/ink" xmlns:am3d="http://schemas.microsoft.com/office/drawing/2017/model3d" xmlns:o="urn:schemas-microsoft-com:office:office" xmlns:r="http://schemas.openxmlformats.org/officeDocument/2006/relationships" xmlns:m="http://schemas.openxmlformats.org/officeDocument/2006/math" xmlns:v="urn:schemas-microsoft-com:vml" xmlns:wp14="http://schemas.microsoft.com/office/word/2010/wordprocessingDrawing" xmlns:wp="http://schemas.openxmlformats.org/drawingml/2006/wordprocessingDrawing" xmlns:w10="urn:schemas-microsoft-com:office:word" xmlns:w="http://schemas.openxmlformats.org/wordprocessingml/2006/main" xmlns:w14="http://schemas.microsoft.com/office/word/2010/wordml" xmlns:w15="http://schemas.microsoft.com/office/word/2012/wordml" xmlns:w16cid="http://schemas.microsoft.com/office/word/2016/wordml/cid" xmlns:w16se="http://schemas.microsoft.com/office/word/2015/wordml/symex" xmlns:wpg="http://schemas.microsoft.com/office/word/2010/wordprocessingGroup" xmlns:wpi="http://schemas.microsoft.com/office/word/2010/wordprocessingInk" xmlns:wne="http://schemas.microsoft.com/office/word/2006/wordml" xmlns:wps="http://schemas.microsoft.com/office/word/2010/wordprocessingShape" mc:Ignorable="w14 w15 w16se w16cid wp14">
   <w:body>
     <w:p>
       <w:pPr>
@@ -145,7 +145,7 @@
     </w:p>
     <w:p>
       <w:pPr>
-        <w:pStyle w:val="ListParagraph"/>
+        <w:pStyle w:val="Listaszerbekezds"/>
         <w:numPr>
           <w:ilvl w:val="0"/>
           <w:numId w:val="5"/>
@@ -185,7 +185,7 @@
     </w:p>
     <w:p>
       <w:pPr>
-        <w:pStyle w:val="ListParagraph"/>
+        <w:pStyle w:val="Listaszerbekezds"/>
         <w:numPr>
           <w:ilvl w:val="0"/>
           <w:numId w:val="5"/>
@@ -207,7 +207,7 @@
     </w:p>
     <w:p>
       <w:pPr>
-        <w:pStyle w:val="ListParagraph"/>
+        <w:pStyle w:val="Listaszerbekezds"/>
         <w:numPr>
           <w:ilvl w:val="1"/>
           <w:numId w:val="5"/>
@@ -231,7 +231,7 @@
     </w:p>
     <w:p>
       <w:pPr>
-        <w:pStyle w:val="ListParagraph"/>
+        <w:pStyle w:val="Listaszerbekezds"/>
         <w:numPr>
           <w:ilvl w:val="1"/>
           <w:numId w:val="5"/>
@@ -255,7 +255,7 @@
     </w:p>
     <w:p>
       <w:pPr>
-        <w:pStyle w:val="ListParagraph"/>
+        <w:pStyle w:val="Listaszerbekezds"/>
         <w:numPr>
           <w:ilvl w:val="0"/>
           <w:numId w:val="5"/>
@@ -295,7 +295,7 @@
     </w:p>
     <w:p>
       <w:pPr>
-        <w:pStyle w:val="ListParagraph"/>
+        <w:pStyle w:val="Listaszerbekezds"/>
         <w:numPr>
           <w:ilvl w:val="0"/>
           <w:numId w:val="5"/>
@@ -317,7 +317,7 @@
     </w:p>
     <w:p>
       <w:pPr>
-        <w:pStyle w:val="ListParagraph"/>
+        <w:pStyle w:val="Listaszerbekezds"/>
         <w:numPr>
           <w:ilvl w:val="1"/>
           <w:numId w:val="5"/>
@@ -349,7 +349,7 @@
     </w:p>
     <w:p>
       <w:pPr>
-        <w:pStyle w:val="ListParagraph"/>
+        <w:pStyle w:val="Listaszerbekezds"/>
         <w:numPr>
           <w:ilvl w:val="1"/>
           <w:numId w:val="5"/>
@@ -381,7 +381,7 @@
     </w:p>
     <w:p>
       <w:pPr>
-        <w:pStyle w:val="ListParagraph"/>
+        <w:pStyle w:val="Listaszerbekezds"/>
         <w:numPr>
           <w:ilvl w:val="0"/>
           <w:numId w:val="5"/>
@@ -1421,6 +1421,167 @@
           <w:u w:val="single"/>
         </w:rPr>
         <w:lastRenderedPageBreak/>
+        <w:t>Navigációs sáv</w:t>
+      </w:r>
+    </w:p>
+    <w:p>
+      <w:pPr>
+        <w:rPr>
+          <w:rFonts w:ascii="Times New Roman" w:hAnsi="Times New Roman" w:cs="Times New Roman"/>
+          <w:noProof/>
+          <w:sz w:val="40"/>
+          <w:szCs w:val="40"/>
+        </w:rPr>
+      </w:pPr>
+      <w:r>
+        <w:rPr>
+          <w:rFonts w:ascii="Times New Roman" w:hAnsi="Times New Roman" w:cs="Times New Roman"/>
+          <w:noProof/>
+          <w:sz w:val="40"/>
+          <w:szCs w:val="40"/>
+        </w:rPr>
+        <w:drawing>
+          <wp:anchor distT="0" distB="0" distL="114300" distR="114300" simplePos="0" relativeHeight="251680768" behindDoc="0" locked="0" layoutInCell="1" allowOverlap="1" wp14:anchorId="3D4953D5" wp14:editId="56BBEA3F">
+            <wp:simplePos x="0" y="0"/>
+            <wp:positionH relativeFrom="column">
+              <wp:posOffset>2730</wp:posOffset>
+            </wp:positionH>
+            <wp:positionV relativeFrom="paragraph">
+              <wp:posOffset>102746</wp:posOffset>
+            </wp:positionV>
+            <wp:extent cx="5760720" cy="184785"/>
+            <wp:effectExtent l="0" t="0" r="0" b="5715"/>
+            <wp:wrapTopAndBottom/>
+            <wp:docPr id="5" name="Kép 5"/>
+            <wp:cNvGraphicFramePr>
+              <a:graphicFrameLocks xmlns:a="http://schemas.openxmlformats.org/drawingml/2006/main" noChangeAspect="1"/>
+            </wp:cNvGraphicFramePr>
+            <a:graphic xmlns:a="http://schemas.openxmlformats.org/drawingml/2006/main">
+              <a:graphicData uri="http://schemas.openxmlformats.org/drawingml/2006/picture">
+                <pic:pic xmlns:pic="http://schemas.openxmlformats.org/drawingml/2006/picture">
+                  <pic:nvPicPr>
+                    <pic:cNvPr id="5" name="navigaciosMenu.PNG"/>
+                    <pic:cNvPicPr/>
+                  </pic:nvPicPr>
+                  <pic:blipFill>
+                    <a:blip r:embed="rId12">
+                      <a:extLst>
+                        <a:ext uri="{28A0092B-C50C-407E-A947-70E740481C1C}">
+                          <a14:useLocalDpi xmlns:a14="http://schemas.microsoft.com/office/drawing/2010/main" val="0"/>
+                        </a:ext>
+                      </a:extLst>
+                    </a:blip>
+                    <a:stretch>
+                      <a:fillRect/>
+                    </a:stretch>
+                  </pic:blipFill>
+                  <pic:spPr>
+                    <a:xfrm>
+                      <a:off x="0" y="0"/>
+                      <a:ext cx="5760720" cy="184785"/>
+                    </a:xfrm>
+                    <a:prstGeom prst="rect">
+                      <a:avLst/>
+                    </a:prstGeom>
+                  </pic:spPr>
+                </pic:pic>
+              </a:graphicData>
+            </a:graphic>
+          </wp:anchor>
+        </w:drawing>
+      </w:r>
+    </w:p>
+    <w:p>
+      <w:pPr>
+        <w:jc w:val="both"/>
+        <w:rPr>
+          <w:rFonts w:ascii="Times New Roman" w:hAnsi="Times New Roman" w:cs="Times New Roman"/>
+          <w:noProof/>
+          <w:sz w:val="32"/>
+          <w:szCs w:val="40"/>
+        </w:rPr>
+      </w:pPr>
+      <w:r>
+        <w:rPr>
+          <w:rFonts w:ascii="Times New Roman" w:hAnsi="Times New Roman" w:cs="Times New Roman"/>
+          <w:noProof/>
+          <w:sz w:val="32"/>
+          <w:szCs w:val="40"/>
+        </w:rPr>
+        <w:t>Minden oldalon tetején található egy navigációs sáv. A jelenleg látható oldal nevét zöld színnel jelöljük.</w:t>
+      </w:r>
+      <w:r>
+        <w:rPr>
+          <w:rFonts w:ascii="Times New Roman" w:hAnsi="Times New Roman" w:cs="Times New Roman"/>
+          <w:noProof/>
+          <w:sz w:val="32"/>
+          <w:szCs w:val="40"/>
+        </w:rPr>
+        <w:t xml:space="preserve"> A többi opciót az oldalak közötti navigálásra tudjuk használni.</w:t>
+      </w:r>
+    </w:p>
+    <w:p>
+      <w:pPr>
+        <w:jc w:val="both"/>
+        <w:rPr>
+          <w:rFonts w:ascii="Times New Roman" w:hAnsi="Times New Roman" w:cs="Times New Roman"/>
+          <w:noProof/>
+          <w:sz w:val="32"/>
+          <w:szCs w:val="40"/>
+        </w:rPr>
+      </w:pPr>
+      <w:r>
+        <w:rPr>
+          <w:rFonts w:ascii="Times New Roman" w:hAnsi="Times New Roman" w:cs="Times New Roman"/>
+          <w:noProof/>
+          <w:sz w:val="32"/>
+          <w:szCs w:val="40"/>
+        </w:rPr>
+        <w:t>A navigációs sáv jobb oldalán megtalálható a kijelentkezés menüpont, aminek megnyomásakor az adott Adminisztrátor kijelentkezetésre kerül és vissza dobjuk a bejelentkezési felületre.</w:t>
+      </w:r>
+      <w:bookmarkStart w:id="0" w:name="_GoBack"/>
+      <w:bookmarkEnd w:id="0"/>
+    </w:p>
+    <w:p>
+      <w:pPr>
+        <w:rPr>
+          <w:rFonts w:ascii="Times New Roman" w:hAnsi="Times New Roman" w:cs="Times New Roman"/>
+          <w:noProof/>
+          <w:sz w:val="40"/>
+          <w:szCs w:val="40"/>
+          <w:u w:val="single"/>
+        </w:rPr>
+      </w:pPr>
+      <w:r>
+        <w:rPr>
+          <w:rFonts w:ascii="Times New Roman" w:hAnsi="Times New Roman" w:cs="Times New Roman"/>
+          <w:noProof/>
+          <w:sz w:val="40"/>
+          <w:szCs w:val="40"/>
+          <w:u w:val="single"/>
+        </w:rPr>
+        <w:br w:type="page"/>
+      </w:r>
+    </w:p>
+    <w:p>
+      <w:pPr>
+        <w:jc w:val="center"/>
+        <w:rPr>
+          <w:rFonts w:ascii="Times New Roman" w:hAnsi="Times New Roman" w:cs="Times New Roman"/>
+          <w:noProof/>
+          <w:sz w:val="40"/>
+          <w:szCs w:val="40"/>
+          <w:u w:val="single"/>
+        </w:rPr>
+      </w:pPr>
+      <w:r>
+        <w:rPr>
+          <w:rFonts w:ascii="Times New Roman" w:hAnsi="Times New Roman" w:cs="Times New Roman"/>
+          <w:noProof/>
+          <w:sz w:val="40"/>
+          <w:szCs w:val="40"/>
+          <w:u w:val="single"/>
+        </w:rPr>
         <w:t>Filmek</w:t>
       </w:r>
     </w:p>
@@ -1465,7 +1626,7 @@
                     <pic:cNvPicPr/>
                   </pic:nvPicPr>
                   <pic:blipFill>
-                    <a:blip r:embed="rId12">
+                    <a:blip r:embed="rId13">
                       <a:extLst>
                         <a:ext uri="{28A0092B-C50C-407E-A947-70E740481C1C}">
                           <a14:useLocalDpi xmlns:a14="http://schemas.microsoft.com/office/drawing/2010/main" val="0"/>
@@ -1569,7 +1730,7 @@
                     <pic:cNvPicPr/>
                   </pic:nvPicPr>
                   <pic:blipFill>
-                    <a:blip r:embed="rId13">
+                    <a:blip r:embed="rId14">
                       <a:extLst>
                         <a:ext uri="{28A0092B-C50C-407E-A947-70E740481C1C}">
                           <a14:useLocalDpi xmlns:a14="http://schemas.microsoft.com/office/drawing/2010/main" val="0"/>
@@ -1737,7 +1898,7 @@
                     <pic:cNvPicPr/>
                   </pic:nvPicPr>
                   <pic:blipFill>
-                    <a:blip r:embed="rId14">
+                    <a:blip r:embed="rId15">
                       <a:extLst>
                         <a:ext uri="{28A0092B-C50C-407E-A947-70E740481C1C}">
                           <a14:useLocalDpi xmlns:a14="http://schemas.microsoft.com/office/drawing/2010/main" val="0"/>
@@ -1860,7 +2021,7 @@
                     <pic:cNvPicPr/>
                   </pic:nvPicPr>
                   <pic:blipFill>
-                    <a:blip r:embed="rId15">
+                    <a:blip r:embed="rId16">
                       <a:extLst>
                         <a:ext uri="{28A0092B-C50C-407E-A947-70E740481C1C}">
                           <a14:useLocalDpi xmlns:a14="http://schemas.microsoft.com/office/drawing/2010/main" val="0"/>
@@ -2008,7 +2169,7 @@
                     <pic:cNvPicPr/>
                   </pic:nvPicPr>
                   <pic:blipFill>
-                    <a:blip r:embed="rId16">
+                    <a:blip r:embed="rId17">
                       <a:extLst>
                         <a:ext uri="{28A0092B-C50C-407E-A947-70E740481C1C}">
                           <a14:useLocalDpi xmlns:a14="http://schemas.microsoft.com/office/drawing/2010/main" val="0"/>
@@ -2142,7 +2303,7 @@
                     <pic:cNvPicPr/>
                   </pic:nvPicPr>
                   <pic:blipFill>
-                    <a:blip r:embed="rId17">
+                    <a:blip r:embed="rId18">
                       <a:extLst>
                         <a:ext uri="{28A0092B-C50C-407E-A947-70E740481C1C}">
                           <a14:useLocalDpi xmlns:a14="http://schemas.microsoft.com/office/drawing/2010/main" val="0"/>
@@ -2271,7 +2432,7 @@
                     <pic:cNvPicPr/>
                   </pic:nvPicPr>
                   <pic:blipFill>
-                    <a:blip r:embed="rId18">
+                    <a:blip r:embed="rId19">
                       <a:extLst>
                         <a:ext uri="{28A0092B-C50C-407E-A947-70E740481C1C}">
                           <a14:useLocalDpi xmlns:a14="http://schemas.microsoft.com/office/drawing/2010/main" val="0"/>
@@ -2391,7 +2552,7 @@
                     <pic:cNvPicPr/>
                   </pic:nvPicPr>
                   <pic:blipFill>
-                    <a:blip r:embed="rId19">
+                    <a:blip r:embed="rId20">
                       <a:extLst>
                         <a:ext uri="{28A0092B-C50C-407E-A947-70E740481C1C}">
                           <a14:useLocalDpi xmlns:a14="http://schemas.microsoft.com/office/drawing/2010/main" val="0"/>
@@ -2448,15 +2609,7 @@
           <w:sz w:val="32"/>
           <w:szCs w:val="32"/>
         </w:rPr>
-        <w:t>Az oldal alján láthatunk három gombot, ezeknek a gomboknak a funkcionalitása ugyan azon az elven működik, mint amit leírtunk a dokumentáció 5. oldalán</w:t>
-      </w:r>
-      <w:r>
-        <w:rPr>
-          <w:rFonts w:ascii="Times New Roman" w:hAnsi="Times New Roman" w:cs="Times New Roman"/>
-          <w:sz w:val="32"/>
-          <w:szCs w:val="32"/>
-        </w:rPr>
-        <w:t>.</w:t>
+        <w:t>Az oldal alján láthatunk három gombot, ezeknek a gomboknak a funkcionalitása ugyan azon az elven működik, mint amit leírtunk a dokumentáció 5. oldalán.</w:t>
       </w:r>
     </w:p>
     <w:sectPr>
@@ -2470,7 +2623,7 @@
 </file>
 
 <file path=word/endnotes.xml><?xml version="1.0" encoding="utf-8"?>
-<w:endnotes xmlns:wpc="http://schemas.microsoft.com/office/word/2010/wordprocessingCanvas" xmlns:cx="http://schemas.microsoft.com/office/drawing/2014/chartex" xmlns:cx1="http://schemas.microsoft.com/office/drawing/2015/9/8/chartex" xmlns:cx2="http://schemas.microsoft.com/office/drawing/2015/10/21/chartex" xmlns:cx3="http://schemas.microsoft.com/office/drawing/2016/5/9/chartex" xmlns:cx4="http://schemas.microsoft.com/office/drawing/2016/5/10/chartex" xmlns:cx5="http://schemas.microsoft.com/office/drawing/2016/5/11/chartex" xmlns:cx6="http://schemas.microsoft.com/office/drawing/2016/5/12/chartex" xmlns:cx7="http://schemas.microsoft.com/office/drawing/2016/5/13/chartex" xmlns:cx8="http://schemas.microsoft.com/office/drawing/2016/5/14/chartex" xmlns:mc="http://schemas.openxmlformats.org/markup-compatibility/2006" xmlns:aink="http://schemas.microsoft.com/office/drawing/2016/ink" xmlns:am3d="http://schemas.microsoft.com/office/drawing/2017/model3d" xmlns:o="urn:schemas-microsoft-com:office:office" xmlns:oel="http://schemas.microsoft.com/office/2019/extlst" xmlns:r="http://schemas.openxmlformats.org/officeDocument/2006/relationships" xmlns:m="http://schemas.openxmlformats.org/officeDocument/2006/math" xmlns:v="urn:schemas-microsoft-com:vml" xmlns:wp14="http://schemas.microsoft.com/office/word/2010/wordprocessingDrawing" xmlns:wp="http://schemas.openxmlformats.org/drawingml/2006/wordprocessingDrawing" xmlns:w10="urn:schemas-microsoft-com:office:word" xmlns:w="http://schemas.openxmlformats.org/wordprocessingml/2006/main" xmlns:w14="http://schemas.microsoft.com/office/word/2010/wordml" xmlns:w15="http://schemas.microsoft.com/office/word/2012/wordml" xmlns:w16cex="http://schemas.microsoft.com/office/word/2018/wordml/cex" xmlns:w16cid="http://schemas.microsoft.com/office/word/2016/wordml/cid" xmlns:w16="http://schemas.microsoft.com/office/word/2018/wordml" xmlns:w16du="http://schemas.microsoft.com/office/word/2023/wordml/word16du" xmlns:w16sdtdh="http://schemas.microsoft.com/office/word/2020/wordml/sdtdatahash" xmlns:w16sdtfl="http://schemas.microsoft.com/office/word/2024/wordml/sdtformatlock" xmlns:w16se="http://schemas.microsoft.com/office/word/2015/wordml/symex" xmlns:wpg="http://schemas.microsoft.com/office/word/2010/wordprocessingGroup" xmlns:wpi="http://schemas.microsoft.com/office/word/2010/wordprocessingInk" xmlns:wne="http://schemas.microsoft.com/office/word/2006/wordml" xmlns:wps="http://schemas.microsoft.com/office/word/2010/wordprocessingShape" mc:Ignorable="w14 w15 w16se w16cid w16 w16cex w16sdtdh w16sdtfl w16du wp14">
+<w:endnotes xmlns:wpc="http://schemas.microsoft.com/office/word/2010/wordprocessingCanvas" xmlns:cx="http://schemas.microsoft.com/office/drawing/2014/chartex" xmlns:cx1="http://schemas.microsoft.com/office/drawing/2015/9/8/chartex" xmlns:cx2="http://schemas.microsoft.com/office/drawing/2015/10/21/chartex" xmlns:cx3="http://schemas.microsoft.com/office/drawing/2016/5/9/chartex" xmlns:cx4="http://schemas.microsoft.com/office/drawing/2016/5/10/chartex" xmlns:cx5="http://schemas.microsoft.com/office/drawing/2016/5/11/chartex" xmlns:cx6="http://schemas.microsoft.com/office/drawing/2016/5/12/chartex" xmlns:cx7="http://schemas.microsoft.com/office/drawing/2016/5/13/chartex" xmlns:cx8="http://schemas.microsoft.com/office/drawing/2016/5/14/chartex" xmlns:mc="http://schemas.openxmlformats.org/markup-compatibility/2006" xmlns:aink="http://schemas.microsoft.com/office/drawing/2016/ink" xmlns:am3d="http://schemas.microsoft.com/office/drawing/2017/model3d" xmlns:o="urn:schemas-microsoft-com:office:office" xmlns:r="http://schemas.openxmlformats.org/officeDocument/2006/relationships" xmlns:m="http://schemas.openxmlformats.org/officeDocument/2006/math" xmlns:v="urn:schemas-microsoft-com:vml" xmlns:wp14="http://schemas.microsoft.com/office/word/2010/wordprocessingDrawing" xmlns:wp="http://schemas.openxmlformats.org/drawingml/2006/wordprocessingDrawing" xmlns:w10="urn:schemas-microsoft-com:office:word" xmlns:w="http://schemas.openxmlformats.org/wordprocessingml/2006/main" xmlns:w14="http://schemas.microsoft.com/office/word/2010/wordml" xmlns:w15="http://schemas.microsoft.com/office/word/2012/wordml" xmlns:w16cid="http://schemas.microsoft.com/office/word/2016/wordml/cid" xmlns:w16se="http://schemas.microsoft.com/office/word/2015/wordml/symex" xmlns:wpg="http://schemas.microsoft.com/office/word/2010/wordprocessingGroup" xmlns:wpi="http://schemas.microsoft.com/office/word/2010/wordprocessingInk" xmlns:wne="http://schemas.microsoft.com/office/word/2006/wordml" xmlns:wps="http://schemas.microsoft.com/office/word/2010/wordprocessingShape" mc:Ignorable="w14 w15 w16se w16cid wp14">
   <w:endnote w:type="separator" w:id="-1">
     <w:p>
       <w:pPr>
@@ -2495,7 +2648,7 @@
 </file>
 
 <file path=word/footnotes.xml><?xml version="1.0" encoding="utf-8"?>
-<w:footnotes xmlns:wpc="http://schemas.microsoft.com/office/word/2010/wordprocessingCanvas" xmlns:cx="http://schemas.microsoft.com/office/drawing/2014/chartex" xmlns:cx1="http://schemas.microsoft.com/office/drawing/2015/9/8/chartex" xmlns:cx2="http://schemas.microsoft.com/office/drawing/2015/10/21/chartex" xmlns:cx3="http://schemas.microsoft.com/office/drawing/2016/5/9/chartex" xmlns:cx4="http://schemas.microsoft.com/office/drawing/2016/5/10/chartex" xmlns:cx5="http://schemas.microsoft.com/office/drawing/2016/5/11/chartex" xmlns:cx6="http://schemas.microsoft.com/office/drawing/2016/5/12/chartex" xmlns:cx7="http://schemas.microsoft.com/office/drawing/2016/5/13/chartex" xmlns:cx8="http://schemas.microsoft.com/office/drawing/2016/5/14/chartex" xmlns:mc="http://schemas.openxmlformats.org/markup-compatibility/2006" xmlns:aink="http://schemas.microsoft.com/office/drawing/2016/ink" xmlns:am3d="http://schemas.microsoft.com/office/drawing/2017/model3d" xmlns:o="urn:schemas-microsoft-com:office:office" xmlns:oel="http://schemas.microsoft.com/office/2019/extlst" xmlns:r="http://schemas.openxmlformats.org/officeDocument/2006/relationships" xmlns:m="http://schemas.openxmlformats.org/officeDocument/2006/math" xmlns:v="urn:schemas-microsoft-com:vml" xmlns:wp14="http://schemas.microsoft.com/office/word/2010/wordprocessingDrawing" xmlns:wp="http://schemas.openxmlformats.org/drawingml/2006/wordprocessingDrawing" xmlns:w10="urn:schemas-microsoft-com:office:word" xmlns:w="http://schemas.openxmlformats.org/wordprocessingml/2006/main" xmlns:w14="http://schemas.microsoft.com/office/word/2010/wordml" xmlns:w15="http://schemas.microsoft.com/office/word/2012/wordml" xmlns:w16cex="http://schemas.microsoft.com/office/word/2018/wordml/cex" xmlns:w16cid="http://schemas.microsoft.com/office/word/2016/wordml/cid" xmlns:w16="http://schemas.microsoft.com/office/word/2018/wordml" xmlns:w16du="http://schemas.microsoft.com/office/word/2023/wordml/word16du" xmlns:w16sdtdh="http://schemas.microsoft.com/office/word/2020/wordml/sdtdatahash" xmlns:w16sdtfl="http://schemas.microsoft.com/office/word/2024/wordml/sdtformatlock" xmlns:w16se="http://schemas.microsoft.com/office/word/2015/wordml/symex" xmlns:wpg="http://schemas.microsoft.com/office/word/2010/wordprocessingGroup" xmlns:wpi="http://schemas.microsoft.com/office/word/2010/wordprocessingInk" xmlns:wne="http://schemas.microsoft.com/office/word/2006/wordml" xmlns:wps="http://schemas.microsoft.com/office/word/2010/wordprocessingShape" mc:Ignorable="w14 w15 w16se w16cid w16 w16cex w16sdtdh w16sdtfl w16du wp14">
+<w:footnotes xmlns:wpc="http://schemas.microsoft.com/office/word/2010/wordprocessingCanvas" xmlns:cx="http://schemas.microsoft.com/office/drawing/2014/chartex" xmlns:cx1="http://schemas.microsoft.com/office/drawing/2015/9/8/chartex" xmlns:cx2="http://schemas.microsoft.com/office/drawing/2015/10/21/chartex" xmlns:cx3="http://schemas.microsoft.com/office/drawing/2016/5/9/chartex" xmlns:cx4="http://schemas.microsoft.com/office/drawing/2016/5/10/chartex" xmlns:cx5="http://schemas.microsoft.com/office/drawing/2016/5/11/chartex" xmlns:cx6="http://schemas.microsoft.com/office/drawing/2016/5/12/chartex" xmlns:cx7="http://schemas.microsoft.com/office/drawing/2016/5/13/chartex" xmlns:cx8="http://schemas.microsoft.com/office/drawing/2016/5/14/chartex" xmlns:mc="http://schemas.openxmlformats.org/markup-compatibility/2006" xmlns:aink="http://schemas.microsoft.com/office/drawing/2016/ink" xmlns:am3d="http://schemas.microsoft.com/office/drawing/2017/model3d" xmlns:o="urn:schemas-microsoft-com:office:office" xmlns:r="http://schemas.openxmlformats.org/officeDocument/2006/relationships" xmlns:m="http://schemas.openxmlformats.org/officeDocument/2006/math" xmlns:v="urn:schemas-microsoft-com:vml" xmlns:wp14="http://schemas.microsoft.com/office/word/2010/wordprocessingDrawing" xmlns:wp="http://schemas.openxmlformats.org/drawingml/2006/wordprocessingDrawing" xmlns:w10="urn:schemas-microsoft-com:office:word" xmlns:w="http://schemas.openxmlformats.org/wordprocessingml/2006/main" xmlns:w14="http://schemas.microsoft.com/office/word/2010/wordml" xmlns:w15="http://schemas.microsoft.com/office/word/2012/wordml" xmlns:w16cid="http://schemas.microsoft.com/office/word/2016/wordml/cid" xmlns:w16se="http://schemas.microsoft.com/office/word/2015/wordml/symex" xmlns:wpg="http://schemas.microsoft.com/office/word/2010/wordprocessingGroup" xmlns:wpi="http://schemas.microsoft.com/office/word/2010/wordprocessingInk" xmlns:wne="http://schemas.microsoft.com/office/word/2006/wordml" xmlns:wps="http://schemas.microsoft.com/office/word/2010/wordprocessingShape" mc:Ignorable="w14 w15 w16se w16cid wp14">
   <w:footnote w:type="separator" w:id="-1">
     <w:p>
       <w:pPr>
@@ -2520,7 +2673,7 @@
 </file>
 
 <file path=word/numbering.xml><?xml version="1.0" encoding="utf-8"?>
-<w:numbering xmlns:wpc="http://schemas.microsoft.com/office/word/2010/wordprocessingCanvas" xmlns:cx="http://schemas.microsoft.com/office/drawing/2014/chartex" xmlns:cx1="http://schemas.microsoft.com/office/drawing/2015/9/8/chartex" xmlns:cx2="http://schemas.microsoft.com/office/drawing/2015/10/21/chartex" xmlns:cx3="http://schemas.microsoft.com/office/drawing/2016/5/9/chartex" xmlns:cx4="http://schemas.microsoft.com/office/drawing/2016/5/10/chartex" xmlns:cx5="http://schemas.microsoft.com/office/drawing/2016/5/11/chartex" xmlns:cx6="http://schemas.microsoft.com/office/drawing/2016/5/12/chartex" xmlns:cx7="http://schemas.microsoft.com/office/drawing/2016/5/13/chartex" xmlns:cx8="http://schemas.microsoft.com/office/drawing/2016/5/14/chartex" xmlns:mc="http://schemas.openxmlformats.org/markup-compatibility/2006" xmlns:aink="http://schemas.microsoft.com/office/drawing/2016/ink" xmlns:am3d="http://schemas.microsoft.com/office/drawing/2017/model3d" xmlns:o="urn:schemas-microsoft-com:office:office" xmlns:oel="http://schemas.microsoft.com/office/2019/extlst" xmlns:r="http://schemas.openxmlformats.org/officeDocument/2006/relationships" xmlns:m="http://schemas.openxmlformats.org/officeDocument/2006/math" xmlns:v="urn:schemas-microsoft-com:vml" xmlns:wp14="http://schemas.microsoft.com/office/word/2010/wordprocessingDrawing" xmlns:wp="http://schemas.openxmlformats.org/drawingml/2006/wordprocessingDrawing" xmlns:w10="urn:schemas-microsoft-com:office:word" xmlns:w="http://schemas.openxmlformats.org/wordprocessingml/2006/main" xmlns:w14="http://schemas.microsoft.com/office/word/2010/wordml" xmlns:w15="http://schemas.microsoft.com/office/word/2012/wordml" xmlns:w16cex="http://schemas.microsoft.com/office/word/2018/wordml/cex" xmlns:w16cid="http://schemas.microsoft.com/office/word/2016/wordml/cid" xmlns:w16="http://schemas.microsoft.com/office/word/2018/wordml" xmlns:w16du="http://schemas.microsoft.com/office/word/2023/wordml/word16du" xmlns:w16sdtdh="http://schemas.microsoft.com/office/word/2020/wordml/sdtdatahash" xmlns:w16sdtfl="http://schemas.microsoft.com/office/word/2024/wordml/sdtformatlock" xmlns:w16se="http://schemas.microsoft.com/office/word/2015/wordml/symex" xmlns:wpg="http://schemas.microsoft.com/office/word/2010/wordprocessingGroup" xmlns:wpi="http://schemas.microsoft.com/office/word/2010/wordprocessingInk" xmlns:wne="http://schemas.microsoft.com/office/word/2006/wordml" xmlns:wps="http://schemas.microsoft.com/office/word/2010/wordprocessingShape" mc:Ignorable="w14 w15 w16se w16cid w16 w16cex w16sdtdh w16sdtfl w16du wp14">
+<w:numbering xmlns:wpc="http://schemas.microsoft.com/office/word/2010/wordprocessingCanvas" xmlns:cx="http://schemas.microsoft.com/office/drawing/2014/chartex" xmlns:cx1="http://schemas.microsoft.com/office/drawing/2015/9/8/chartex" xmlns:cx2="http://schemas.microsoft.com/office/drawing/2015/10/21/chartex" xmlns:cx3="http://schemas.microsoft.com/office/drawing/2016/5/9/chartex" xmlns:cx4="http://schemas.microsoft.com/office/drawing/2016/5/10/chartex" xmlns:cx5="http://schemas.microsoft.com/office/drawing/2016/5/11/chartex" xmlns:cx6="http://schemas.microsoft.com/office/drawing/2016/5/12/chartex" xmlns:cx7="http://schemas.microsoft.com/office/drawing/2016/5/13/chartex" xmlns:cx8="http://schemas.microsoft.com/office/drawing/2016/5/14/chartex" xmlns:mc="http://schemas.openxmlformats.org/markup-compatibility/2006" xmlns:aink="http://schemas.microsoft.com/office/drawing/2016/ink" xmlns:am3d="http://schemas.microsoft.com/office/drawing/2017/model3d" xmlns:o="urn:schemas-microsoft-com:office:office" xmlns:r="http://schemas.openxmlformats.org/officeDocument/2006/relationships" xmlns:m="http://schemas.openxmlformats.org/officeDocument/2006/math" xmlns:v="urn:schemas-microsoft-com:vml" xmlns:wp14="http://schemas.microsoft.com/office/word/2010/wordprocessingDrawing" xmlns:wp="http://schemas.openxmlformats.org/drawingml/2006/wordprocessingDrawing" xmlns:w10="urn:schemas-microsoft-com:office:word" xmlns:w="http://schemas.openxmlformats.org/wordprocessingml/2006/main" xmlns:w14="http://schemas.microsoft.com/office/word/2010/wordml" xmlns:w15="http://schemas.microsoft.com/office/word/2012/wordml" xmlns:w16cid="http://schemas.microsoft.com/office/word/2016/wordml/cid" xmlns:w16se="http://schemas.microsoft.com/office/word/2015/wordml/symex" xmlns:wpg="http://schemas.microsoft.com/office/word/2010/wordprocessingGroup" xmlns:wpi="http://schemas.microsoft.com/office/word/2010/wordprocessingInk" xmlns:wne="http://schemas.microsoft.com/office/word/2006/wordml" xmlns:wps="http://schemas.microsoft.com/office/word/2010/wordprocessingShape" mc:Ignorable="w14 w15 w16se w16cid wp14">
   <w:abstractNum w:abstractNumId="0" w15:restartNumberingAfterBreak="0">
     <w:nsid w:val="3F2E1764"/>
     <w:multiLevelType w:val="multilevel"/>
@@ -3134,26 +3287,26 @@
       </w:pPr>
     </w:lvl>
   </w:abstractNum>
-  <w:num w:numId="1" w16cid:durableId="1173956243">
+  <w:num w:numId="1">
     <w:abstractNumId w:val="2"/>
   </w:num>
-  <w:num w:numId="2" w16cid:durableId="2060812037">
+  <w:num w:numId="2">
     <w:abstractNumId w:val="1"/>
   </w:num>
-  <w:num w:numId="3" w16cid:durableId="706106649">
+  <w:num w:numId="3">
     <w:abstractNumId w:val="0"/>
   </w:num>
-  <w:num w:numId="4" w16cid:durableId="1853490072">
+  <w:num w:numId="4">
     <w:abstractNumId w:val="3"/>
   </w:num>
-  <w:num w:numId="5" w16cid:durableId="2141872046">
+  <w:num w:numId="5">
     <w:abstractNumId w:val="4"/>
   </w:num>
 </w:numbering>
 </file>
 
 <file path=word/styles.xml><?xml version="1.0" encoding="utf-8"?>
-<w:styles xmlns:mc="http://schemas.openxmlformats.org/markup-compatibility/2006" xmlns:r="http://schemas.openxmlformats.org/officeDocument/2006/relationships" xmlns:w="http://schemas.openxmlformats.org/wordprocessingml/2006/main" xmlns:w14="http://schemas.microsoft.com/office/word/2010/wordml" xmlns:w15="http://schemas.microsoft.com/office/word/2012/wordml" xmlns:w16cex="http://schemas.microsoft.com/office/word/2018/wordml/cex" xmlns:w16cid="http://schemas.microsoft.com/office/word/2016/wordml/cid" xmlns:w16="http://schemas.microsoft.com/office/word/2018/wordml" xmlns:w16du="http://schemas.microsoft.com/office/word/2023/wordml/word16du" xmlns:w16sdtdh="http://schemas.microsoft.com/office/word/2020/wordml/sdtdatahash" xmlns:w16sdtfl="http://schemas.microsoft.com/office/word/2024/wordml/sdtformatlock" xmlns:w16se="http://schemas.microsoft.com/office/word/2015/wordml/symex" mc:Ignorable="w14 w15 w16se w16cid w16 w16cex w16sdtdh w16sdtfl w16du">
+<w:styles xmlns:mc="http://schemas.openxmlformats.org/markup-compatibility/2006" xmlns:r="http://schemas.openxmlformats.org/officeDocument/2006/relationships" xmlns:w="http://schemas.openxmlformats.org/wordprocessingml/2006/main" xmlns:w14="http://schemas.microsoft.com/office/word/2010/wordml" xmlns:w15="http://schemas.microsoft.com/office/word/2012/wordml" xmlns:w16cid="http://schemas.microsoft.com/office/word/2016/wordml/cid" xmlns:w16se="http://schemas.microsoft.com/office/word/2015/wordml/symex" mc:Ignorable="w14 w15 w16se w16cid">
   <w:docDefaults>
     <w:rPrDefault>
       <w:rPr>
@@ -3169,7 +3322,7 @@
       </w:pPr>
     </w:pPrDefault>
   </w:docDefaults>
-  <w:latentStyles w:defLockedState="0" w:defUIPriority="99" w:defSemiHidden="0" w:defUnhideWhenUsed="0" w:defQFormat="0" w:count="376">
+  <w:latentStyles w:defLockedState="0" w:defUIPriority="99" w:defSemiHidden="0" w:defUnhideWhenUsed="0" w:defQFormat="0" w:count="375">
     <w:lsdException w:name="Normal" w:uiPriority="0" w:qFormat="1"/>
     <w:lsdException w:name="heading 1" w:uiPriority="9" w:qFormat="1"/>
     <w:lsdException w:name="heading 2" w:semiHidden="1" w:uiPriority="9" w:unhideWhenUsed="1" w:qFormat="1"/>
@@ -3545,19 +3698,19 @@
     <w:lsdException w:name="Smart Hyperlink" w:semiHidden="1" w:unhideWhenUsed="1"/>
     <w:lsdException w:name="Hashtag" w:semiHidden="1" w:unhideWhenUsed="1"/>
     <w:lsdException w:name="Unresolved Mention" w:semiHidden="1" w:unhideWhenUsed="1"/>
-    <w:lsdException w:name="Smart Link" w:semiHidden="1" w:unhideWhenUsed="1"/>
   </w:latentStyles>
-  <w:style w:type="paragraph" w:default="1" w:styleId="Normal">
+  <w:style w:type="paragraph" w:default="1" w:styleId="Norml">
     <w:name w:val="Normal"/>
     <w:qFormat/>
     <w:rsid w:val="00346153"/>
   </w:style>
-  <w:style w:type="character" w:default="1" w:styleId="DefaultParagraphFont">
+  <w:style w:type="character" w:default="1" w:styleId="Bekezdsalapbettpusa">
     <w:name w:val="Default Paragraph Font"/>
     <w:uiPriority w:val="1"/>
+    <w:semiHidden/>
     <w:unhideWhenUsed/>
   </w:style>
-  <w:style w:type="table" w:default="1" w:styleId="TableNormal">
+  <w:style w:type="table" w:default="1" w:styleId="Normltblzat">
     <w:name w:val="Normal Table"/>
     <w:uiPriority w:val="99"/>
     <w:semiHidden/>
@@ -3572,17 +3725,17 @@
       </w:tblCellMar>
     </w:tblPr>
   </w:style>
-  <w:style w:type="numbering" w:default="1" w:styleId="NoList">
+  <w:style w:type="numbering" w:default="1" w:styleId="Nemlista">
     <w:name w:val="No List"/>
     <w:uiPriority w:val="99"/>
     <w:semiHidden/>
     <w:unhideWhenUsed/>
   </w:style>
-  <w:style w:type="paragraph" w:styleId="Subtitle">
+  <w:style w:type="paragraph" w:styleId="Alcm">
     <w:name w:val="Subtitle"/>
-    <w:basedOn w:val="Normal"/>
-    <w:next w:val="Normal"/>
-    <w:link w:val="SubtitleChar"/>
+    <w:basedOn w:val="Norml"/>
+    <w:next w:val="Norml"/>
+    <w:link w:val="AlcmChar"/>
     <w:uiPriority w:val="11"/>
     <w:qFormat/>
     <w:rsid w:val="00396BA4"/>
@@ -3597,10 +3750,10 @@
       <w:spacing w:val="15"/>
     </w:rPr>
   </w:style>
-  <w:style w:type="character" w:customStyle="1" w:styleId="SubtitleChar">
-    <w:name w:val="Subtitle Char"/>
-    <w:basedOn w:val="DefaultParagraphFont"/>
-    <w:link w:val="Subtitle"/>
+  <w:style w:type="character" w:customStyle="1" w:styleId="AlcmChar">
+    <w:name w:val="Alcím Char"/>
+    <w:basedOn w:val="Bekezdsalapbettpusa"/>
+    <w:link w:val="Alcm"/>
     <w:uiPriority w:val="11"/>
     <w:rsid w:val="00396BA4"/>
     <w:rPr>
@@ -3609,9 +3762,9 @@
       <w:spacing w:val="15"/>
     </w:rPr>
   </w:style>
-  <w:style w:type="paragraph" w:styleId="ListParagraph">
+  <w:style w:type="paragraph" w:styleId="Listaszerbekezds">
     <w:name w:val="List Paragraph"/>
-    <w:basedOn w:val="Normal"/>
+    <w:basedOn w:val="Norml"/>
     <w:uiPriority w:val="34"/>
     <w:qFormat/>
     <w:rsid w:val="00EB2D7B"/>
@@ -3620,10 +3773,10 @@
       <w:contextualSpacing/>
     </w:pPr>
   </w:style>
-  <w:style w:type="paragraph" w:styleId="Header">
+  <w:style w:type="paragraph" w:styleId="lfej">
     <w:name w:val="header"/>
-    <w:basedOn w:val="Normal"/>
-    <w:link w:val="HeaderChar"/>
+    <w:basedOn w:val="Norml"/>
+    <w:link w:val="lfejChar"/>
     <w:uiPriority w:val="99"/>
     <w:unhideWhenUsed/>
     <w:rsid w:val="001842CA"/>
@@ -3635,17 +3788,17 @@
       <w:spacing w:after="0" w:line="240" w:lineRule="auto"/>
     </w:pPr>
   </w:style>
-  <w:style w:type="character" w:customStyle="1" w:styleId="HeaderChar">
-    <w:name w:val="Header Char"/>
-    <w:basedOn w:val="DefaultParagraphFont"/>
-    <w:link w:val="Header"/>
+  <w:style w:type="character" w:customStyle="1" w:styleId="lfejChar">
+    <w:name w:val="Élőfej Char"/>
+    <w:basedOn w:val="Bekezdsalapbettpusa"/>
+    <w:link w:val="lfej"/>
     <w:uiPriority w:val="99"/>
     <w:rsid w:val="001842CA"/>
   </w:style>
-  <w:style w:type="paragraph" w:styleId="Footer">
+  <w:style w:type="paragraph" w:styleId="llb">
     <w:name w:val="footer"/>
-    <w:basedOn w:val="Normal"/>
-    <w:link w:val="FooterChar"/>
+    <w:basedOn w:val="Norml"/>
+    <w:link w:val="llbChar"/>
     <w:uiPriority w:val="99"/>
     <w:unhideWhenUsed/>
     <w:rsid w:val="001842CA"/>
@@ -3657,10 +3810,10 @@
       <w:spacing w:after="0" w:line="240" w:lineRule="auto"/>
     </w:pPr>
   </w:style>
-  <w:style w:type="character" w:customStyle="1" w:styleId="FooterChar">
-    <w:name w:val="Footer Char"/>
-    <w:basedOn w:val="DefaultParagraphFont"/>
-    <w:link w:val="Footer"/>
+  <w:style w:type="character" w:customStyle="1" w:styleId="llbChar">
+    <w:name w:val="Élőláb Char"/>
+    <w:basedOn w:val="Bekezdsalapbettpusa"/>
+    <w:link w:val="llb"/>
     <w:uiPriority w:val="99"/>
     <w:rsid w:val="001842CA"/>
   </w:style>
@@ -3967,7 +4120,7 @@
 </file>
 
 <file path=customXml/itemProps1.xml><?xml version="1.0" encoding="utf-8"?>
-<ds:datastoreItem xmlns:ds="http://schemas.openxmlformats.org/officeDocument/2006/customXml" ds:itemID="{223D4920-324A-4B64-A777-8E4EBFFC446A}">
+<ds:datastoreItem xmlns:ds="http://schemas.openxmlformats.org/officeDocument/2006/customXml" ds:itemID="{87D9F2A3-0DF1-47A2-8335-D78AE0BD2F62}">
   <ds:schemaRefs>
     <ds:schemaRef ds:uri="http://schemas.openxmlformats.org/officeDocument/2006/bibliography"/>
   </ds:schemaRefs>

</xml_diff>